<commit_message>
add Interval Estimation, Margin of Error & Confidence Interval
</commit_message>
<xml_diff>
--- a/notes.docx
+++ b/notes.docx
@@ -5115,7 +5115,6 @@
             <w:insideH w:val="none" w:color="auto" w:sz="0" w:space="0"/>
             <w:insideV w:val="none" w:color="auto" w:sz="0" w:space="0"/>
           </w:tblBorders>
-          <w:shd w:val="clear" w:color="auto" w:fill="auto"/>
           <w:tblCellMar>
             <w:top w:w="15" w:type="dxa"/>
             <w:left w:w="15" w:type="dxa"/>
@@ -5202,7 +5201,6 @@
             <w:insideH w:val="none" w:color="auto" w:sz="0" w:space="0"/>
             <w:insideV w:val="none" w:color="auto" w:sz="0" w:space="0"/>
           </w:tblBorders>
-          <w:shd w:val="clear" w:color="auto" w:fill="auto"/>
           <w:tblCellMar>
             <w:top w:w="15" w:type="dxa"/>
             <w:left w:w="15" w:type="dxa"/>
@@ -5276,7 +5274,6 @@
             <w:insideH w:val="none" w:color="auto" w:sz="0" w:space="0"/>
             <w:insideV w:val="none" w:color="auto" w:sz="0" w:space="0"/>
           </w:tblBorders>
-          <w:shd w:val="clear" w:color="auto" w:fill="auto"/>
           <w:tblCellMar>
             <w:top w:w="15" w:type="dxa"/>
             <w:left w:w="15" w:type="dxa"/>
@@ -5759,7 +5756,6 @@
             <w:insideH w:val="none" w:color="auto" w:sz="0" w:space="0"/>
             <w:insideV w:val="none" w:color="auto" w:sz="0" w:space="0"/>
           </w:tblBorders>
-          <w:shd w:val="clear" w:color="auto" w:fill="auto"/>
           <w:tblCellMar>
             <w:top w:w="15" w:type="dxa"/>
             <w:left w:w="15" w:type="dxa"/>
@@ -7646,6 +7642,7 @@
             <w:insideH w:val="none" w:color="auto" w:sz="0" w:space="0"/>
             <w:insideV w:val="none" w:color="auto" w:sz="0" w:space="0"/>
           </w:tblBorders>
+          <w:shd w:val="clear" w:color="auto" w:fill="auto"/>
           <w:tblCellMar>
             <w:top w:w="15" w:type="dxa"/>
             <w:left w:w="15" w:type="dxa"/>
@@ -7732,7 +7729,6 @@
             <w:insideH w:val="none" w:color="auto" w:sz="0" w:space="0"/>
             <w:insideV w:val="none" w:color="auto" w:sz="0" w:space="0"/>
           </w:tblBorders>
-          <w:shd w:val="clear" w:color="auto" w:fill="auto"/>
           <w:tblCellMar>
             <w:top w:w="15" w:type="dxa"/>
             <w:left w:w="15" w:type="dxa"/>
@@ -7806,7 +7802,6 @@
             <w:insideH w:val="none" w:color="auto" w:sz="0" w:space="0"/>
             <w:insideV w:val="none" w:color="auto" w:sz="0" w:space="0"/>
           </w:tblBorders>
-          <w:shd w:val="clear" w:color="auto" w:fill="auto"/>
           <w:tblCellMar>
             <w:top w:w="15" w:type="dxa"/>
             <w:left w:w="15" w:type="dxa"/>
@@ -7880,7 +7875,6 @@
             <w:insideH w:val="none" w:color="auto" w:sz="0" w:space="0"/>
             <w:insideV w:val="none" w:color="auto" w:sz="0" w:space="0"/>
           </w:tblBorders>
-          <w:shd w:val="clear" w:color="auto" w:fill="auto"/>
           <w:tblCellMar>
             <w:top w:w="15" w:type="dxa"/>
             <w:left w:w="15" w:type="dxa"/>
@@ -9800,7 +9794,7 @@
           <w:highlight w:val="magenta"/>
         </w:rPr>
         <w:pict>
-          <v:rect id="_x0000_i1086" o:spt="1" style="height:1.5pt;width:432pt;" fillcolor="#A0A0A0" filled="t" stroked="f" coordsize="21600,21600" o:hr="t" o:hrstd="t" o:hralign="center">
+          <v:rect id="_x0000_i1079" o:spt="1" style="height:1.5pt;width:432pt;" fillcolor="#A0A0A0" filled="t" stroked="f" coordsize="21600,21600" o:hr="t" o:hrstd="t" o:hralign="center">
             <v:path/>
             <v:fill on="t" focussize="0,0"/>
             <v:stroke on="f"/>
@@ -9816,7 +9810,7 @@
           <w:highlight w:val="magenta"/>
         </w:rPr>
         <w:pict>
-          <v:rect id="_x0000_i1087" o:spt="1" style="height:1.5pt;width:432pt;" fillcolor="#A0A0A0" filled="t" stroked="f" coordsize="21600,21600" o:hr="t" o:hrstd="t" o:hralign="center">
+          <v:rect id="_x0000_i1080" o:spt="1" style="height:1.5pt;width:432pt;" fillcolor="#A0A0A0" filled="t" stroked="f" coordsize="21600,21600" o:hr="t" o:hrstd="t" o:hralign="center">
             <v:path/>
             <v:fill on="t" focussize="0,0"/>
             <v:stroke on="f"/>
@@ -10147,8 +10141,6 @@
           </wp:inline>
         </w:drawing>
       </w:r>
-      <w:bookmarkStart w:id="0" w:name="_GoBack"/>
-      <w:bookmarkEnd w:id="0"/>
     </w:p>
     <w:p>
       <w:pPr>
@@ -10517,6 +10509,2054 @@
     <w:p>
       <w:pPr>
         <w:jc w:val="center"/>
+        <w:rPr>
+          <w:rFonts w:hint="default"/>
+          <w:lang w:val="en-IN"/>
+        </w:rPr>
+      </w:pPr>
+    </w:p>
+    <w:p>
+      <w:pPr>
+        <w:jc w:val="center"/>
+        <w:rPr>
+          <w:rFonts w:hint="default"/>
+          <w:lang w:val="en-IN"/>
+        </w:rPr>
+      </w:pPr>
+    </w:p>
+    <w:p>
+      <w:pPr>
+        <w:jc w:val="center"/>
+        <w:rPr>
+          <w:rFonts w:hint="default"/>
+          <w:lang w:val="en-IN"/>
+        </w:rPr>
+      </w:pPr>
+    </w:p>
+    <w:p>
+      <w:pPr>
+        <w:pStyle w:val="3"/>
+        <w:keepNext w:val="0"/>
+        <w:keepLines w:val="0"/>
+        <w:widowControl/>
+        <w:suppressLineNumbers w:val="0"/>
+        <w:rPr>
+          <w:highlight w:val="yellow"/>
+        </w:rPr>
+      </w:pPr>
+      <w:r>
+        <w:rPr>
+          <w:highlight w:val="yellow"/>
+        </w:rPr>
+        <w:t xml:space="preserve">✅ </w:t>
+      </w:r>
+      <w:r>
+        <w:rPr>
+          <w:rStyle w:val="10"/>
+          <w:b/>
+          <w:bCs/>
+          <w:highlight w:val="yellow"/>
+        </w:rPr>
+        <w:t>Empirical Rule (68-95-99.7 Rule)</w:t>
+      </w:r>
+    </w:p>
+    <w:p>
+      <w:pPr>
+        <w:pStyle w:val="9"/>
+        <w:keepNext w:val="0"/>
+        <w:keepLines w:val="0"/>
+        <w:widowControl/>
+        <w:suppressLineNumbers w:val="0"/>
+      </w:pPr>
+      <w:r>
+        <w:t xml:space="preserve">The </w:t>
+      </w:r>
+      <w:r>
+        <w:rPr>
+          <w:rStyle w:val="10"/>
+        </w:rPr>
+        <w:t>Empirical Rule</w:t>
+      </w:r>
+      <w:r>
+        <w:t xml:space="preserve"> is a statistical rule that applies to </w:t>
+      </w:r>
+      <w:r>
+        <w:rPr>
+          <w:rStyle w:val="10"/>
+        </w:rPr>
+        <w:t>normally distributed data (bell-shaped distribution)</w:t>
+      </w:r>
+      <w:r>
+        <w:t xml:space="preserve"> and tells us how much data lies within certain standard deviations from the mean.</w:t>
+      </w:r>
+    </w:p>
+    <w:p>
+      <w:pPr>
+        <w:pStyle w:val="9"/>
+        <w:keepNext w:val="0"/>
+        <w:keepLines w:val="0"/>
+        <w:widowControl/>
+        <w:suppressLineNumbers w:val="0"/>
+      </w:pPr>
+      <w:r>
+        <w:t>Sure — here it is in compact form as you asked:</w:t>
+      </w:r>
+    </w:p>
+    <w:p>
+      <w:pPr>
+        <w:keepNext w:val="0"/>
+        <w:keepLines w:val="0"/>
+        <w:widowControl/>
+        <w:suppressLineNumbers w:val="0"/>
+      </w:pPr>
+      <w:r>
+        <w:pict>
+          <v:rect id="_x0000_i1086" o:spt="1" style="height:1.5pt;width:432pt;" fillcolor="#A0A0A0" filled="t" stroked="f" coordsize="21600,21600" o:hr="t" o:hrstd="t" o:hralign="center">
+            <v:path/>
+            <v:fill on="t" focussize="0,0"/>
+            <v:stroke on="f"/>
+            <v:imagedata o:title=""/>
+            <o:lock v:ext="edit"/>
+            <w10:wrap type="none"/>
+            <w10:anchorlock/>
+          </v:rect>
+        </w:pict>
+      </w:r>
+    </w:p>
+    <w:p>
+      <w:pPr>
+        <w:pStyle w:val="3"/>
+        <w:keepNext w:val="0"/>
+        <w:keepLines w:val="0"/>
+        <w:widowControl/>
+        <w:suppressLineNumbers w:val="0"/>
+        <w:rPr>
+          <w:highlight w:val="cyan"/>
+        </w:rPr>
+      </w:pPr>
+      <w:r>
+        <w:rPr>
+          <w:highlight w:val="cyan"/>
+        </w:rPr>
+        <w:t xml:space="preserve">📌 </w:t>
+      </w:r>
+      <w:r>
+        <w:rPr>
+          <w:rStyle w:val="10"/>
+          <w:b/>
+          <w:bCs/>
+          <w:highlight w:val="cyan"/>
+        </w:rPr>
+        <w:t>Empirical Rule (68–95–99.7 Rule</w:t>
+      </w:r>
+    </w:p>
+    <w:p>
+      <w:pPr>
+        <w:pStyle w:val="9"/>
+        <w:keepNext w:val="0"/>
+        <w:keepLines w:val="0"/>
+        <w:widowControl/>
+        <w:suppressLineNumbers w:val="0"/>
+        <w:ind w:left="720"/>
+      </w:pPr>
+      <w:r>
+        <w:rPr>
+          <w:rStyle w:val="10"/>
+        </w:rPr>
+        <w:t>68%</w:t>
+      </w:r>
+      <w:r>
+        <w:t xml:space="preserve"> of data lies within </w:t>
+      </w:r>
+      <w:r>
+        <w:rPr>
+          <w:rStyle w:val="10"/>
+        </w:rPr>
+        <w:t>±1σ</w:t>
+      </w:r>
+      <w:r>
+        <w:t xml:space="preserve"> of the mean</w:t>
+      </w:r>
+    </w:p>
+    <w:p>
+      <w:pPr>
+        <w:pStyle w:val="9"/>
+        <w:keepNext w:val="0"/>
+        <w:keepLines w:val="0"/>
+        <w:widowControl/>
+        <w:suppressLineNumbers w:val="0"/>
+        <w:ind w:left="720"/>
+      </w:pPr>
+      <w:r>
+        <w:rPr>
+          <w:rStyle w:val="10"/>
+        </w:rPr>
+        <w:t>95%</w:t>
+      </w:r>
+      <w:r>
+        <w:t xml:space="preserve"> of data lies within </w:t>
+      </w:r>
+      <w:r>
+        <w:rPr>
+          <w:rStyle w:val="10"/>
+        </w:rPr>
+        <w:t>±2σ</w:t>
+      </w:r>
+      <w:r>
+        <w:t xml:space="preserve"> of the mean</w:t>
+      </w:r>
+    </w:p>
+    <w:p>
+      <w:pPr>
+        <w:pStyle w:val="9"/>
+        <w:keepNext w:val="0"/>
+        <w:keepLines w:val="0"/>
+        <w:widowControl/>
+        <w:suppressLineNumbers w:val="0"/>
+        <w:ind w:left="720"/>
+      </w:pPr>
+      <w:r>
+        <w:rPr>
+          <w:rStyle w:val="10"/>
+        </w:rPr>
+        <w:t>99.7%</w:t>
+      </w:r>
+      <w:r>
+        <w:t xml:space="preserve"> of data lies within </w:t>
+      </w:r>
+      <w:r>
+        <w:rPr>
+          <w:rStyle w:val="10"/>
+        </w:rPr>
+        <w:t>±3σ</w:t>
+      </w:r>
+      <w:r>
+        <w:t xml:space="preserve"> of the mean</w:t>
+      </w:r>
+    </w:p>
+    <w:p>
+      <w:pPr>
+        <w:pStyle w:val="9"/>
+        <w:keepNext w:val="0"/>
+        <w:keepLines w:val="0"/>
+        <w:widowControl/>
+        <w:suppressLineNumbers w:val="0"/>
+      </w:pPr>
+      <w:r>
+        <w:t>(μ = mean, σ = standard deviation)</w:t>
+      </w:r>
+    </w:p>
+    <w:p>
+      <w:pPr>
+        <w:keepNext w:val="0"/>
+        <w:keepLines w:val="0"/>
+        <w:widowControl/>
+        <w:suppressLineNumbers w:val="0"/>
+      </w:pPr>
+      <w:r>
+        <w:pict>
+          <v:rect id="_x0000_i1087" o:spt="1" style="height:1.5pt;width:432pt;" fillcolor="#A0A0A0" filled="t" stroked="f" coordsize="21600,21600" o:hr="t" o:hrstd="t" o:hralign="center">
+            <v:path/>
+            <v:fill on="t" focussize="0,0"/>
+            <v:stroke on="f"/>
+            <v:imagedata o:title=""/>
+            <o:lock v:ext="edit"/>
+            <w10:wrap type="none"/>
+            <w10:anchorlock/>
+          </v:rect>
+        </w:pict>
+      </w:r>
+    </w:p>
+    <w:p>
+      <w:pPr>
+        <w:pStyle w:val="3"/>
+        <w:keepNext w:val="0"/>
+        <w:keepLines w:val="0"/>
+        <w:widowControl/>
+        <w:suppressLineNumbers w:val="0"/>
+      </w:pPr>
+      <w:r>
+        <w:t>✏️</w:t>
+      </w:r>
+      <w:r>
+        <w:rPr>
+          <w:highlight w:val="cyan"/>
+        </w:rPr>
+        <w:t xml:space="preserve"> </w:t>
+      </w:r>
+      <w:r>
+        <w:rPr>
+          <w:rStyle w:val="10"/>
+          <w:b/>
+          <w:bCs/>
+          <w:highlight w:val="cyan"/>
+        </w:rPr>
+        <w:t>Example — Student Heights</w:t>
+      </w:r>
+    </w:p>
+    <w:p>
+      <w:pPr>
+        <w:pStyle w:val="9"/>
+        <w:keepNext w:val="0"/>
+        <w:keepLines w:val="0"/>
+        <w:widowControl/>
+        <w:suppressLineNumbers w:val="0"/>
+      </w:pPr>
+      <w:r>
+        <w:t xml:space="preserve">Mean height (μ) = </w:t>
+      </w:r>
+      <w:r>
+        <w:rPr>
+          <w:rStyle w:val="10"/>
+        </w:rPr>
+        <w:t>160 cm</w:t>
+      </w:r>
+      <w:r>
+        <w:br w:type="textWrapping"/>
+      </w:r>
+      <w:r>
+        <w:t xml:space="preserve">Standard deviation (σ) = </w:t>
+      </w:r>
+      <w:r>
+        <w:rPr>
+          <w:rStyle w:val="10"/>
+        </w:rPr>
+        <w:t>10 cm</w:t>
+      </w:r>
+    </w:p>
+    <w:p>
+      <w:pPr>
+        <w:pStyle w:val="9"/>
+        <w:keepNext w:val="0"/>
+        <w:keepLines w:val="0"/>
+        <w:widowControl/>
+        <w:suppressLineNumbers w:val="0"/>
+        <w:ind w:firstLine="720" w:firstLineChars="0"/>
+      </w:pPr>
+      <w:r>
+        <w:rPr>
+          <w:rStyle w:val="10"/>
+        </w:rPr>
+        <w:t>Within 1σ:</w:t>
+      </w:r>
+      <w:r>
+        <w:br w:type="textWrapping"/>
+      </w:r>
+      <w:r>
+        <w:rPr>
+          <w:rFonts w:hint="default"/>
+          <w:lang w:val="en-IN"/>
+        </w:rPr>
+        <w:t>`</w:t>
+      </w:r>
+      <w:r>
+        <w:rPr>
+          <w:rFonts w:hint="default"/>
+          <w:lang w:val="en-IN"/>
+        </w:rPr>
+        <w:tab/>
+      </w:r>
+      <w:r>
+        <w:t xml:space="preserve">160 ± 10 → </w:t>
+      </w:r>
+      <w:r>
+        <w:rPr>
+          <w:rStyle w:val="10"/>
+        </w:rPr>
+        <w:t>150 to 170 cm</w:t>
+      </w:r>
+      <w:r>
+        <w:t xml:space="preserve"> → ~68% students</w:t>
+      </w:r>
+    </w:p>
+    <w:p>
+      <w:pPr>
+        <w:pStyle w:val="9"/>
+        <w:keepNext w:val="0"/>
+        <w:keepLines w:val="0"/>
+        <w:widowControl/>
+        <w:suppressLineNumbers w:val="0"/>
+        <w:ind w:firstLine="720" w:firstLineChars="0"/>
+      </w:pPr>
+      <w:r>
+        <w:rPr>
+          <w:rStyle w:val="10"/>
+        </w:rPr>
+        <w:t>Within 2σ:</w:t>
+      </w:r>
+      <w:r>
+        <w:br w:type="textWrapping"/>
+      </w:r>
+      <w:r>
+        <w:rPr>
+          <w:rFonts w:hint="default"/>
+          <w:lang w:val="en-IN"/>
+        </w:rPr>
+        <w:tab/>
+      </w:r>
+      <w:r>
+        <w:t xml:space="preserve">160 ± 20 → </w:t>
+      </w:r>
+      <w:r>
+        <w:rPr>
+          <w:rStyle w:val="10"/>
+        </w:rPr>
+        <w:t>140 to 180 cm</w:t>
+      </w:r>
+      <w:r>
+        <w:t xml:space="preserve"> → ~95% students</w:t>
+      </w:r>
+    </w:p>
+    <w:p>
+      <w:pPr>
+        <w:pStyle w:val="9"/>
+        <w:keepNext w:val="0"/>
+        <w:keepLines w:val="0"/>
+        <w:widowControl/>
+        <w:suppressLineNumbers w:val="0"/>
+        <w:ind w:left="720"/>
+      </w:pPr>
+      <w:r>
+        <w:rPr>
+          <w:rStyle w:val="10"/>
+        </w:rPr>
+        <w:t>Within 3σ:</w:t>
+      </w:r>
+      <w:r>
+        <w:br w:type="textWrapping"/>
+      </w:r>
+      <w:r>
+        <w:t xml:space="preserve">160 ± 30 → </w:t>
+      </w:r>
+      <w:r>
+        <w:rPr>
+          <w:rStyle w:val="10"/>
+        </w:rPr>
+        <w:t>130 to 190 cm</w:t>
+      </w:r>
+      <w:r>
+        <w:t xml:space="preserve"> → ~99.7% students</w:t>
+      </w:r>
+    </w:p>
+    <w:p>
+      <w:pPr>
+        <w:keepNext w:val="0"/>
+        <w:keepLines w:val="0"/>
+        <w:widowControl/>
+        <w:suppressLineNumbers w:val="0"/>
+      </w:pPr>
+      <w:r>
+        <w:pict>
+          <v:rect id="_x0000_i1088" o:spt="1" style="height:1.5pt;width:432pt;" fillcolor="#A0A0A0" filled="t" stroked="f" coordsize="21600,21600" o:hr="t" o:hrstd="t" o:hralign="center">
+            <v:path/>
+            <v:fill on="t" focussize="0,0"/>
+            <v:stroke on="f"/>
+            <v:imagedata o:title=""/>
+            <o:lock v:ext="edit"/>
+            <w10:wrap type="none"/>
+            <w10:anchorlock/>
+          </v:rect>
+        </w:pict>
+      </w:r>
+    </w:p>
+    <w:p>
+      <w:pPr>
+        <w:jc w:val="both"/>
+        <w:rPr>
+          <w:rFonts w:hint="default"/>
+          <w:lang w:val="en-IN"/>
+        </w:rPr>
+      </w:pPr>
+    </w:p>
+    <w:p>
+      <w:pPr>
+        <w:jc w:val="both"/>
+        <w:rPr>
+          <w:rFonts w:hint="default"/>
+          <w:lang w:val="en-IN"/>
+        </w:rPr>
+      </w:pPr>
+    </w:p>
+    <w:p>
+      <w:pPr>
+        <w:jc w:val="center"/>
+        <w:rPr>
+          <w:rFonts w:hint="default"/>
+          <w:sz w:val="40"/>
+          <w:szCs w:val="40"/>
+          <w:highlight w:val="yellow"/>
+          <w:lang w:val="en-IN"/>
+        </w:rPr>
+      </w:pPr>
+      <w:r>
+        <w:rPr>
+          <w:rFonts w:hint="default"/>
+          <w:sz w:val="40"/>
+          <w:szCs w:val="40"/>
+          <w:highlight w:val="yellow"/>
+          <w:lang w:val="en-IN"/>
+        </w:rPr>
+        <w:t>— Introduction to Inferential Statistics</w:t>
+      </w:r>
+    </w:p>
+    <w:p>
+      <w:pPr>
+        <w:jc w:val="both"/>
+        <w:rPr>
+          <w:rFonts w:hint="default"/>
+          <w:sz w:val="24"/>
+          <w:szCs w:val="24"/>
+          <w:lang w:val="en-IN"/>
+        </w:rPr>
+      </w:pPr>
+    </w:p>
+    <w:p>
+      <w:pPr>
+        <w:jc w:val="both"/>
+        <w:rPr>
+          <w:rFonts w:hint="default"/>
+          <w:sz w:val="24"/>
+          <w:szCs w:val="24"/>
+          <w:lang w:val="en-IN"/>
+        </w:rPr>
+      </w:pPr>
+      <w:r>
+        <w:rPr>
+          <w:rFonts w:hint="default"/>
+          <w:sz w:val="24"/>
+          <w:szCs w:val="24"/>
+          <w:lang w:val="en-IN"/>
+        </w:rPr>
+        <w:t>**Inferential statistics** deals with drawing conclusions about a **population** using data from a **sample**.</w:t>
+      </w:r>
+    </w:p>
+    <w:p>
+      <w:pPr>
+        <w:jc w:val="both"/>
+        <w:rPr>
+          <w:rFonts w:hint="default"/>
+          <w:sz w:val="24"/>
+          <w:szCs w:val="24"/>
+          <w:lang w:val="en-IN"/>
+        </w:rPr>
+      </w:pPr>
+    </w:p>
+    <w:p>
+      <w:pPr>
+        <w:jc w:val="both"/>
+        <w:rPr>
+          <w:rFonts w:hint="default"/>
+          <w:sz w:val="24"/>
+          <w:szCs w:val="24"/>
+          <w:lang w:val="en-IN"/>
+        </w:rPr>
+      </w:pPr>
+      <w:r>
+        <w:rPr>
+          <w:rFonts w:hint="default"/>
+          <w:sz w:val="24"/>
+          <w:szCs w:val="24"/>
+          <w:lang w:val="en-IN"/>
+        </w:rPr>
+        <w:t>Since studying the whole population is difficult, we:</w:t>
+      </w:r>
+    </w:p>
+    <w:p>
+      <w:pPr>
+        <w:jc w:val="both"/>
+        <w:rPr>
+          <w:rFonts w:hint="default"/>
+          <w:sz w:val="24"/>
+          <w:szCs w:val="24"/>
+          <w:lang w:val="en-IN"/>
+        </w:rPr>
+      </w:pPr>
+    </w:p>
+    <w:p>
+      <w:pPr>
+        <w:jc w:val="both"/>
+        <w:rPr>
+          <w:rFonts w:hint="default"/>
+          <w:sz w:val="24"/>
+          <w:szCs w:val="24"/>
+          <w:lang w:val="en-IN"/>
+        </w:rPr>
+      </w:pPr>
+      <w:r>
+        <w:rPr>
+          <w:rFonts w:hint="default"/>
+          <w:sz w:val="24"/>
+          <w:szCs w:val="24"/>
+          <w:lang w:val="en-IN"/>
+        </w:rPr>
+        <w:t>* collect a sample</w:t>
+      </w:r>
+    </w:p>
+    <w:p>
+      <w:pPr>
+        <w:jc w:val="both"/>
+        <w:rPr>
+          <w:rFonts w:hint="default"/>
+          <w:sz w:val="24"/>
+          <w:szCs w:val="24"/>
+          <w:lang w:val="en-IN"/>
+        </w:rPr>
+      </w:pPr>
+      <w:r>
+        <w:rPr>
+          <w:rFonts w:hint="default"/>
+          <w:sz w:val="24"/>
+          <w:szCs w:val="24"/>
+          <w:lang w:val="en-IN"/>
+        </w:rPr>
+        <w:t>* analyze it</w:t>
+      </w:r>
+    </w:p>
+    <w:p>
+      <w:pPr>
+        <w:jc w:val="both"/>
+        <w:rPr>
+          <w:rFonts w:hint="default"/>
+          <w:sz w:val="24"/>
+          <w:szCs w:val="24"/>
+          <w:lang w:val="en-IN"/>
+        </w:rPr>
+      </w:pPr>
+      <w:r>
+        <w:rPr>
+          <w:rFonts w:hint="default"/>
+          <w:sz w:val="24"/>
+          <w:szCs w:val="24"/>
+          <w:lang w:val="en-IN"/>
+        </w:rPr>
+        <w:t>* make predictions or estimates about the population</w:t>
+      </w:r>
+      <w:bookmarkStart w:id="0" w:name="_GoBack"/>
+      <w:bookmarkEnd w:id="0"/>
+    </w:p>
+    <w:p>
+      <w:pPr>
+        <w:jc w:val="both"/>
+        <w:rPr>
+          <w:rFonts w:hint="default"/>
+          <w:sz w:val="24"/>
+          <w:szCs w:val="24"/>
+          <w:lang w:val="en-IN"/>
+        </w:rPr>
+      </w:pPr>
+    </w:p>
+    <w:p>
+      <w:pPr>
+        <w:jc w:val="both"/>
+        <w:rPr>
+          <w:rFonts w:hint="default"/>
+          <w:sz w:val="24"/>
+          <w:szCs w:val="24"/>
+          <w:lang w:val="en-IN"/>
+        </w:rPr>
+      </w:pPr>
+      <w:r>
+        <w:rPr>
+          <w:rFonts w:hint="default"/>
+          <w:sz w:val="24"/>
+          <w:szCs w:val="24"/>
+          <w:lang w:val="en-IN"/>
+        </w:rPr>
+        <w:t>👉 It helps in generalizing results beyond the observed data.</w:t>
+      </w:r>
+    </w:p>
+    <w:p>
+      <w:pPr>
+        <w:jc w:val="both"/>
+        <w:rPr>
+          <w:rFonts w:hint="default"/>
+          <w:lang w:val="en-IN"/>
+        </w:rPr>
+      </w:pPr>
+    </w:p>
+    <w:p>
+      <w:pPr>
+        <w:jc w:val="both"/>
+        <w:rPr>
+          <w:rFonts w:hint="default"/>
+          <w:highlight w:val="cyan"/>
+          <w:lang w:val="en-IN"/>
+        </w:rPr>
+      </w:pPr>
+      <w:r>
+        <w:rPr>
+          <w:rFonts w:hint="default"/>
+          <w:highlight w:val="cyan"/>
+          <w:lang w:val="en-IN"/>
+        </w:rPr>
+        <w:t>Examples:</w:t>
+      </w:r>
+    </w:p>
+    <w:p>
+      <w:pPr>
+        <w:jc w:val="both"/>
+        <w:rPr>
+          <w:rFonts w:hint="default"/>
+          <w:sz w:val="24"/>
+          <w:szCs w:val="24"/>
+          <w:lang w:val="en-IN"/>
+        </w:rPr>
+      </w:pPr>
+    </w:p>
+    <w:p>
+      <w:pPr>
+        <w:jc w:val="both"/>
+        <w:rPr>
+          <w:rFonts w:hint="default"/>
+          <w:sz w:val="24"/>
+          <w:szCs w:val="24"/>
+          <w:lang w:val="en-IN"/>
+        </w:rPr>
+      </w:pPr>
+      <w:r>
+        <w:rPr>
+          <w:rFonts w:hint="default"/>
+          <w:sz w:val="24"/>
+          <w:szCs w:val="24"/>
+          <w:lang w:val="en-IN"/>
+        </w:rPr>
+        <w:t>* Predicting election results using opinion polls</w:t>
+      </w:r>
+    </w:p>
+    <w:p>
+      <w:pPr>
+        <w:jc w:val="both"/>
+        <w:rPr>
+          <w:rFonts w:hint="default"/>
+          <w:sz w:val="24"/>
+          <w:szCs w:val="24"/>
+          <w:lang w:val="en-IN"/>
+        </w:rPr>
+      </w:pPr>
+    </w:p>
+    <w:p>
+      <w:pPr>
+        <w:jc w:val="both"/>
+        <w:rPr>
+          <w:rFonts w:hint="default"/>
+          <w:sz w:val="24"/>
+          <w:szCs w:val="24"/>
+          <w:lang w:val="en-IN"/>
+        </w:rPr>
+      </w:pPr>
+      <w:r>
+        <w:rPr>
+          <w:rFonts w:hint="default"/>
+          <w:sz w:val="24"/>
+          <w:szCs w:val="24"/>
+          <w:lang w:val="en-IN"/>
+        </w:rPr>
+        <w:t>✔ Inferential statistics mainly includes:</w:t>
+      </w:r>
+    </w:p>
+    <w:p>
+      <w:pPr>
+        <w:jc w:val="both"/>
+        <w:rPr>
+          <w:rFonts w:hint="default"/>
+          <w:sz w:val="24"/>
+          <w:szCs w:val="24"/>
+          <w:lang w:val="en-IN"/>
+        </w:rPr>
+      </w:pPr>
+    </w:p>
+    <w:p>
+      <w:pPr>
+        <w:jc w:val="both"/>
+        <w:rPr>
+          <w:rFonts w:hint="default"/>
+          <w:sz w:val="24"/>
+          <w:szCs w:val="24"/>
+          <w:lang w:val="en-IN"/>
+        </w:rPr>
+      </w:pPr>
+      <w:r>
+        <w:rPr>
+          <w:rFonts w:hint="default"/>
+          <w:sz w:val="24"/>
+          <w:szCs w:val="24"/>
+          <w:lang w:val="en-IN"/>
+        </w:rPr>
+        <w:t>* Estimation</w:t>
+      </w:r>
+    </w:p>
+    <w:p>
+      <w:pPr>
+        <w:jc w:val="both"/>
+        <w:rPr>
+          <w:rFonts w:hint="default"/>
+          <w:sz w:val="24"/>
+          <w:szCs w:val="24"/>
+          <w:lang w:val="en-IN"/>
+        </w:rPr>
+      </w:pPr>
+      <w:r>
+        <w:rPr>
+          <w:rFonts w:hint="default"/>
+          <w:sz w:val="24"/>
+          <w:szCs w:val="24"/>
+          <w:lang w:val="en-IN"/>
+        </w:rPr>
+        <w:t>* Hypothesis testing</w:t>
+      </w:r>
+    </w:p>
+    <w:p>
+      <w:pPr>
+        <w:jc w:val="both"/>
+        <w:rPr>
+          <w:rFonts w:hint="default"/>
+          <w:lang w:val="en-IN"/>
+        </w:rPr>
+      </w:pPr>
+    </w:p>
+    <w:p>
+      <w:pPr>
+        <w:jc w:val="both"/>
+        <w:rPr>
+          <w:rFonts w:hint="default"/>
+          <w:sz w:val="36"/>
+          <w:szCs w:val="36"/>
+          <w:highlight w:val="cyan"/>
+          <w:lang w:val="en-IN"/>
+        </w:rPr>
+      </w:pPr>
+      <w:r>
+        <w:rPr>
+          <w:rFonts w:hint="default"/>
+          <w:sz w:val="36"/>
+          <w:szCs w:val="36"/>
+          <w:highlight w:val="cyan"/>
+          <w:lang w:val="en-IN"/>
+        </w:rPr>
+        <w:t>---</w:t>
+      </w:r>
+    </w:p>
+    <w:p>
+      <w:pPr>
+        <w:jc w:val="both"/>
+        <w:rPr>
+          <w:rFonts w:hint="default"/>
+          <w:sz w:val="36"/>
+          <w:szCs w:val="36"/>
+          <w:highlight w:val="cyan"/>
+          <w:lang w:val="en-IN"/>
+        </w:rPr>
+      </w:pPr>
+      <w:r>
+        <w:rPr>
+          <w:rFonts w:hint="default"/>
+          <w:sz w:val="36"/>
+          <w:szCs w:val="36"/>
+          <w:highlight w:val="cyan"/>
+          <w:lang w:val="en-IN"/>
+        </w:rPr>
+        <w:t xml:space="preserve"> What is Estimation?**</w:t>
+      </w:r>
+    </w:p>
+    <w:p>
+      <w:pPr>
+        <w:jc w:val="both"/>
+        <w:rPr>
+          <w:rFonts w:hint="default"/>
+          <w:lang w:val="en-IN"/>
+        </w:rPr>
+      </w:pPr>
+    </w:p>
+    <w:p>
+      <w:pPr>
+        <w:jc w:val="both"/>
+        <w:rPr>
+          <w:rFonts w:hint="default"/>
+          <w:sz w:val="24"/>
+          <w:szCs w:val="24"/>
+          <w:lang w:val="en-IN"/>
+        </w:rPr>
+      </w:pPr>
+      <w:r>
+        <w:rPr>
+          <w:rFonts w:hint="default"/>
+          <w:sz w:val="24"/>
+          <w:szCs w:val="24"/>
+          <w:lang w:val="en-IN"/>
+        </w:rPr>
+        <w:t>**Estimation** is the process of using **sample data** to estimate an **unknown population parameter**.</w:t>
+      </w:r>
+    </w:p>
+    <w:p>
+      <w:pPr>
+        <w:jc w:val="both"/>
+        <w:rPr>
+          <w:rFonts w:hint="default"/>
+          <w:sz w:val="24"/>
+          <w:szCs w:val="24"/>
+          <w:lang w:val="en-IN"/>
+        </w:rPr>
+      </w:pPr>
+    </w:p>
+    <w:p>
+      <w:pPr>
+        <w:jc w:val="both"/>
+        <w:rPr>
+          <w:rFonts w:hint="default"/>
+          <w:sz w:val="24"/>
+          <w:szCs w:val="24"/>
+          <w:highlight w:val="magenta"/>
+          <w:lang w:val="en-IN"/>
+        </w:rPr>
+      </w:pPr>
+      <w:r>
+        <w:rPr>
+          <w:rFonts w:hint="default"/>
+          <w:sz w:val="24"/>
+          <w:szCs w:val="24"/>
+          <w:highlight w:val="magenta"/>
+          <w:lang w:val="en-IN"/>
+        </w:rPr>
+        <w:t>Population parameters (unknown):</w:t>
+      </w:r>
+    </w:p>
+    <w:p>
+      <w:pPr>
+        <w:jc w:val="both"/>
+        <w:rPr>
+          <w:rFonts w:hint="default"/>
+          <w:sz w:val="24"/>
+          <w:szCs w:val="24"/>
+          <w:lang w:val="en-IN"/>
+        </w:rPr>
+      </w:pPr>
+    </w:p>
+    <w:p>
+      <w:pPr>
+        <w:jc w:val="both"/>
+        <w:rPr>
+          <w:rFonts w:hint="default"/>
+          <w:sz w:val="24"/>
+          <w:szCs w:val="24"/>
+          <w:lang w:val="en-IN"/>
+        </w:rPr>
+      </w:pPr>
+      <w:r>
+        <w:rPr>
+          <w:rFonts w:hint="default"/>
+          <w:sz w:val="24"/>
+          <w:szCs w:val="24"/>
+          <w:lang w:val="en-IN"/>
+        </w:rPr>
+        <w:t>* μ → population mean</w:t>
+      </w:r>
+    </w:p>
+    <w:p>
+      <w:pPr>
+        <w:jc w:val="both"/>
+        <w:rPr>
+          <w:rFonts w:hint="default"/>
+          <w:sz w:val="24"/>
+          <w:szCs w:val="24"/>
+          <w:lang w:val="en-IN"/>
+        </w:rPr>
+      </w:pPr>
+      <w:r>
+        <w:rPr>
+          <w:rFonts w:hint="default"/>
+          <w:sz w:val="24"/>
+          <w:szCs w:val="24"/>
+          <w:lang w:val="en-IN"/>
+        </w:rPr>
+        <w:t>* σ → population standard deviation</w:t>
+      </w:r>
+    </w:p>
+    <w:p>
+      <w:pPr>
+        <w:jc w:val="both"/>
+        <w:rPr>
+          <w:rFonts w:hint="default"/>
+          <w:sz w:val="24"/>
+          <w:szCs w:val="24"/>
+          <w:lang w:val="en-IN"/>
+        </w:rPr>
+      </w:pPr>
+      <w:r>
+        <w:rPr>
+          <w:rFonts w:hint="default"/>
+          <w:sz w:val="24"/>
+          <w:szCs w:val="24"/>
+          <w:lang w:val="en-IN"/>
+        </w:rPr>
+        <w:t>* p → population proportion</w:t>
+      </w:r>
+    </w:p>
+    <w:p>
+      <w:pPr>
+        <w:jc w:val="both"/>
+        <w:rPr>
+          <w:rFonts w:hint="default"/>
+          <w:lang w:val="en-IN"/>
+        </w:rPr>
+      </w:pPr>
+    </w:p>
+    <w:p>
+      <w:pPr>
+        <w:jc w:val="both"/>
+        <w:rPr>
+          <w:rFonts w:hint="default"/>
+          <w:highlight w:val="magenta"/>
+          <w:lang w:val="en-IN"/>
+        </w:rPr>
+      </w:pPr>
+      <w:r>
+        <w:rPr>
+          <w:rFonts w:hint="default"/>
+          <w:highlight w:val="magenta"/>
+          <w:lang w:val="en-IN"/>
+        </w:rPr>
+        <w:t>Sample statistics (known from sample):</w:t>
+      </w:r>
+    </w:p>
+    <w:p>
+      <w:pPr>
+        <w:jc w:val="both"/>
+        <w:rPr>
+          <w:rFonts w:hint="default"/>
+          <w:sz w:val="24"/>
+          <w:szCs w:val="24"/>
+          <w:lang w:val="en-IN"/>
+        </w:rPr>
+      </w:pPr>
+    </w:p>
+    <w:p>
+      <w:pPr>
+        <w:jc w:val="both"/>
+        <w:rPr>
+          <w:rFonts w:hint="default"/>
+          <w:sz w:val="24"/>
+          <w:szCs w:val="24"/>
+          <w:lang w:val="en-IN"/>
+        </w:rPr>
+      </w:pPr>
+      <w:r>
+        <w:rPr>
+          <w:rFonts w:hint="default"/>
+          <w:sz w:val="24"/>
+          <w:szCs w:val="24"/>
+          <w:lang w:val="en-IN"/>
+        </w:rPr>
+        <w:t>* x̄ → sample mean</w:t>
+      </w:r>
+    </w:p>
+    <w:p>
+      <w:pPr>
+        <w:jc w:val="both"/>
+        <w:rPr>
+          <w:rFonts w:hint="default"/>
+          <w:sz w:val="24"/>
+          <w:szCs w:val="24"/>
+          <w:lang w:val="en-IN"/>
+        </w:rPr>
+      </w:pPr>
+      <w:r>
+        <w:rPr>
+          <w:rFonts w:hint="default"/>
+          <w:sz w:val="24"/>
+          <w:szCs w:val="24"/>
+          <w:lang w:val="en-IN"/>
+        </w:rPr>
+        <w:t>* s → sample standard deviation</w:t>
+      </w:r>
+    </w:p>
+    <w:p>
+      <w:pPr>
+        <w:jc w:val="both"/>
+        <w:rPr>
+          <w:rFonts w:hint="default"/>
+          <w:sz w:val="24"/>
+          <w:szCs w:val="24"/>
+          <w:lang w:val="en-IN"/>
+        </w:rPr>
+      </w:pPr>
+      <w:r>
+        <w:rPr>
+          <w:rFonts w:hint="default"/>
+          <w:sz w:val="24"/>
+          <w:szCs w:val="24"/>
+          <w:lang w:val="en-IN"/>
+        </w:rPr>
+        <w:t>* p̂ → sample proportion</w:t>
+      </w:r>
+    </w:p>
+    <w:p>
+      <w:pPr>
+        <w:jc w:val="both"/>
+        <w:rPr>
+          <w:rFonts w:hint="default"/>
+          <w:sz w:val="24"/>
+          <w:szCs w:val="24"/>
+          <w:lang w:val="en-IN"/>
+        </w:rPr>
+      </w:pPr>
+    </w:p>
+    <w:p>
+      <w:pPr>
+        <w:jc w:val="both"/>
+        <w:rPr>
+          <w:rFonts w:hint="default"/>
+          <w:sz w:val="24"/>
+          <w:szCs w:val="24"/>
+          <w:highlight w:val="green"/>
+          <w:lang w:val="en-IN"/>
+        </w:rPr>
+      </w:pPr>
+      <w:r>
+        <w:rPr>
+          <w:rFonts w:hint="default"/>
+          <w:sz w:val="24"/>
+          <w:szCs w:val="24"/>
+          <w:lang w:val="en-IN"/>
+        </w:rPr>
+        <w:t xml:space="preserve">👉 Estimation connects </w:t>
+      </w:r>
+      <w:r>
+        <w:rPr>
+          <w:rFonts w:hint="default"/>
+          <w:sz w:val="24"/>
+          <w:szCs w:val="24"/>
+          <w:highlight w:val="green"/>
+          <w:lang w:val="en-IN"/>
+        </w:rPr>
+        <w:t>**sample statistics → population parameters**</w:t>
+      </w:r>
+    </w:p>
+    <w:p>
+      <w:pPr>
+        <w:jc w:val="both"/>
+        <w:rPr>
+          <w:rFonts w:hint="default"/>
+          <w:lang w:val="en-IN"/>
+        </w:rPr>
+      </w:pPr>
+    </w:p>
+    <w:p>
+      <w:pPr>
+        <w:jc w:val="both"/>
+        <w:rPr>
+          <w:rFonts w:hint="default"/>
+          <w:lang w:val="en-IN"/>
+        </w:rPr>
+      </w:pPr>
+      <w:r>
+        <w:rPr>
+          <w:rFonts w:hint="default"/>
+          <w:lang w:val="en-IN"/>
+        </w:rPr>
+        <w:t>---</w:t>
+      </w:r>
+    </w:p>
+    <w:p>
+      <w:pPr>
+        <w:jc w:val="both"/>
+        <w:rPr>
+          <w:rFonts w:hint="default"/>
+          <w:lang w:val="en-IN"/>
+        </w:rPr>
+      </w:pPr>
+    </w:p>
+    <w:p>
+      <w:pPr>
+        <w:jc w:val="both"/>
+        <w:rPr>
+          <w:rFonts w:hint="default"/>
+          <w:sz w:val="40"/>
+          <w:szCs w:val="40"/>
+          <w:lang w:val="en-IN"/>
+        </w:rPr>
+      </w:pPr>
+      <w:r>
+        <w:rPr>
+          <w:rFonts w:hint="default"/>
+          <w:sz w:val="40"/>
+          <w:szCs w:val="40"/>
+          <w:highlight w:val="cyan"/>
+          <w:lang w:val="en-IN"/>
+        </w:rPr>
+        <w:t xml:space="preserve"> Point Estimation**</w:t>
+      </w:r>
+    </w:p>
+    <w:p>
+      <w:pPr>
+        <w:jc w:val="both"/>
+        <w:rPr>
+          <w:rFonts w:hint="default"/>
+          <w:lang w:val="en-IN"/>
+        </w:rPr>
+      </w:pPr>
+    </w:p>
+    <w:p>
+      <w:pPr>
+        <w:jc w:val="both"/>
+        <w:rPr>
+          <w:rFonts w:hint="default"/>
+          <w:sz w:val="24"/>
+          <w:szCs w:val="24"/>
+          <w:lang w:val="en-IN"/>
+        </w:rPr>
+      </w:pPr>
+      <w:r>
+        <w:rPr>
+          <w:rFonts w:hint="default"/>
+          <w:sz w:val="24"/>
+          <w:szCs w:val="24"/>
+          <w:lang w:val="en-IN"/>
+        </w:rPr>
+        <w:t>A **point estimate** gives a **single best numerical value** to estimate a population parameter.</w:t>
+      </w:r>
+    </w:p>
+    <w:p>
+      <w:pPr>
+        <w:jc w:val="both"/>
+        <w:rPr>
+          <w:rFonts w:hint="default"/>
+          <w:sz w:val="24"/>
+          <w:szCs w:val="24"/>
+          <w:lang w:val="en-IN"/>
+        </w:rPr>
+      </w:pPr>
+    </w:p>
+    <w:p>
+      <w:pPr>
+        <w:jc w:val="both"/>
+        <w:rPr>
+          <w:rFonts w:hint="default"/>
+          <w:sz w:val="24"/>
+          <w:szCs w:val="24"/>
+          <w:lang w:val="en-IN"/>
+        </w:rPr>
+      </w:pPr>
+      <w:r>
+        <w:rPr>
+          <w:rFonts w:hint="default"/>
+          <w:sz w:val="24"/>
+          <w:szCs w:val="24"/>
+          <w:lang w:val="en-IN"/>
+        </w:rPr>
+        <w:t>Examples:</w:t>
+      </w:r>
+    </w:p>
+    <w:p>
+      <w:pPr>
+        <w:jc w:val="both"/>
+        <w:rPr>
+          <w:rFonts w:hint="default"/>
+          <w:sz w:val="24"/>
+          <w:szCs w:val="24"/>
+          <w:lang w:val="en-IN"/>
+        </w:rPr>
+      </w:pPr>
+    </w:p>
+    <w:p>
+      <w:pPr>
+        <w:jc w:val="both"/>
+        <w:rPr>
+          <w:rFonts w:hint="default"/>
+          <w:sz w:val="24"/>
+          <w:szCs w:val="24"/>
+          <w:lang w:val="en-IN"/>
+        </w:rPr>
+      </w:pPr>
+      <w:r>
+        <w:rPr>
+          <w:rFonts w:hint="default"/>
+          <w:sz w:val="24"/>
+          <w:szCs w:val="24"/>
+          <w:lang w:val="en-IN"/>
+        </w:rPr>
+        <w:t>| Population Parameter      | Sample Point Estimate  |</w:t>
+      </w:r>
+    </w:p>
+    <w:p>
+      <w:pPr>
+        <w:jc w:val="both"/>
+        <w:rPr>
+          <w:rFonts w:hint="default"/>
+          <w:sz w:val="24"/>
+          <w:szCs w:val="24"/>
+          <w:lang w:val="en-IN"/>
+        </w:rPr>
+      </w:pPr>
+      <w:r>
+        <w:rPr>
+          <w:rFonts w:hint="default"/>
+          <w:sz w:val="24"/>
+          <w:szCs w:val="24"/>
+          <w:lang w:val="en-IN"/>
+        </w:rPr>
+        <w:t>| ------------------------- | ---------------------- |</w:t>
+      </w:r>
+    </w:p>
+    <w:p>
+      <w:pPr>
+        <w:jc w:val="both"/>
+        <w:rPr>
+          <w:rFonts w:hint="default"/>
+          <w:sz w:val="24"/>
+          <w:szCs w:val="24"/>
+          <w:lang w:val="en-IN"/>
+        </w:rPr>
+      </w:pPr>
+      <w:r>
+        <w:rPr>
+          <w:rFonts w:hint="default"/>
+          <w:sz w:val="24"/>
+          <w:szCs w:val="24"/>
+          <w:lang w:val="en-IN"/>
+        </w:rPr>
+        <w:t>| μ (population mean)       | x̄ (sample mean)       |</w:t>
+      </w:r>
+    </w:p>
+    <w:p>
+      <w:pPr>
+        <w:jc w:val="both"/>
+        <w:rPr>
+          <w:rFonts w:hint="default"/>
+          <w:sz w:val="24"/>
+          <w:szCs w:val="24"/>
+          <w:lang w:val="en-IN"/>
+        </w:rPr>
+      </w:pPr>
+      <w:r>
+        <w:rPr>
+          <w:rFonts w:hint="default"/>
+          <w:sz w:val="24"/>
+          <w:szCs w:val="24"/>
+          <w:lang w:val="en-IN"/>
+        </w:rPr>
+        <w:t>| p (population proportion) | p̂ (sample proportion) |</w:t>
+      </w:r>
+    </w:p>
+    <w:p>
+      <w:pPr>
+        <w:jc w:val="both"/>
+        <w:rPr>
+          <w:rFonts w:hint="default"/>
+          <w:sz w:val="24"/>
+          <w:szCs w:val="24"/>
+          <w:lang w:val="en-IN"/>
+        </w:rPr>
+      </w:pPr>
+      <w:r>
+        <w:rPr>
+          <w:rFonts w:hint="default"/>
+          <w:sz w:val="24"/>
+          <w:szCs w:val="24"/>
+          <w:lang w:val="en-IN"/>
+        </w:rPr>
+        <w:t>| σ² (population variance)  | s² (sample variance)   |</w:t>
+      </w:r>
+    </w:p>
+    <w:p>
+      <w:pPr>
+        <w:jc w:val="both"/>
+        <w:rPr>
+          <w:rFonts w:hint="default"/>
+          <w:sz w:val="24"/>
+          <w:szCs w:val="24"/>
+          <w:lang w:val="en-IN"/>
+        </w:rPr>
+      </w:pPr>
+    </w:p>
+    <w:p>
+      <w:pPr>
+        <w:jc w:val="both"/>
+        <w:rPr>
+          <w:rFonts w:hint="default"/>
+          <w:sz w:val="24"/>
+          <w:szCs w:val="24"/>
+          <w:lang w:val="en-IN"/>
+        </w:rPr>
+      </w:pPr>
+      <w:r>
+        <w:rPr>
+          <w:rFonts w:hint="default"/>
+          <w:sz w:val="24"/>
+          <w:szCs w:val="24"/>
+          <w:lang w:val="en-IN"/>
+        </w:rPr>
+        <w:t>Example:</w:t>
+      </w:r>
+    </w:p>
+    <w:p>
+      <w:pPr>
+        <w:jc w:val="both"/>
+        <w:rPr>
+          <w:rFonts w:hint="default"/>
+          <w:sz w:val="24"/>
+          <w:szCs w:val="24"/>
+          <w:lang w:val="en-IN"/>
+        </w:rPr>
+      </w:pPr>
+    </w:p>
+    <w:p>
+      <w:pPr>
+        <w:jc w:val="both"/>
+        <w:rPr>
+          <w:rFonts w:hint="default"/>
+          <w:sz w:val="24"/>
+          <w:szCs w:val="24"/>
+          <w:lang w:val="en-IN"/>
+        </w:rPr>
+      </w:pPr>
+      <w:r>
+        <w:rPr>
+          <w:rFonts w:hint="default"/>
+          <w:sz w:val="24"/>
+          <w:szCs w:val="24"/>
+          <w:lang w:val="en-IN"/>
+        </w:rPr>
+        <w:t>Average height of students in college is unknown.</w:t>
+      </w:r>
+    </w:p>
+    <w:p>
+      <w:pPr>
+        <w:jc w:val="both"/>
+        <w:rPr>
+          <w:rFonts w:hint="default"/>
+          <w:sz w:val="24"/>
+          <w:szCs w:val="24"/>
+          <w:lang w:val="en-IN"/>
+        </w:rPr>
+      </w:pPr>
+    </w:p>
+    <w:p>
+      <w:pPr>
+        <w:jc w:val="both"/>
+        <w:rPr>
+          <w:rFonts w:hint="default"/>
+          <w:sz w:val="24"/>
+          <w:szCs w:val="24"/>
+          <w:lang w:val="en-IN"/>
+        </w:rPr>
+      </w:pPr>
+      <w:r>
+        <w:rPr>
+          <w:rFonts w:hint="default"/>
+          <w:sz w:val="24"/>
+          <w:szCs w:val="24"/>
+          <w:lang w:val="en-IN"/>
+        </w:rPr>
+        <w:t>Take a sample:</w:t>
+      </w:r>
+    </w:p>
+    <w:p>
+      <w:pPr>
+        <w:jc w:val="both"/>
+        <w:rPr>
+          <w:rFonts w:hint="default"/>
+          <w:sz w:val="24"/>
+          <w:szCs w:val="24"/>
+          <w:lang w:val="en-IN"/>
+        </w:rPr>
+      </w:pPr>
+    </w:p>
+    <w:p>
+      <w:pPr>
+        <w:jc w:val="both"/>
+        <w:rPr>
+          <w:rFonts w:hint="default"/>
+          <w:sz w:val="24"/>
+          <w:szCs w:val="24"/>
+          <w:lang w:val="en-IN"/>
+        </w:rPr>
+      </w:pPr>
+      <w:r>
+        <w:rPr>
+          <w:rFonts w:hint="default"/>
+          <w:sz w:val="24"/>
+          <w:szCs w:val="24"/>
+          <w:lang w:val="en-IN"/>
+        </w:rPr>
+        <w:t>* sample mean height = **160 cm**</w:t>
+      </w:r>
+    </w:p>
+    <w:p>
+      <w:pPr>
+        <w:jc w:val="both"/>
+        <w:rPr>
+          <w:rFonts w:hint="default"/>
+          <w:sz w:val="24"/>
+          <w:szCs w:val="24"/>
+          <w:lang w:val="en-IN"/>
+        </w:rPr>
+      </w:pPr>
+    </w:p>
+    <w:p>
+      <w:pPr>
+        <w:jc w:val="both"/>
+        <w:rPr>
+          <w:rFonts w:hint="default"/>
+          <w:sz w:val="24"/>
+          <w:szCs w:val="24"/>
+          <w:lang w:val="en-IN"/>
+        </w:rPr>
+      </w:pPr>
+      <w:r>
+        <w:rPr>
+          <w:rFonts w:hint="default"/>
+          <w:sz w:val="24"/>
+          <w:szCs w:val="24"/>
+          <w:lang w:val="en-IN"/>
+        </w:rPr>
+        <w:t>So **x̄ = 160 cm** is the **point estimate of μ**</w:t>
+      </w:r>
+    </w:p>
+    <w:p>
+      <w:pPr>
+        <w:jc w:val="both"/>
+        <w:rPr>
+          <w:rFonts w:hint="default"/>
+          <w:lang w:val="en-IN"/>
+        </w:rPr>
+      </w:pPr>
+    </w:p>
+    <w:p>
+      <w:pPr>
+        <w:jc w:val="both"/>
+        <w:rPr>
+          <w:rFonts w:hint="default"/>
+          <w:lang w:val="en-IN"/>
+        </w:rPr>
+      </w:pPr>
+      <w:r>
+        <w:rPr>
+          <w:rFonts w:hint="default"/>
+          <w:lang w:val="en-IN"/>
+        </w:rPr>
+        <w:t>------</w:t>
+      </w:r>
+    </w:p>
+    <w:p>
+      <w:pPr>
+        <w:jc w:val="both"/>
+        <w:rPr>
+          <w:rFonts w:hint="default"/>
+          <w:sz w:val="32"/>
+          <w:szCs w:val="32"/>
+          <w:highlight w:val="cyan"/>
+          <w:lang w:val="en-IN"/>
+        </w:rPr>
+      </w:pPr>
+      <w:r>
+        <w:rPr>
+          <w:rFonts w:hint="default"/>
+          <w:sz w:val="32"/>
+          <w:szCs w:val="32"/>
+          <w:highlight w:val="cyan"/>
+          <w:lang w:val="en-IN"/>
+        </w:rPr>
+        <w:t xml:space="preserve"> Drawback of Point Estimate**</w:t>
+      </w:r>
+    </w:p>
+    <w:p>
+      <w:pPr>
+        <w:jc w:val="both"/>
+        <w:rPr>
+          <w:rFonts w:hint="default"/>
+          <w:sz w:val="24"/>
+          <w:szCs w:val="24"/>
+          <w:lang w:val="en-IN"/>
+        </w:rPr>
+      </w:pPr>
+    </w:p>
+    <w:p>
+      <w:pPr>
+        <w:jc w:val="both"/>
+        <w:rPr>
+          <w:rFonts w:hint="default"/>
+          <w:sz w:val="24"/>
+          <w:szCs w:val="24"/>
+          <w:lang w:val="en-IN"/>
+        </w:rPr>
+      </w:pPr>
+      <w:r>
+        <w:rPr>
+          <w:rFonts w:hint="default"/>
+          <w:sz w:val="24"/>
+          <w:szCs w:val="24"/>
+          <w:lang w:val="en-IN"/>
+        </w:rPr>
+        <w:t>Point estimates give **only one value** — but do NOT show:</w:t>
+      </w:r>
+    </w:p>
+    <w:p>
+      <w:pPr>
+        <w:jc w:val="both"/>
+        <w:rPr>
+          <w:rFonts w:hint="default"/>
+          <w:sz w:val="24"/>
+          <w:szCs w:val="24"/>
+          <w:lang w:val="en-IN"/>
+        </w:rPr>
+      </w:pPr>
+    </w:p>
+    <w:p>
+      <w:pPr>
+        <w:jc w:val="both"/>
+        <w:rPr>
+          <w:rFonts w:hint="default"/>
+          <w:sz w:val="24"/>
+          <w:szCs w:val="24"/>
+          <w:lang w:val="en-IN"/>
+        </w:rPr>
+      </w:pPr>
+      <w:r>
+        <w:rPr>
+          <w:rFonts w:hint="default"/>
+          <w:sz w:val="24"/>
+          <w:szCs w:val="24"/>
+          <w:lang w:val="en-IN"/>
+        </w:rPr>
+        <w:t>* uncertainty</w:t>
+      </w:r>
+    </w:p>
+    <w:p>
+      <w:pPr>
+        <w:jc w:val="both"/>
+        <w:rPr>
+          <w:rFonts w:hint="default"/>
+          <w:sz w:val="24"/>
+          <w:szCs w:val="24"/>
+          <w:lang w:val="en-IN"/>
+        </w:rPr>
+      </w:pPr>
+      <w:r>
+        <w:rPr>
+          <w:rFonts w:hint="default"/>
+          <w:sz w:val="24"/>
+          <w:szCs w:val="24"/>
+          <w:lang w:val="en-IN"/>
+        </w:rPr>
+        <w:t>* confidence level</w:t>
+      </w:r>
+    </w:p>
+    <w:p>
+      <w:pPr>
+        <w:jc w:val="both"/>
+        <w:rPr>
+          <w:rFonts w:hint="default"/>
+          <w:sz w:val="24"/>
+          <w:szCs w:val="24"/>
+          <w:lang w:val="en-IN"/>
+        </w:rPr>
+      </w:pPr>
+      <w:r>
+        <w:rPr>
+          <w:rFonts w:hint="default"/>
+          <w:sz w:val="24"/>
+          <w:szCs w:val="24"/>
+          <w:lang w:val="en-IN"/>
+        </w:rPr>
+        <w:t>* sampling error</w:t>
+      </w:r>
+    </w:p>
+    <w:p>
+      <w:pPr>
+        <w:jc w:val="both"/>
+        <w:rPr>
+          <w:rFonts w:hint="default"/>
+          <w:lang w:val="en-IN"/>
+        </w:rPr>
+      </w:pPr>
+    </w:p>
+    <w:p>
+      <w:pPr>
+        <w:jc w:val="both"/>
+        <w:rPr>
+          <w:rFonts w:hint="default"/>
+          <w:lang w:val="en-IN"/>
+        </w:rPr>
+      </w:pPr>
+      <w:r>
+        <w:rPr>
+          <w:rFonts w:hint="default"/>
+          <w:lang w:val="en-IN"/>
+        </w:rPr>
+        <w:t>---</w:t>
+      </w:r>
+    </w:p>
+    <w:p>
+      <w:pPr>
+        <w:jc w:val="both"/>
+        <w:rPr>
+          <w:rFonts w:hint="default"/>
+          <w:lang w:val="en-IN"/>
+        </w:rPr>
+      </w:pPr>
+    </w:p>
+    <w:p>
+      <w:pPr>
+        <w:jc w:val="both"/>
+        <w:rPr>
+          <w:rFonts w:hint="default"/>
+          <w:sz w:val="36"/>
+          <w:szCs w:val="36"/>
+          <w:highlight w:val="cyan"/>
+          <w:lang w:val="en-IN"/>
+        </w:rPr>
+      </w:pPr>
+      <w:r>
+        <w:rPr>
+          <w:rFonts w:hint="default"/>
+          <w:sz w:val="36"/>
+          <w:szCs w:val="36"/>
+          <w:highlight w:val="cyan"/>
+          <w:lang w:val="en-IN"/>
+        </w:rPr>
+        <w:t xml:space="preserve"> Interval Estimation</w:t>
+      </w:r>
+    </w:p>
+    <w:p>
+      <w:pPr>
+        <w:jc w:val="both"/>
+        <w:rPr>
+          <w:rFonts w:hint="default"/>
+          <w:lang w:val="en-IN"/>
+        </w:rPr>
+      </w:pPr>
+    </w:p>
+    <w:p>
+      <w:pPr>
+        <w:jc w:val="both"/>
+        <w:rPr>
+          <w:rFonts w:hint="default"/>
+          <w:sz w:val="24"/>
+          <w:szCs w:val="24"/>
+          <w:lang w:val="en-IN"/>
+        </w:rPr>
+      </w:pPr>
+      <w:r>
+        <w:rPr>
+          <w:rFonts w:hint="default"/>
+          <w:sz w:val="24"/>
+          <w:szCs w:val="24"/>
+          <w:lang w:val="en-IN"/>
+        </w:rPr>
+        <w:t>An **interval estimate** gives a **range of values** instead of a single value.</w:t>
+      </w:r>
+    </w:p>
+    <w:p>
+      <w:pPr>
+        <w:jc w:val="both"/>
+        <w:rPr>
+          <w:rFonts w:hint="default"/>
+          <w:sz w:val="24"/>
+          <w:szCs w:val="24"/>
+          <w:lang w:val="en-IN"/>
+        </w:rPr>
+      </w:pPr>
+    </w:p>
+    <w:p>
+      <w:pPr>
+        <w:jc w:val="both"/>
+        <w:rPr>
+          <w:rFonts w:hint="default"/>
+          <w:sz w:val="24"/>
+          <w:szCs w:val="24"/>
+          <w:lang w:val="en-IN"/>
+        </w:rPr>
+      </w:pPr>
+      <w:r>
+        <w:rPr>
+          <w:rFonts w:hint="default"/>
+          <w:sz w:val="24"/>
+          <w:szCs w:val="24"/>
+          <w:lang w:val="en-IN"/>
+        </w:rPr>
+        <w:t>It provides:</w:t>
+      </w:r>
+    </w:p>
+    <w:p>
+      <w:pPr>
+        <w:jc w:val="both"/>
+        <w:rPr>
+          <w:rFonts w:hint="default"/>
+          <w:sz w:val="24"/>
+          <w:szCs w:val="24"/>
+          <w:lang w:val="en-IN"/>
+        </w:rPr>
+      </w:pPr>
+    </w:p>
+    <w:p>
+      <w:pPr>
+        <w:jc w:val="both"/>
+        <w:rPr>
+          <w:rFonts w:hint="default"/>
+          <w:sz w:val="24"/>
+          <w:szCs w:val="24"/>
+          <w:lang w:val="en-IN"/>
+        </w:rPr>
+      </w:pPr>
+      <w:r>
+        <w:rPr>
+          <w:rFonts w:hint="default"/>
+          <w:sz w:val="24"/>
+          <w:szCs w:val="24"/>
+          <w:lang w:val="en-IN"/>
+        </w:rPr>
+        <w:t>* estimate range</w:t>
+      </w:r>
+    </w:p>
+    <w:p>
+      <w:pPr>
+        <w:jc w:val="both"/>
+        <w:rPr>
+          <w:rFonts w:hint="default"/>
+          <w:sz w:val="24"/>
+          <w:szCs w:val="24"/>
+          <w:lang w:val="en-IN"/>
+        </w:rPr>
+      </w:pPr>
+      <w:r>
+        <w:rPr>
+          <w:rFonts w:hint="default"/>
+          <w:sz w:val="24"/>
+          <w:szCs w:val="24"/>
+          <w:lang w:val="en-IN"/>
+        </w:rPr>
+        <w:t>* confidence level</w:t>
+      </w:r>
+    </w:p>
+    <w:p>
+      <w:pPr>
+        <w:jc w:val="both"/>
+        <w:rPr>
+          <w:rFonts w:hint="default"/>
+          <w:sz w:val="24"/>
+          <w:szCs w:val="24"/>
+          <w:lang w:val="en-IN"/>
+        </w:rPr>
+      </w:pPr>
+      <w:r>
+        <w:rPr>
+          <w:rFonts w:hint="default"/>
+          <w:sz w:val="24"/>
+          <w:szCs w:val="24"/>
+          <w:lang w:val="en-IN"/>
+        </w:rPr>
+        <w:t>* uncertainty representation</w:t>
+      </w:r>
+    </w:p>
+    <w:p>
+      <w:pPr>
+        <w:jc w:val="both"/>
+        <w:rPr>
+          <w:rFonts w:hint="default"/>
+          <w:sz w:val="24"/>
+          <w:szCs w:val="24"/>
+          <w:lang w:val="en-IN"/>
+        </w:rPr>
+      </w:pPr>
+    </w:p>
+    <w:p>
+      <w:pPr>
+        <w:jc w:val="both"/>
+        <w:rPr>
+          <w:rFonts w:hint="default"/>
+          <w:sz w:val="24"/>
+          <w:szCs w:val="24"/>
+          <w:lang w:val="en-IN"/>
+        </w:rPr>
+      </w:pPr>
+      <w:r>
+        <w:rPr>
+          <w:rFonts w:hint="default"/>
+          <w:sz w:val="24"/>
+          <w:szCs w:val="24"/>
+          <w:lang w:val="en-IN"/>
+        </w:rPr>
+        <w:t>Example:</w:t>
+      </w:r>
+    </w:p>
+    <w:p>
+      <w:pPr>
+        <w:jc w:val="both"/>
+        <w:rPr>
+          <w:rFonts w:hint="default"/>
+          <w:sz w:val="24"/>
+          <w:szCs w:val="24"/>
+          <w:lang w:val="en-IN"/>
+        </w:rPr>
+      </w:pPr>
+    </w:p>
+    <w:p>
+      <w:pPr>
+        <w:jc w:val="both"/>
+        <w:rPr>
+          <w:rFonts w:hint="default"/>
+          <w:sz w:val="24"/>
+          <w:szCs w:val="24"/>
+          <w:lang w:val="en-IN"/>
+        </w:rPr>
+      </w:pPr>
+      <w:r>
+        <w:rPr>
+          <w:rFonts w:hint="default"/>
+          <w:sz w:val="24"/>
+          <w:szCs w:val="24"/>
+          <w:lang w:val="en-IN"/>
+        </w:rPr>
+        <w:t>Instead of:</w:t>
+      </w:r>
+    </w:p>
+    <w:p>
+      <w:pPr>
+        <w:jc w:val="both"/>
+        <w:rPr>
+          <w:rFonts w:hint="default"/>
+          <w:sz w:val="24"/>
+          <w:szCs w:val="24"/>
+          <w:lang w:val="en-IN"/>
+        </w:rPr>
+      </w:pPr>
+    </w:p>
+    <w:p>
+      <w:pPr>
+        <w:jc w:val="both"/>
+        <w:rPr>
+          <w:rFonts w:hint="default"/>
+          <w:sz w:val="24"/>
+          <w:szCs w:val="24"/>
+          <w:lang w:val="en-IN"/>
+        </w:rPr>
+      </w:pPr>
+      <w:r>
+        <w:rPr>
+          <w:rFonts w:hint="default"/>
+          <w:sz w:val="24"/>
+          <w:szCs w:val="24"/>
+          <w:lang w:val="en-IN"/>
+        </w:rPr>
+        <w:t>&gt; Mean height = 160 cm (point estimate)</w:t>
+      </w:r>
+    </w:p>
+    <w:p>
+      <w:pPr>
+        <w:jc w:val="both"/>
+        <w:rPr>
+          <w:rFonts w:hint="default"/>
+          <w:sz w:val="24"/>
+          <w:szCs w:val="24"/>
+          <w:lang w:val="en-IN"/>
+        </w:rPr>
+      </w:pPr>
+    </w:p>
+    <w:p>
+      <w:pPr>
+        <w:jc w:val="both"/>
+        <w:rPr>
+          <w:rFonts w:hint="default"/>
+          <w:sz w:val="24"/>
+          <w:szCs w:val="24"/>
+          <w:lang w:val="en-IN"/>
+        </w:rPr>
+      </w:pPr>
+      <w:r>
+        <w:rPr>
+          <w:rFonts w:hint="default"/>
+          <w:sz w:val="24"/>
+          <w:szCs w:val="24"/>
+          <w:lang w:val="en-IN"/>
+        </w:rPr>
+        <w:t>Interval estimate:</w:t>
+      </w:r>
+    </w:p>
+    <w:p>
+      <w:pPr>
+        <w:jc w:val="both"/>
+        <w:rPr>
+          <w:rFonts w:hint="default"/>
+          <w:sz w:val="24"/>
+          <w:szCs w:val="24"/>
+          <w:lang w:val="en-IN"/>
+        </w:rPr>
+      </w:pPr>
+    </w:p>
+    <w:p>
+      <w:pPr>
+        <w:jc w:val="both"/>
+        <w:rPr>
+          <w:rFonts w:hint="default"/>
+          <w:sz w:val="24"/>
+          <w:szCs w:val="24"/>
+          <w:lang w:val="en-IN"/>
+        </w:rPr>
+      </w:pPr>
+      <w:r>
+        <w:rPr>
+          <w:rFonts w:hint="default"/>
+          <w:sz w:val="24"/>
+          <w:szCs w:val="24"/>
+          <w:lang w:val="en-IN"/>
+        </w:rPr>
+        <w:t>&gt; Mean height lies between **155 and 165 cm**</w:t>
+      </w:r>
+    </w:p>
+    <w:p>
+      <w:pPr>
+        <w:jc w:val="both"/>
+        <w:rPr>
+          <w:rFonts w:hint="default"/>
+          <w:sz w:val="24"/>
+          <w:szCs w:val="24"/>
+          <w:lang w:val="en-IN"/>
+        </w:rPr>
+      </w:pPr>
+      <w:r>
+        <w:rPr>
+          <w:rFonts w:hint="default"/>
+          <w:sz w:val="24"/>
+          <w:szCs w:val="24"/>
+          <w:lang w:val="en-IN"/>
+        </w:rPr>
+        <w:t>&gt; with **95% confidence**</w:t>
+      </w:r>
+    </w:p>
+    <w:p>
+      <w:pPr>
+        <w:jc w:val="both"/>
+        <w:rPr>
+          <w:rFonts w:hint="default"/>
+          <w:sz w:val="24"/>
+          <w:szCs w:val="24"/>
+          <w:lang w:val="en-IN"/>
+        </w:rPr>
+      </w:pPr>
+    </w:p>
+    <w:p>
+      <w:pPr>
+        <w:jc w:val="both"/>
+        <w:rPr>
+          <w:rFonts w:hint="default"/>
+          <w:sz w:val="24"/>
+          <w:szCs w:val="24"/>
+          <w:lang w:val="en-IN"/>
+        </w:rPr>
+      </w:pPr>
+      <w:r>
+        <w:rPr>
+          <w:rFonts w:hint="default"/>
+          <w:sz w:val="24"/>
+          <w:szCs w:val="24"/>
+          <w:lang w:val="en-IN"/>
+        </w:rPr>
+        <w:t>This is called a **Confidence Interval (CI)**</w:t>
+      </w:r>
+    </w:p>
+    <w:p>
+      <w:pPr>
+        <w:jc w:val="both"/>
         <w:rPr>
           <w:rFonts w:hint="default"/>
           <w:lang w:val="en-IN"/>
@@ -10766,7 +12806,7 @@
     <w:lsdException w:qFormat="1" w:unhideWhenUsed="0" w:uiPriority="0" w:semiHidden="0" w:name="Title"/>
     <w:lsdException w:unhideWhenUsed="0" w:uiPriority="0" w:semiHidden="0" w:name="Closing"/>
     <w:lsdException w:unhideWhenUsed="0" w:uiPriority="0" w:semiHidden="0" w:name="Signature"/>
-    <w:lsdException w:unhideWhenUsed="0" w:uiPriority="0" w:name="Default Paragraph Font"/>
+    <w:lsdException w:qFormat="1" w:unhideWhenUsed="0" w:uiPriority="0" w:name="Default Paragraph Font"/>
     <w:lsdException w:unhideWhenUsed="0" w:uiPriority="0" w:semiHidden="0" w:name="Body Text"/>
     <w:lsdException w:unhideWhenUsed="0" w:uiPriority="0" w:semiHidden="0" w:name="Body Text Indent"/>
     <w:lsdException w:unhideWhenUsed="0" w:uiPriority="0" w:semiHidden="0" w:name="List Continue"/>
@@ -10797,14 +12837,14 @@
     <w:lsdException w:unhideWhenUsed="0" w:uiPriority="0" w:semiHidden="0" w:name="HTML Acronym"/>
     <w:lsdException w:unhideWhenUsed="0" w:uiPriority="0" w:semiHidden="0" w:name="HTML Address"/>
     <w:lsdException w:unhideWhenUsed="0" w:uiPriority="0" w:semiHidden="0" w:name="HTML Cite"/>
-    <w:lsdException w:unhideWhenUsed="0" w:uiPriority="0" w:semiHidden="0" w:name="HTML Code"/>
+    <w:lsdException w:qFormat="1" w:unhideWhenUsed="0" w:uiPriority="0" w:semiHidden="0" w:name="HTML Code"/>
     <w:lsdException w:unhideWhenUsed="0" w:uiPriority="0" w:semiHidden="0" w:name="HTML Definition"/>
     <w:lsdException w:unhideWhenUsed="0" w:uiPriority="0" w:semiHidden="0" w:name="HTML Keyboard"/>
     <w:lsdException w:unhideWhenUsed="0" w:uiPriority="0" w:semiHidden="0" w:name="HTML Preformatted"/>
     <w:lsdException w:unhideWhenUsed="0" w:uiPriority="0" w:semiHidden="0" w:name="HTML Sample"/>
     <w:lsdException w:unhideWhenUsed="0" w:uiPriority="0" w:semiHidden="0" w:name="HTML Typewriter"/>
     <w:lsdException w:unhideWhenUsed="0" w:uiPriority="0" w:semiHidden="0" w:name="HTML Variable"/>
-    <w:lsdException w:unhideWhenUsed="0" w:uiPriority="0" w:name="Normal Table"/>
+    <w:lsdException w:qFormat="1" w:unhideWhenUsed="0" w:uiPriority="0" w:name="Normal Table"/>
     <w:lsdException w:unhideWhenUsed="0" w:uiPriority="0" w:semiHidden="0" w:name="annotation subject"/>
     <w:lsdException w:unhideWhenUsed="0" w:uiPriority="0" w:semiHidden="0" w:name="Table Simple 1"/>
     <w:lsdException w:unhideWhenUsed="0" w:uiPriority="0" w:semiHidden="0" w:name="Table Simple 2"/>
@@ -11023,11 +13063,13 @@
   <w:style w:type="character" w:default="1" w:styleId="5">
     <w:name w:val="Default Paragraph Font"/>
     <w:semiHidden/>
+    <w:qFormat/>
     <w:uiPriority w:val="0"/>
   </w:style>
   <w:style w:type="table" w:default="1" w:styleId="6">
     <w:name w:val="Normal Table"/>
     <w:semiHidden/>
+    <w:qFormat/>
     <w:uiPriority w:val="0"/>
     <w:tblPr>
       <w:tblCellMar>
@@ -11051,6 +13093,7 @@
   <w:style w:type="character" w:styleId="8">
     <w:name w:val="HTML Code"/>
     <w:basedOn w:val="5"/>
+    <w:qFormat/>
     <w:uiPriority w:val="0"/>
     <w:rPr>
       <w:rFonts w:ascii="Courier New" w:hAnsi="Courier New" w:cs="Courier New"/>

</xml_diff>

<commit_message>
add bernoulli distribution and binomal distribution
</commit_message>
<xml_diff>
--- a/notes.docx
+++ b/notes.docx
@@ -2098,8 +2098,6 @@
       <w:r>
         <w:t>Moving averages</w:t>
       </w:r>
-      <w:bookmarkStart w:id="0" w:name="_GoBack"/>
-      <w:bookmarkEnd w:id="0"/>
     </w:p>
     <w:p>
       <w:pPr>
@@ -2178,6 +2176,8 @@
       <w:r>
         <w:t>Randomization</w:t>
       </w:r>
+      <w:bookmarkStart w:id="0" w:name="_GoBack"/>
+      <w:bookmarkEnd w:id="0"/>
     </w:p>
     <w:p>
       <w:pPr>
@@ -2228,19 +2228,1836 @@
     </w:p>
     <w:p>
       <w:pPr>
-        <w:pStyle w:val="11"/>
-        <w:keepNext w:val="0"/>
-        <w:keepLines w:val="0"/>
-        <w:widowControl/>
-        <w:suppressLineNumbers w:val="0"/>
-      </w:pPr>
-      <w:r>
-        <w:t>🎯</w:t>
-      </w:r>
-    </w:p>
-    <w:p>
-      <w:pPr>
-        <w:jc w:val="both"/>
+        <w:keepNext w:val="0"/>
+        <w:keepLines w:val="0"/>
+        <w:widowControl/>
+        <w:suppressLineNumbers w:val="0"/>
+        <w:rPr>
+          <w:highlight w:val="yellow"/>
+        </w:rPr>
+      </w:pPr>
+      <w:r>
+        <w:rPr>
+          <w:highlight w:val="yellow"/>
+        </w:rPr>
+        <w:pict>
+          <v:rect id="_x0000_i1119" o:spt="1" style="height:1.5pt;width:432pt;" fillcolor="#A0A0A0" filled="t" stroked="f" coordsize="21600,21600" o:hr="t" o:hrstd="t" o:hralign="center">
+            <v:path/>
+            <v:fill on="t" focussize="0,0"/>
+            <v:stroke on="f"/>
+            <v:imagedata o:title=""/>
+            <o:lock v:ext="edit"/>
+            <w10:wrap type="none"/>
+            <w10:anchorlock/>
+          </v:rect>
+        </w:pict>
+      </w:r>
+    </w:p>
+    <w:p>
+      <w:pPr>
+        <w:pStyle w:val="3"/>
+        <w:keepNext w:val="0"/>
+        <w:keepLines w:val="0"/>
+        <w:widowControl/>
+        <w:suppressLineNumbers w:val="0"/>
+        <w:rPr>
+          <w:highlight w:val="yellow"/>
+        </w:rPr>
+      </w:pPr>
+      <w:r>
+        <w:rPr>
+          <w:highlight w:val="yellow"/>
+        </w:rPr>
+        <w:t>📌 Inferential Statistics – Complete Topic List</w:t>
+      </w:r>
+    </w:p>
+    <w:p>
+      <w:pPr>
+        <w:pStyle w:val="4"/>
+        <w:keepNext w:val="0"/>
+        <w:keepLines w:val="0"/>
+        <w:widowControl/>
+        <w:suppressLineNumbers w:val="0"/>
+      </w:pPr>
+      <w:r>
+        <w:t>1️⃣ Population &amp; Sample</w:t>
+      </w:r>
+    </w:p>
+    <w:p>
+      <w:pPr>
+        <w:pStyle w:val="11"/>
+        <w:keepNext w:val="0"/>
+        <w:keepLines w:val="0"/>
+        <w:widowControl/>
+        <w:suppressLineNumbers w:val="0"/>
+        <w:ind w:left="720"/>
+      </w:pPr>
+      <w:r>
+        <w:t>Population</w:t>
+      </w:r>
+    </w:p>
+    <w:p>
+      <w:pPr>
+        <w:pStyle w:val="11"/>
+        <w:keepNext w:val="0"/>
+        <w:keepLines w:val="0"/>
+        <w:widowControl/>
+        <w:suppressLineNumbers w:val="0"/>
+        <w:ind w:left="720"/>
+      </w:pPr>
+      <w:r>
+        <w:t>Sample</w:t>
+      </w:r>
+    </w:p>
+    <w:p>
+      <w:pPr>
+        <w:pStyle w:val="11"/>
+        <w:keepNext w:val="0"/>
+        <w:keepLines w:val="0"/>
+        <w:widowControl/>
+        <w:suppressLineNumbers w:val="0"/>
+        <w:ind w:left="720"/>
+      </w:pPr>
+      <w:r>
+        <w:t>Census vs Sampling</w:t>
+      </w:r>
+    </w:p>
+    <w:p>
+      <w:pPr>
+        <w:pStyle w:val="11"/>
+        <w:keepNext w:val="0"/>
+        <w:keepLines w:val="0"/>
+        <w:widowControl/>
+        <w:suppressLineNumbers w:val="0"/>
+        <w:ind w:left="720"/>
+      </w:pPr>
+      <w:r>
+        <w:t>Sampling Error</w:t>
+      </w:r>
+    </w:p>
+    <w:p>
+      <w:pPr>
+        <w:pStyle w:val="11"/>
+        <w:keepNext w:val="0"/>
+        <w:keepLines w:val="0"/>
+        <w:widowControl/>
+        <w:suppressLineNumbers w:val="0"/>
+        <w:ind w:left="720"/>
+      </w:pPr>
+      <w:r>
+        <w:t>Parameter vs Statistic</w:t>
+      </w:r>
+    </w:p>
+    <w:p>
+      <w:pPr>
+        <w:keepNext w:val="0"/>
+        <w:keepLines w:val="0"/>
+        <w:widowControl/>
+        <w:suppressLineNumbers w:val="0"/>
+      </w:pPr>
+      <w:r>
+        <w:pict>
+          <v:rect id="_x0000_i1120" o:spt="1" style="height:1.5pt;width:432pt;" fillcolor="#A0A0A0" filled="t" stroked="f" coordsize="21600,21600" o:hr="t" o:hrstd="t" o:hralign="center">
+            <v:path/>
+            <v:fill on="t" focussize="0,0"/>
+            <v:stroke on="f"/>
+            <v:imagedata o:title=""/>
+            <o:lock v:ext="edit"/>
+            <w10:wrap type="none"/>
+            <w10:anchorlock/>
+          </v:rect>
+        </w:pict>
+      </w:r>
+    </w:p>
+    <w:p>
+      <w:pPr>
+        <w:pStyle w:val="4"/>
+        <w:keepNext w:val="0"/>
+        <w:keepLines w:val="0"/>
+        <w:widowControl/>
+        <w:suppressLineNumbers w:val="0"/>
+      </w:pPr>
+      <w:r>
+        <w:t>2️⃣ Sampling Techniques</w:t>
+      </w:r>
+    </w:p>
+    <w:p>
+      <w:pPr>
+        <w:pStyle w:val="11"/>
+        <w:keepNext w:val="0"/>
+        <w:keepLines w:val="0"/>
+        <w:widowControl/>
+        <w:suppressLineNumbers w:val="0"/>
+      </w:pPr>
+      <w:r>
+        <w:rPr>
+          <w:rStyle w:val="12"/>
+        </w:rPr>
+        <w:t>Probability Sampling</w:t>
+      </w:r>
+    </w:p>
+    <w:p>
+      <w:pPr>
+        <w:pStyle w:val="11"/>
+        <w:keepNext w:val="0"/>
+        <w:keepLines w:val="0"/>
+        <w:widowControl/>
+        <w:suppressLineNumbers w:val="0"/>
+        <w:ind w:left="720"/>
+      </w:pPr>
+      <w:r>
+        <w:t>Simple Random Sampling</w:t>
+      </w:r>
+    </w:p>
+    <w:p>
+      <w:pPr>
+        <w:pStyle w:val="11"/>
+        <w:keepNext w:val="0"/>
+        <w:keepLines w:val="0"/>
+        <w:widowControl/>
+        <w:suppressLineNumbers w:val="0"/>
+        <w:ind w:left="720"/>
+      </w:pPr>
+      <w:r>
+        <w:t>Stratified Sampling</w:t>
+      </w:r>
+    </w:p>
+    <w:p>
+      <w:pPr>
+        <w:pStyle w:val="11"/>
+        <w:keepNext w:val="0"/>
+        <w:keepLines w:val="0"/>
+        <w:widowControl/>
+        <w:suppressLineNumbers w:val="0"/>
+        <w:ind w:left="720"/>
+      </w:pPr>
+      <w:r>
+        <w:t>Systematic Sampling</w:t>
+      </w:r>
+    </w:p>
+    <w:p>
+      <w:pPr>
+        <w:pStyle w:val="11"/>
+        <w:keepNext w:val="0"/>
+        <w:keepLines w:val="0"/>
+        <w:widowControl/>
+        <w:suppressLineNumbers w:val="0"/>
+        <w:ind w:left="720"/>
+      </w:pPr>
+      <w:r>
+        <w:t>Cluster Sampling</w:t>
+      </w:r>
+    </w:p>
+    <w:p>
+      <w:pPr>
+        <w:pStyle w:val="11"/>
+        <w:keepNext w:val="0"/>
+        <w:keepLines w:val="0"/>
+        <w:widowControl/>
+        <w:suppressLineNumbers w:val="0"/>
+        <w:rPr>
+          <w:rFonts w:hint="default"/>
+          <w:lang w:val="en-IN"/>
+        </w:rPr>
+      </w:pPr>
+      <w:r>
+        <w:rPr>
+          <w:rStyle w:val="12"/>
+        </w:rPr>
+        <w:t>Non-Probability Samplin</w:t>
+      </w:r>
+      <w:r>
+        <w:rPr>
+          <w:rStyle w:val="12"/>
+          <w:rFonts w:hint="default"/>
+          <w:lang w:val="en-IN"/>
+        </w:rPr>
+        <w:t>g</w:t>
+      </w:r>
+    </w:p>
+    <w:p>
+      <w:pPr>
+        <w:pStyle w:val="11"/>
+        <w:keepNext w:val="0"/>
+        <w:keepLines w:val="0"/>
+        <w:widowControl/>
+        <w:suppressLineNumbers w:val="0"/>
+        <w:ind w:left="720"/>
+      </w:pPr>
+      <w:r>
+        <w:t>Convenience Sampling</w:t>
+      </w:r>
+    </w:p>
+    <w:p>
+      <w:pPr>
+        <w:pStyle w:val="11"/>
+        <w:keepNext w:val="0"/>
+        <w:keepLines w:val="0"/>
+        <w:widowControl/>
+        <w:suppressLineNumbers w:val="0"/>
+        <w:ind w:left="720"/>
+      </w:pPr>
+      <w:r>
+        <w:t>Judgment Sampling</w:t>
+      </w:r>
+    </w:p>
+    <w:p>
+      <w:pPr>
+        <w:pStyle w:val="11"/>
+        <w:keepNext w:val="0"/>
+        <w:keepLines w:val="0"/>
+        <w:widowControl/>
+        <w:suppressLineNumbers w:val="0"/>
+        <w:ind w:left="720"/>
+      </w:pPr>
+      <w:r>
+        <w:t>Quota Sampling</w:t>
+      </w:r>
+    </w:p>
+    <w:p>
+      <w:pPr>
+        <w:pStyle w:val="11"/>
+        <w:keepNext w:val="0"/>
+        <w:keepLines w:val="0"/>
+        <w:widowControl/>
+        <w:suppressLineNumbers w:val="0"/>
+        <w:ind w:left="720"/>
+      </w:pPr>
+      <w:r>
+        <w:t>Snowball Sampling</w:t>
+      </w:r>
+    </w:p>
+    <w:p>
+      <w:pPr>
+        <w:keepNext w:val="0"/>
+        <w:keepLines w:val="0"/>
+        <w:widowControl/>
+        <w:suppressLineNumbers w:val="0"/>
+      </w:pPr>
+      <w:r>
+        <w:pict>
+          <v:rect id="_x0000_i1121" o:spt="1" style="height:1.5pt;width:432pt;" fillcolor="#A0A0A0" filled="t" stroked="f" coordsize="21600,21600" o:hr="t" o:hrstd="t" o:hralign="center">
+            <v:path/>
+            <v:fill on="t" focussize="0,0"/>
+            <v:stroke on="f"/>
+            <v:imagedata o:title=""/>
+            <o:lock v:ext="edit"/>
+            <w10:wrap type="none"/>
+            <w10:anchorlock/>
+          </v:rect>
+        </w:pict>
+      </w:r>
+    </w:p>
+    <w:p>
+      <w:pPr>
+        <w:pStyle w:val="4"/>
+        <w:keepNext w:val="0"/>
+        <w:keepLines w:val="0"/>
+        <w:widowControl/>
+        <w:suppressLineNumbers w:val="0"/>
+      </w:pPr>
+      <w:r>
+        <w:t>3️⃣ Probability Concepts (Foundation)</w:t>
+      </w:r>
+    </w:p>
+    <w:p>
+      <w:pPr>
+        <w:pStyle w:val="11"/>
+        <w:keepNext w:val="0"/>
+        <w:keepLines w:val="0"/>
+        <w:widowControl/>
+        <w:suppressLineNumbers w:val="0"/>
+        <w:ind w:left="720"/>
+      </w:pPr>
+      <w:r>
+        <w:t>Random Variables</w:t>
+      </w:r>
+    </w:p>
+    <w:p>
+      <w:pPr>
+        <w:pStyle w:val="11"/>
+        <w:keepNext w:val="0"/>
+        <w:keepLines w:val="0"/>
+        <w:widowControl/>
+        <w:suppressLineNumbers w:val="0"/>
+        <w:ind w:left="720"/>
+      </w:pPr>
+      <w:r>
+        <w:t>Discrete Random Variables</w:t>
+      </w:r>
+    </w:p>
+    <w:p>
+      <w:pPr>
+        <w:pStyle w:val="11"/>
+        <w:keepNext w:val="0"/>
+        <w:keepLines w:val="0"/>
+        <w:widowControl/>
+        <w:suppressLineNumbers w:val="0"/>
+        <w:ind w:left="720"/>
+      </w:pPr>
+      <w:r>
+        <w:t>Continuous Random Variables</w:t>
+      </w:r>
+    </w:p>
+    <w:p>
+      <w:pPr>
+        <w:pStyle w:val="11"/>
+        <w:keepNext w:val="0"/>
+        <w:keepLines w:val="0"/>
+        <w:widowControl/>
+        <w:suppressLineNumbers w:val="0"/>
+        <w:ind w:left="720"/>
+      </w:pPr>
+      <w:r>
+        <w:t>Probability Distribution</w:t>
+      </w:r>
+    </w:p>
+    <w:p>
+      <w:pPr>
+        <w:pStyle w:val="11"/>
+        <w:keepNext w:val="0"/>
+        <w:keepLines w:val="0"/>
+        <w:widowControl/>
+        <w:suppressLineNumbers w:val="0"/>
+        <w:ind w:left="720"/>
+      </w:pPr>
+      <w:r>
+        <w:t>Probability Density Function (PDF)</w:t>
+      </w:r>
+    </w:p>
+    <w:p>
+      <w:pPr>
+        <w:pStyle w:val="11"/>
+        <w:keepNext w:val="0"/>
+        <w:keepLines w:val="0"/>
+        <w:widowControl/>
+        <w:suppressLineNumbers w:val="0"/>
+        <w:ind w:left="720"/>
+      </w:pPr>
+      <w:r>
+        <w:t>Cumulative Distribution Function (CDF)</w:t>
+      </w:r>
+    </w:p>
+    <w:p>
+      <w:pPr>
+        <w:keepNext w:val="0"/>
+        <w:keepLines w:val="0"/>
+        <w:widowControl/>
+        <w:suppressLineNumbers w:val="0"/>
+      </w:pPr>
+      <w:r>
+        <w:pict>
+          <v:rect id="_x0000_i1122" o:spt="1" style="height:1.5pt;width:432pt;" fillcolor="#A0A0A0" filled="t" stroked="f" coordsize="21600,21600" o:hr="t" o:hrstd="t" o:hralign="center">
+            <v:path/>
+            <v:fill on="t" focussize="0,0"/>
+            <v:stroke on="f"/>
+            <v:imagedata o:title=""/>
+            <o:lock v:ext="edit"/>
+            <w10:wrap type="none"/>
+            <w10:anchorlock/>
+          </v:rect>
+        </w:pict>
+      </w:r>
+    </w:p>
+    <w:p>
+      <w:pPr>
+        <w:pStyle w:val="4"/>
+        <w:keepNext w:val="0"/>
+        <w:keepLines w:val="0"/>
+        <w:widowControl/>
+        <w:suppressLineNumbers w:val="0"/>
+      </w:pPr>
+      <w:r>
+        <w:t>4️⃣ Probability Distributions (Very Important)</w:t>
+      </w:r>
+    </w:p>
+    <w:p>
+      <w:pPr>
+        <w:pStyle w:val="11"/>
+        <w:keepNext w:val="0"/>
+        <w:keepLines w:val="0"/>
+        <w:widowControl/>
+        <w:suppressLineNumbers w:val="0"/>
+      </w:pPr>
+      <w:r>
+        <w:rPr>
+          <w:rStyle w:val="12"/>
+        </w:rPr>
+        <w:t>Discrete Distributions</w:t>
+      </w:r>
+    </w:p>
+    <w:p>
+      <w:pPr>
+        <w:pStyle w:val="11"/>
+        <w:keepNext w:val="0"/>
+        <w:keepLines w:val="0"/>
+        <w:widowControl/>
+        <w:suppressLineNumbers w:val="0"/>
+        <w:ind w:left="720"/>
+      </w:pPr>
+      <w:r>
+        <w:t>Bernoulli Distribution</w:t>
+      </w:r>
+    </w:p>
+    <w:p>
+      <w:pPr>
+        <w:pStyle w:val="11"/>
+        <w:keepNext w:val="0"/>
+        <w:keepLines w:val="0"/>
+        <w:widowControl/>
+        <w:suppressLineNumbers w:val="0"/>
+        <w:ind w:left="720"/>
+      </w:pPr>
+      <w:r>
+        <w:t>Binomial Distribution</w:t>
+      </w:r>
+    </w:p>
+    <w:p>
+      <w:pPr>
+        <w:keepNext w:val="0"/>
+        <w:keepLines w:val="0"/>
+        <w:widowControl/>
+        <w:numPr>
+          <w:numId w:val="0"/>
+        </w:numPr>
+        <w:suppressLineNumbers w:val="0"/>
+        <w:spacing w:before="0" w:beforeAutospacing="1" w:after="0" w:afterAutospacing="1"/>
+        <w:ind w:left="1080" w:leftChars="0"/>
+      </w:pPr>
+    </w:p>
+    <w:p>
+      <w:pPr>
+        <w:pStyle w:val="11"/>
+        <w:keepNext w:val="0"/>
+        <w:keepLines w:val="0"/>
+        <w:widowControl/>
+        <w:suppressLineNumbers w:val="0"/>
+        <w:ind w:left="720"/>
+      </w:pPr>
+      <w:r>
+        <w:t>Poisson Distribution</w:t>
+      </w:r>
+    </w:p>
+    <w:p>
+      <w:pPr>
+        <w:pStyle w:val="11"/>
+        <w:keepNext w:val="0"/>
+        <w:keepLines w:val="0"/>
+        <w:widowControl/>
+        <w:suppressLineNumbers w:val="0"/>
+      </w:pPr>
+      <w:r>
+        <w:rPr>
+          <w:rStyle w:val="12"/>
+        </w:rPr>
+        <w:t>Continuous Distributions</w:t>
+      </w:r>
+    </w:p>
+    <w:p>
+      <w:pPr>
+        <w:pStyle w:val="11"/>
+        <w:keepNext w:val="0"/>
+        <w:keepLines w:val="0"/>
+        <w:widowControl/>
+        <w:suppressLineNumbers w:val="0"/>
+        <w:ind w:left="720"/>
+      </w:pPr>
+      <w:r>
+        <w:t>Normal Distribution</w:t>
+      </w:r>
+    </w:p>
+    <w:p>
+      <w:pPr>
+        <w:pStyle w:val="11"/>
+        <w:keepNext w:val="0"/>
+        <w:keepLines w:val="0"/>
+        <w:widowControl/>
+        <w:suppressLineNumbers w:val="0"/>
+        <w:ind w:left="720"/>
+      </w:pPr>
+      <w:r>
+        <w:t>Standard Normal Distribution (Z-distribution)</w:t>
+      </w:r>
+    </w:p>
+    <w:p>
+      <w:pPr>
+        <w:pStyle w:val="11"/>
+        <w:keepNext w:val="0"/>
+        <w:keepLines w:val="0"/>
+        <w:widowControl/>
+        <w:suppressLineNumbers w:val="0"/>
+        <w:ind w:left="720"/>
+      </w:pPr>
+      <w:r>
+        <w:t>Uniform Distribution</w:t>
+      </w:r>
+    </w:p>
+    <w:p>
+      <w:pPr>
+        <w:pStyle w:val="11"/>
+        <w:keepNext w:val="0"/>
+        <w:keepLines w:val="0"/>
+        <w:widowControl/>
+        <w:suppressLineNumbers w:val="0"/>
+        <w:ind w:left="720"/>
+      </w:pPr>
+      <w:r>
+        <w:t>Exponential Distribution</w:t>
+      </w:r>
+    </w:p>
+    <w:p>
+      <w:pPr>
+        <w:pStyle w:val="11"/>
+        <w:keepNext w:val="0"/>
+        <w:keepLines w:val="0"/>
+        <w:widowControl/>
+        <w:suppressLineNumbers w:val="0"/>
+        <w:ind w:left="720"/>
+      </w:pPr>
+      <w:r>
+        <w:t>t-Distribution</w:t>
+      </w:r>
+    </w:p>
+    <w:p>
+      <w:pPr>
+        <w:pStyle w:val="11"/>
+        <w:keepNext w:val="0"/>
+        <w:keepLines w:val="0"/>
+        <w:widowControl/>
+        <w:suppressLineNumbers w:val="0"/>
+        <w:ind w:left="720"/>
+      </w:pPr>
+      <w:r>
+        <w:t>Chi-Square Distribution</w:t>
+      </w:r>
+    </w:p>
+    <w:p>
+      <w:pPr>
+        <w:pStyle w:val="11"/>
+        <w:keepNext w:val="0"/>
+        <w:keepLines w:val="0"/>
+        <w:widowControl/>
+        <w:suppressLineNumbers w:val="0"/>
+        <w:ind w:left="720"/>
+      </w:pPr>
+      <w:r>
+        <w:t>F-Distribution</w:t>
+      </w:r>
+    </w:p>
+    <w:p>
+      <w:pPr>
+        <w:keepNext w:val="0"/>
+        <w:keepLines w:val="0"/>
+        <w:widowControl/>
+        <w:suppressLineNumbers w:val="0"/>
+      </w:pPr>
+      <w:r>
+        <w:pict>
+          <v:rect id="_x0000_i1123" o:spt="1" style="height:1.5pt;width:432pt;" fillcolor="#A0A0A0" filled="t" stroked="f" coordsize="21600,21600" o:hr="t" o:hrstd="t" o:hralign="center">
+            <v:path/>
+            <v:fill on="t" focussize="0,0"/>
+            <v:stroke on="f"/>
+            <v:imagedata o:title=""/>
+            <o:lock v:ext="edit"/>
+            <w10:wrap type="none"/>
+            <w10:anchorlock/>
+          </v:rect>
+        </w:pict>
+      </w:r>
+    </w:p>
+    <w:p>
+      <w:pPr>
+        <w:pStyle w:val="4"/>
+        <w:keepNext w:val="0"/>
+        <w:keepLines w:val="0"/>
+        <w:widowControl/>
+        <w:suppressLineNumbers w:val="0"/>
+      </w:pPr>
+      <w:r>
+        <w:t>5️⃣ Estimation Theory</w:t>
+      </w:r>
+    </w:p>
+    <w:p>
+      <w:pPr>
+        <w:pStyle w:val="11"/>
+        <w:keepNext w:val="0"/>
+        <w:keepLines w:val="0"/>
+        <w:widowControl/>
+        <w:suppressLineNumbers w:val="0"/>
+        <w:ind w:left="720"/>
+      </w:pPr>
+      <w:r>
+        <w:t>Point Estimation</w:t>
+      </w:r>
+    </w:p>
+    <w:p>
+      <w:pPr>
+        <w:pStyle w:val="11"/>
+        <w:keepNext w:val="0"/>
+        <w:keepLines w:val="0"/>
+        <w:widowControl/>
+        <w:suppressLineNumbers w:val="0"/>
+        <w:ind w:left="720"/>
+      </w:pPr>
+      <w:r>
+        <w:t>Interval Estimation</w:t>
+      </w:r>
+    </w:p>
+    <w:p>
+      <w:pPr>
+        <w:pStyle w:val="11"/>
+        <w:keepNext w:val="0"/>
+        <w:keepLines w:val="0"/>
+        <w:widowControl/>
+        <w:suppressLineNumbers w:val="0"/>
+        <w:ind w:left="720"/>
+      </w:pPr>
+      <w:r>
+        <w:t>Confidence Interval (CI)</w:t>
+      </w:r>
+    </w:p>
+    <w:p>
+      <w:pPr>
+        <w:pStyle w:val="11"/>
+        <w:keepNext w:val="0"/>
+        <w:keepLines w:val="0"/>
+        <w:widowControl/>
+        <w:suppressLineNumbers w:val="0"/>
+        <w:ind w:left="720"/>
+      </w:pPr>
+      <w:r>
+        <w:t>Confidence Level</w:t>
+      </w:r>
+    </w:p>
+    <w:p>
+      <w:pPr>
+        <w:pStyle w:val="11"/>
+        <w:keepNext w:val="0"/>
+        <w:keepLines w:val="0"/>
+        <w:widowControl/>
+        <w:suppressLineNumbers w:val="0"/>
+        <w:ind w:left="720"/>
+      </w:pPr>
+      <w:r>
+        <w:t>Margin of Error</w:t>
+      </w:r>
+    </w:p>
+    <w:p>
+      <w:pPr>
+        <w:pStyle w:val="11"/>
+        <w:keepNext w:val="0"/>
+        <w:keepLines w:val="0"/>
+        <w:widowControl/>
+        <w:suppressLineNumbers w:val="0"/>
+      </w:pPr>
+      <w:r>
+        <w:rPr>
+          <w:rStyle w:val="12"/>
+        </w:rPr>
+        <w:t>Confidence Intervals for</w:t>
+      </w:r>
+    </w:p>
+    <w:p>
+      <w:pPr>
+        <w:pStyle w:val="11"/>
+        <w:keepNext w:val="0"/>
+        <w:keepLines w:val="0"/>
+        <w:widowControl/>
+        <w:suppressLineNumbers w:val="0"/>
+        <w:ind w:left="720"/>
+      </w:pPr>
+      <w:r>
+        <w:t>Mean (σ known)</w:t>
+      </w:r>
+    </w:p>
+    <w:p>
+      <w:pPr>
+        <w:pStyle w:val="11"/>
+        <w:keepNext w:val="0"/>
+        <w:keepLines w:val="0"/>
+        <w:widowControl/>
+        <w:suppressLineNumbers w:val="0"/>
+        <w:ind w:left="720"/>
+      </w:pPr>
+      <w:r>
+        <w:t>Mean (σ unknown)</w:t>
+      </w:r>
+    </w:p>
+    <w:p>
+      <w:pPr>
+        <w:pStyle w:val="11"/>
+        <w:keepNext w:val="0"/>
+        <w:keepLines w:val="0"/>
+        <w:widowControl/>
+        <w:suppressLineNumbers w:val="0"/>
+        <w:ind w:left="720"/>
+      </w:pPr>
+      <w:r>
+        <w:t>Proportion</w:t>
+      </w:r>
+    </w:p>
+    <w:p>
+      <w:pPr>
+        <w:pStyle w:val="11"/>
+        <w:keepNext w:val="0"/>
+        <w:keepLines w:val="0"/>
+        <w:widowControl/>
+        <w:suppressLineNumbers w:val="0"/>
+        <w:ind w:left="720"/>
+      </w:pPr>
+      <w:r>
+        <w:t>Difference between means</w:t>
+      </w:r>
+    </w:p>
+    <w:p>
+      <w:pPr>
+        <w:keepNext w:val="0"/>
+        <w:keepLines w:val="0"/>
+        <w:widowControl/>
+        <w:suppressLineNumbers w:val="0"/>
+      </w:pPr>
+      <w:r>
+        <w:pict>
+          <v:rect id="_x0000_i1124" o:spt="1" style="height:1.5pt;width:432pt;" fillcolor="#A0A0A0" filled="t" stroked="f" coordsize="21600,21600" o:hr="t" o:hrstd="t" o:hralign="center">
+            <v:path/>
+            <v:fill on="t" focussize="0,0"/>
+            <v:stroke on="f"/>
+            <v:imagedata o:title=""/>
+            <o:lock v:ext="edit"/>
+            <w10:wrap type="none"/>
+            <w10:anchorlock/>
+          </v:rect>
+        </w:pict>
+      </w:r>
+    </w:p>
+    <w:p>
+      <w:pPr>
+        <w:pStyle w:val="4"/>
+        <w:keepNext w:val="0"/>
+        <w:keepLines w:val="0"/>
+        <w:widowControl/>
+        <w:suppressLineNumbers w:val="0"/>
+        <w:rPr>
+          <w:rFonts w:hint="default"/>
+          <w:lang w:val="en-IN"/>
+        </w:rPr>
+      </w:pPr>
+      <w:r>
+        <w:t>6️⃣ Hypothesis Testing (Core of Inferential Statistics</w:t>
+      </w:r>
+      <w:r>
+        <w:rPr>
+          <w:rFonts w:hint="default"/>
+          <w:lang w:val="en-IN"/>
+        </w:rPr>
+        <w:t>)</w:t>
+      </w:r>
+    </w:p>
+    <w:p>
+      <w:pPr>
+        <w:pStyle w:val="11"/>
+        <w:keepNext w:val="0"/>
+        <w:keepLines w:val="0"/>
+        <w:widowControl/>
+        <w:suppressLineNumbers w:val="0"/>
+        <w:ind w:left="720"/>
+      </w:pPr>
+      <w:r>
+        <w:t>Statistical Hypothesis</w:t>
+      </w:r>
+    </w:p>
+    <w:p>
+      <w:pPr>
+        <w:pStyle w:val="11"/>
+        <w:keepNext w:val="0"/>
+        <w:keepLines w:val="0"/>
+        <w:widowControl/>
+        <w:suppressLineNumbers w:val="0"/>
+        <w:ind w:left="720"/>
+      </w:pPr>
+      <w:r>
+        <w:t>Null Hypothesis (H₀)</w:t>
+      </w:r>
+    </w:p>
+    <w:p>
+      <w:pPr>
+        <w:pStyle w:val="11"/>
+        <w:keepNext w:val="0"/>
+        <w:keepLines w:val="0"/>
+        <w:widowControl/>
+        <w:suppressLineNumbers w:val="0"/>
+        <w:ind w:left="720"/>
+      </w:pPr>
+      <w:r>
+        <w:t>Alternative Hypothesis (H₁)</w:t>
+      </w:r>
+    </w:p>
+    <w:p>
+      <w:pPr>
+        <w:pStyle w:val="11"/>
+        <w:keepNext w:val="0"/>
+        <w:keepLines w:val="0"/>
+        <w:widowControl/>
+        <w:suppressLineNumbers w:val="0"/>
+        <w:ind w:left="720"/>
+      </w:pPr>
+      <w:r>
+        <w:t>One-tailed Test</w:t>
+      </w:r>
+    </w:p>
+    <w:p>
+      <w:pPr>
+        <w:pStyle w:val="11"/>
+        <w:keepNext w:val="0"/>
+        <w:keepLines w:val="0"/>
+        <w:widowControl/>
+        <w:suppressLineNumbers w:val="0"/>
+        <w:ind w:left="720"/>
+      </w:pPr>
+      <w:r>
+        <w:t>Two-tailed Test</w:t>
+      </w:r>
+    </w:p>
+    <w:p>
+      <w:pPr>
+        <w:pStyle w:val="11"/>
+        <w:keepNext w:val="0"/>
+        <w:keepLines w:val="0"/>
+        <w:widowControl/>
+        <w:suppressLineNumbers w:val="0"/>
+        <w:ind w:left="720"/>
+      </w:pPr>
+      <w:r>
+        <w:t>Level of Significance (α)</w:t>
+      </w:r>
+    </w:p>
+    <w:p>
+      <w:pPr>
+        <w:pStyle w:val="11"/>
+        <w:keepNext w:val="0"/>
+        <w:keepLines w:val="0"/>
+        <w:widowControl/>
+        <w:suppressLineNumbers w:val="0"/>
+        <w:ind w:left="720"/>
+      </w:pPr>
+      <w:r>
+        <w:t>Test Statistic</w:t>
+      </w:r>
+    </w:p>
+    <w:p>
+      <w:pPr>
+        <w:pStyle w:val="11"/>
+        <w:keepNext w:val="0"/>
+        <w:keepLines w:val="0"/>
+        <w:widowControl/>
+        <w:suppressLineNumbers w:val="0"/>
+        <w:ind w:left="720"/>
+      </w:pPr>
+      <w:r>
+        <w:t>Critical Value</w:t>
+      </w:r>
+    </w:p>
+    <w:p>
+      <w:pPr>
+        <w:pStyle w:val="11"/>
+        <w:keepNext w:val="0"/>
+        <w:keepLines w:val="0"/>
+        <w:widowControl/>
+        <w:suppressLineNumbers w:val="0"/>
+        <w:ind w:left="720"/>
+      </w:pPr>
+      <w:r>
+        <w:t>Rejection Region</w:t>
+      </w:r>
+    </w:p>
+    <w:p>
+      <w:pPr>
+        <w:keepNext w:val="0"/>
+        <w:keepLines w:val="0"/>
+        <w:widowControl/>
+        <w:suppressLineNumbers w:val="0"/>
+      </w:pPr>
+      <w:r>
+        <w:pict>
+          <v:rect id="_x0000_i1125" o:spt="1" style="height:1.5pt;width:432pt;" fillcolor="#A0A0A0" filled="t" stroked="f" coordsize="21600,21600" o:hr="t" o:hrstd="t" o:hralign="center">
+            <v:path/>
+            <v:fill on="t" focussize="0,0"/>
+            <v:stroke on="f"/>
+            <v:imagedata o:title=""/>
+            <o:lock v:ext="edit"/>
+            <w10:wrap type="none"/>
+            <w10:anchorlock/>
+          </v:rect>
+        </w:pict>
+      </w:r>
+    </w:p>
+    <w:p>
+      <w:pPr>
+        <w:pStyle w:val="4"/>
+        <w:keepNext w:val="0"/>
+        <w:keepLines w:val="0"/>
+        <w:widowControl/>
+        <w:suppressLineNumbers w:val="0"/>
+      </w:pPr>
+      <w:r>
+        <w:t>7️⃣ Errors in Hypothesis Testing</w:t>
+      </w:r>
+    </w:p>
+    <w:p>
+      <w:pPr>
+        <w:pStyle w:val="11"/>
+        <w:keepNext w:val="0"/>
+        <w:keepLines w:val="0"/>
+        <w:widowControl/>
+        <w:suppressLineNumbers w:val="0"/>
+        <w:ind w:left="720"/>
+      </w:pPr>
+      <w:r>
+        <w:t>Type I Error (α-error)</w:t>
+      </w:r>
+    </w:p>
+    <w:p>
+      <w:pPr>
+        <w:pStyle w:val="11"/>
+        <w:keepNext w:val="0"/>
+        <w:keepLines w:val="0"/>
+        <w:widowControl/>
+        <w:suppressLineNumbers w:val="0"/>
+        <w:ind w:left="720"/>
+      </w:pPr>
+      <w:r>
+        <w:t>Type II Error (β-error)</w:t>
+      </w:r>
+    </w:p>
+    <w:p>
+      <w:pPr>
+        <w:pStyle w:val="11"/>
+        <w:keepNext w:val="0"/>
+        <w:keepLines w:val="0"/>
+        <w:widowControl/>
+        <w:suppressLineNumbers w:val="0"/>
+        <w:ind w:left="720"/>
+      </w:pPr>
+      <w:r>
+        <w:t>Power of a Test</w:t>
+      </w:r>
+    </w:p>
+    <w:p>
+      <w:pPr>
+        <w:keepNext w:val="0"/>
+        <w:keepLines w:val="0"/>
+        <w:widowControl/>
+        <w:suppressLineNumbers w:val="0"/>
+      </w:pPr>
+      <w:r>
+        <w:pict>
+          <v:rect id="_x0000_i1126" o:spt="1" style="height:1.5pt;width:432pt;" fillcolor="#A0A0A0" filled="t" stroked="f" coordsize="21600,21600" o:hr="t" o:hrstd="t" o:hralign="center">
+            <v:path/>
+            <v:fill on="t" focussize="0,0"/>
+            <v:stroke on="f"/>
+            <v:imagedata o:title=""/>
+            <o:lock v:ext="edit"/>
+            <w10:wrap type="none"/>
+            <w10:anchorlock/>
+          </v:rect>
+        </w:pict>
+      </w:r>
+    </w:p>
+    <w:p>
+      <w:pPr>
+        <w:pStyle w:val="4"/>
+        <w:keepNext w:val="0"/>
+        <w:keepLines w:val="0"/>
+        <w:widowControl/>
+        <w:suppressLineNumbers w:val="0"/>
+      </w:pPr>
+      <w:r>
+        <w:t>8️⃣ Parametric Tests</w:t>
+      </w:r>
+    </w:p>
+    <w:p>
+      <w:pPr>
+        <w:pStyle w:val="11"/>
+        <w:keepNext w:val="0"/>
+        <w:keepLines w:val="0"/>
+        <w:widowControl/>
+        <w:suppressLineNumbers w:val="0"/>
+      </w:pPr>
+      <w:r>
+        <w:t>(Used when data follows normal distribution)</w:t>
+      </w:r>
+    </w:p>
+    <w:p>
+      <w:pPr>
+        <w:pStyle w:val="11"/>
+        <w:keepNext w:val="0"/>
+        <w:keepLines w:val="0"/>
+        <w:widowControl/>
+        <w:suppressLineNumbers w:val="0"/>
+        <w:ind w:left="720"/>
+      </w:pPr>
+      <w:r>
+        <w:t>Z-test</w:t>
+      </w:r>
+    </w:p>
+    <w:p>
+      <w:pPr>
+        <w:pStyle w:val="11"/>
+        <w:keepNext w:val="0"/>
+        <w:keepLines w:val="0"/>
+        <w:widowControl/>
+        <w:suppressLineNumbers w:val="0"/>
+        <w:ind w:left="1440"/>
+      </w:pPr>
+      <w:r>
+        <w:t>One sample Z-test</w:t>
+      </w:r>
+    </w:p>
+    <w:p>
+      <w:pPr>
+        <w:pStyle w:val="11"/>
+        <w:keepNext w:val="0"/>
+        <w:keepLines w:val="0"/>
+        <w:widowControl/>
+        <w:suppressLineNumbers w:val="0"/>
+        <w:ind w:left="1440"/>
+      </w:pPr>
+      <w:r>
+        <w:t>Two sample Z-test</w:t>
+      </w:r>
+    </w:p>
+    <w:p>
+      <w:pPr>
+        <w:pStyle w:val="11"/>
+        <w:keepNext w:val="0"/>
+        <w:keepLines w:val="0"/>
+        <w:widowControl/>
+        <w:suppressLineNumbers w:val="0"/>
+        <w:ind w:left="720"/>
+      </w:pPr>
+      <w:r>
+        <w:t>t-test</w:t>
+      </w:r>
+    </w:p>
+    <w:p>
+      <w:pPr>
+        <w:pStyle w:val="11"/>
+        <w:keepNext w:val="0"/>
+        <w:keepLines w:val="0"/>
+        <w:widowControl/>
+        <w:suppressLineNumbers w:val="0"/>
+        <w:ind w:left="1440"/>
+      </w:pPr>
+      <w:r>
+        <w:t>One sample t-test</w:t>
+      </w:r>
+    </w:p>
+    <w:p>
+      <w:pPr>
+        <w:pStyle w:val="11"/>
+        <w:keepNext w:val="0"/>
+        <w:keepLines w:val="0"/>
+        <w:widowControl/>
+        <w:suppressLineNumbers w:val="0"/>
+        <w:ind w:left="1440"/>
+      </w:pPr>
+      <w:r>
+        <w:t>Independent (Two sample) t-test</w:t>
+      </w:r>
+    </w:p>
+    <w:p>
+      <w:pPr>
+        <w:pStyle w:val="11"/>
+        <w:keepNext w:val="0"/>
+        <w:keepLines w:val="0"/>
+        <w:widowControl/>
+        <w:suppressLineNumbers w:val="0"/>
+        <w:ind w:left="1440"/>
+      </w:pPr>
+      <w:r>
+        <w:t>Paired t-test</w:t>
+      </w:r>
+    </w:p>
+    <w:p>
+      <w:pPr>
+        <w:pStyle w:val="11"/>
+        <w:keepNext w:val="0"/>
+        <w:keepLines w:val="0"/>
+        <w:widowControl/>
+        <w:suppressLineNumbers w:val="0"/>
+        <w:ind w:left="720"/>
+      </w:pPr>
+      <w:r>
+        <w:t>ANOVA (Analysis of Variance)</w:t>
+      </w:r>
+    </w:p>
+    <w:p>
+      <w:pPr>
+        <w:pStyle w:val="11"/>
+        <w:keepNext w:val="0"/>
+        <w:keepLines w:val="0"/>
+        <w:widowControl/>
+        <w:suppressLineNumbers w:val="0"/>
+        <w:ind w:left="1440"/>
+      </w:pPr>
+      <w:r>
+        <w:t>One-way ANOVA</w:t>
+      </w:r>
+    </w:p>
+    <w:p>
+      <w:pPr>
+        <w:pStyle w:val="11"/>
+        <w:keepNext w:val="0"/>
+        <w:keepLines w:val="0"/>
+        <w:widowControl/>
+        <w:suppressLineNumbers w:val="0"/>
+        <w:ind w:left="1440"/>
+      </w:pPr>
+      <w:r>
+        <w:t>Two-way ANOVA</w:t>
+      </w:r>
+    </w:p>
+    <w:p>
+      <w:pPr>
+        <w:keepNext w:val="0"/>
+        <w:keepLines w:val="0"/>
+        <w:widowControl/>
+        <w:suppressLineNumbers w:val="0"/>
+      </w:pPr>
+      <w:r>
+        <w:pict>
+          <v:rect id="_x0000_i1127" o:spt="1" style="height:1.5pt;width:432pt;" fillcolor="#A0A0A0" filled="t" stroked="f" coordsize="21600,21600" o:hr="t" o:hrstd="t" o:hralign="center">
+            <v:path/>
+            <v:fill on="t" focussize="0,0"/>
+            <v:stroke on="f"/>
+            <v:imagedata o:title=""/>
+            <o:lock v:ext="edit"/>
+            <w10:wrap type="none"/>
+            <w10:anchorlock/>
+          </v:rect>
+        </w:pict>
+      </w:r>
+    </w:p>
+    <w:p>
+      <w:pPr>
+        <w:pStyle w:val="4"/>
+        <w:keepNext w:val="0"/>
+        <w:keepLines w:val="0"/>
+        <w:widowControl/>
+        <w:suppressLineNumbers w:val="0"/>
+      </w:pPr>
+      <w:r>
+        <w:t>9️⃣ Non-Parametric Tests</w:t>
+      </w:r>
+    </w:p>
+    <w:p>
+      <w:pPr>
+        <w:pStyle w:val="11"/>
+        <w:keepNext w:val="0"/>
+        <w:keepLines w:val="0"/>
+        <w:widowControl/>
+        <w:suppressLineNumbers w:val="0"/>
+      </w:pPr>
+      <w:r>
+        <w:t>(Used when data does NOT follow normal distribution)</w:t>
+      </w:r>
+    </w:p>
+    <w:p>
+      <w:pPr>
+        <w:pStyle w:val="11"/>
+        <w:keepNext w:val="0"/>
+        <w:keepLines w:val="0"/>
+        <w:widowControl/>
+        <w:suppressLineNumbers w:val="0"/>
+        <w:ind w:left="720"/>
+      </w:pPr>
+      <w:r>
+        <w:t>Chi-Square Test</w:t>
+      </w:r>
+    </w:p>
+    <w:p>
+      <w:pPr>
+        <w:pStyle w:val="11"/>
+        <w:keepNext w:val="0"/>
+        <w:keepLines w:val="0"/>
+        <w:widowControl/>
+        <w:suppressLineNumbers w:val="0"/>
+        <w:ind w:left="1440"/>
+      </w:pPr>
+      <w:r>
+        <w:t>Test of Independence</w:t>
+      </w:r>
+    </w:p>
+    <w:p>
+      <w:pPr>
+        <w:pStyle w:val="11"/>
+        <w:keepNext w:val="0"/>
+        <w:keepLines w:val="0"/>
+        <w:widowControl/>
+        <w:suppressLineNumbers w:val="0"/>
+        <w:ind w:left="1440"/>
+      </w:pPr>
+      <w:r>
+        <w:t>Test of Goodness of Fit</w:t>
+      </w:r>
+    </w:p>
+    <w:p>
+      <w:pPr>
+        <w:pStyle w:val="11"/>
+        <w:keepNext w:val="0"/>
+        <w:keepLines w:val="0"/>
+        <w:widowControl/>
+        <w:suppressLineNumbers w:val="0"/>
+        <w:ind w:left="720"/>
+      </w:pPr>
+      <w:r>
+        <w:t>Mann-Whitney U Test</w:t>
+      </w:r>
+    </w:p>
+    <w:p>
+      <w:pPr>
+        <w:pStyle w:val="11"/>
+        <w:keepNext w:val="0"/>
+        <w:keepLines w:val="0"/>
+        <w:widowControl/>
+        <w:suppressLineNumbers w:val="0"/>
+        <w:ind w:left="720"/>
+      </w:pPr>
+      <w:r>
+        <w:t>Wilcoxon Signed-Rank Test</w:t>
+      </w:r>
+    </w:p>
+    <w:p>
+      <w:pPr>
+        <w:pStyle w:val="11"/>
+        <w:keepNext w:val="0"/>
+        <w:keepLines w:val="0"/>
+        <w:widowControl/>
+        <w:suppressLineNumbers w:val="0"/>
+        <w:ind w:left="720"/>
+      </w:pPr>
+      <w:r>
+        <w:t>Kruskal-Wallis Test</w:t>
+      </w:r>
+    </w:p>
+    <w:p>
+      <w:pPr>
+        <w:pStyle w:val="11"/>
+        <w:keepNext w:val="0"/>
+        <w:keepLines w:val="0"/>
+        <w:widowControl/>
+        <w:suppressLineNumbers w:val="0"/>
+        <w:ind w:left="720"/>
+      </w:pPr>
+      <w:r>
+        <w:t>Friedman Test</w:t>
+      </w:r>
+    </w:p>
+    <w:p>
+      <w:pPr>
+        <w:keepNext w:val="0"/>
+        <w:keepLines w:val="0"/>
+        <w:widowControl/>
+        <w:suppressLineNumbers w:val="0"/>
+      </w:pPr>
+      <w:r>
+        <w:pict>
+          <v:rect id="_x0000_i1128" o:spt="1" style="height:1.5pt;width:432pt;" fillcolor="#A0A0A0" filled="t" stroked="f" coordsize="21600,21600" o:hr="t" o:hrstd="t" o:hralign="center">
+            <v:path/>
+            <v:fill on="t" focussize="0,0"/>
+            <v:stroke on="f"/>
+            <v:imagedata o:title=""/>
+            <o:lock v:ext="edit"/>
+            <w10:wrap type="none"/>
+            <w10:anchorlock/>
+          </v:rect>
+        </w:pict>
+      </w:r>
+    </w:p>
+    <w:p>
+      <w:pPr>
+        <w:pStyle w:val="4"/>
+        <w:keepNext w:val="0"/>
+        <w:keepLines w:val="0"/>
+        <w:widowControl/>
+        <w:suppressLineNumbers w:val="0"/>
+      </w:pPr>
+      <w:r>
+        <w:t>🔟 Correlation &amp; Association</w:t>
+      </w:r>
+    </w:p>
+    <w:p>
+      <w:pPr>
+        <w:pStyle w:val="11"/>
+        <w:keepNext w:val="0"/>
+        <w:keepLines w:val="0"/>
+        <w:widowControl/>
+        <w:suppressLineNumbers w:val="0"/>
+        <w:ind w:left="720"/>
+      </w:pPr>
+      <w:r>
+        <w:t>Pearson Correlation Coefficient</w:t>
+      </w:r>
+    </w:p>
+    <w:p>
+      <w:pPr>
+        <w:pStyle w:val="11"/>
+        <w:keepNext w:val="0"/>
+        <w:keepLines w:val="0"/>
+        <w:widowControl/>
+        <w:suppressLineNumbers w:val="0"/>
+        <w:ind w:left="720"/>
+      </w:pPr>
+      <w:r>
+        <w:t>Spearman Rank Correlation</w:t>
+      </w:r>
+    </w:p>
+    <w:p>
+      <w:pPr>
+        <w:pStyle w:val="11"/>
+        <w:keepNext w:val="0"/>
+        <w:keepLines w:val="0"/>
+        <w:widowControl/>
+        <w:suppressLineNumbers w:val="0"/>
+        <w:ind w:left="720"/>
+      </w:pPr>
+      <w:r>
+        <w:t>Kendall’s Tau</w:t>
+      </w:r>
+    </w:p>
+    <w:p>
+      <w:pPr>
+        <w:pStyle w:val="11"/>
+        <w:keepNext w:val="0"/>
+        <w:keepLines w:val="0"/>
+        <w:widowControl/>
+        <w:suppressLineNumbers w:val="0"/>
+        <w:ind w:left="720"/>
+      </w:pPr>
+      <w:r>
+        <w:t>Interpretation of Correlation</w:t>
+      </w:r>
+    </w:p>
+    <w:p>
+      <w:pPr>
+        <w:pStyle w:val="11"/>
+        <w:keepNext w:val="0"/>
+        <w:keepLines w:val="0"/>
+        <w:widowControl/>
+        <w:suppressLineNumbers w:val="0"/>
+        <w:ind w:left="720"/>
+      </w:pPr>
+      <w:r>
+        <w:t>Hypothesis Testing for Correlation</w:t>
+      </w:r>
+    </w:p>
+    <w:p>
+      <w:pPr>
+        <w:keepNext w:val="0"/>
+        <w:keepLines w:val="0"/>
+        <w:widowControl/>
+        <w:suppressLineNumbers w:val="0"/>
+      </w:pPr>
+      <w:r>
+        <w:pict>
+          <v:rect id="_x0000_i1129" o:spt="1" style="height:1.5pt;width:432pt;" fillcolor="#A0A0A0" filled="t" stroked="f" coordsize="21600,21600" o:hr="t" o:hrstd="t" o:hralign="center">
+            <v:path/>
+            <v:fill on="t" focussize="0,0"/>
+            <v:stroke on="f"/>
+            <v:imagedata o:title=""/>
+            <o:lock v:ext="edit"/>
+            <w10:wrap type="none"/>
+            <w10:anchorlock/>
+          </v:rect>
+        </w:pict>
+      </w:r>
+    </w:p>
+    <w:p>
+      <w:pPr>
+        <w:pStyle w:val="4"/>
+        <w:keepNext w:val="0"/>
+        <w:keepLines w:val="0"/>
+        <w:widowControl/>
+        <w:suppressLineNumbers w:val="0"/>
+      </w:pPr>
+      <w:r>
+        <w:t>1️⃣1️⃣ Regression Analysis (Inferential Aspect)</w:t>
+      </w:r>
+    </w:p>
+    <w:p>
+      <w:pPr>
+        <w:pStyle w:val="11"/>
+        <w:keepNext w:val="0"/>
+        <w:keepLines w:val="0"/>
+        <w:widowControl/>
+        <w:suppressLineNumbers w:val="0"/>
+        <w:ind w:left="720"/>
+      </w:pPr>
+      <w:r>
+        <w:t>Simple Linear Regression</w:t>
+      </w:r>
+    </w:p>
+    <w:p>
+      <w:pPr>
+        <w:pStyle w:val="11"/>
+        <w:keepNext w:val="0"/>
+        <w:keepLines w:val="0"/>
+        <w:widowControl/>
+        <w:suppressLineNumbers w:val="0"/>
+        <w:ind w:left="720"/>
+      </w:pPr>
+      <w:r>
+        <w:t>Multiple Linear Regression</w:t>
+      </w:r>
+    </w:p>
+    <w:p>
+      <w:pPr>
+        <w:pStyle w:val="11"/>
+        <w:keepNext w:val="0"/>
+        <w:keepLines w:val="0"/>
+        <w:widowControl/>
+        <w:suppressLineNumbers w:val="0"/>
+        <w:ind w:left="720"/>
+      </w:pPr>
+      <w:r>
+        <w:t>Regression Coefficients</w:t>
+      </w:r>
+    </w:p>
+    <w:p>
+      <w:pPr>
+        <w:pStyle w:val="11"/>
+        <w:keepNext w:val="0"/>
+        <w:keepLines w:val="0"/>
+        <w:widowControl/>
+        <w:suppressLineNumbers w:val="0"/>
+        <w:ind w:left="720"/>
+      </w:pPr>
+      <w:r>
+        <w:t>Hypothesis Testing of Regression Coefficients</w:t>
+      </w:r>
+    </w:p>
+    <w:p>
+      <w:pPr>
+        <w:pStyle w:val="11"/>
+        <w:keepNext w:val="0"/>
+        <w:keepLines w:val="0"/>
+        <w:widowControl/>
+        <w:suppressLineNumbers w:val="0"/>
+        <w:ind w:left="720"/>
+      </w:pPr>
+      <w:r>
+        <w:t>R² (Coefficient of Determination)</w:t>
+      </w:r>
+    </w:p>
+    <w:p>
+      <w:pPr>
+        <w:pStyle w:val="11"/>
+        <w:keepNext w:val="0"/>
+        <w:keepLines w:val="0"/>
+        <w:widowControl/>
+        <w:suppressLineNumbers w:val="0"/>
+        <w:ind w:left="720"/>
+      </w:pPr>
+      <w:r>
+        <w:t>Adjusted R²</w:t>
+      </w:r>
+    </w:p>
+    <w:p>
+      <w:pPr>
+        <w:keepNext w:val="0"/>
+        <w:keepLines w:val="0"/>
+        <w:widowControl/>
+        <w:suppressLineNumbers w:val="0"/>
+      </w:pPr>
+      <w:r>
+        <w:pict>
+          <v:rect id="_x0000_i1130" o:spt="1" style="height:1.5pt;width:432pt;" fillcolor="#A0A0A0" filled="t" stroked="f" coordsize="21600,21600" o:hr="t" o:hrstd="t" o:hralign="center">
+            <v:path/>
+            <v:fill on="t" focussize="0,0"/>
+            <v:stroke on="f"/>
+            <v:imagedata o:title=""/>
+            <o:lock v:ext="edit"/>
+            <w10:wrap type="none"/>
+            <w10:anchorlock/>
+          </v:rect>
+        </w:pict>
+      </w:r>
+    </w:p>
+    <w:p>
+      <w:pPr>
+        <w:pStyle w:val="4"/>
+        <w:keepNext w:val="0"/>
+        <w:keepLines w:val="0"/>
+        <w:widowControl/>
+        <w:suppressLineNumbers w:val="0"/>
+      </w:pPr>
+      <w:r>
+        <w:t>1️⃣2️⃣ Goodness of Fit &amp; Model Testing</w:t>
+      </w:r>
+    </w:p>
+    <w:p>
+      <w:pPr>
+        <w:pStyle w:val="11"/>
+        <w:keepNext w:val="0"/>
+        <w:keepLines w:val="0"/>
+        <w:widowControl/>
+        <w:suppressLineNumbers w:val="0"/>
+        <w:ind w:left="720"/>
+      </w:pPr>
+      <w:r>
+        <w:t>Chi-Square Goodness of Fit</w:t>
+      </w:r>
+    </w:p>
+    <w:p>
+      <w:pPr>
+        <w:pStyle w:val="11"/>
+        <w:keepNext w:val="0"/>
+        <w:keepLines w:val="0"/>
+        <w:widowControl/>
+        <w:suppressLineNumbers w:val="0"/>
+        <w:ind w:left="720"/>
+      </w:pPr>
+      <w:r>
+        <w:t>Residual Analysis</w:t>
+      </w:r>
+    </w:p>
+    <w:p>
+      <w:pPr>
+        <w:pStyle w:val="11"/>
+        <w:keepNext w:val="0"/>
+        <w:keepLines w:val="0"/>
+        <w:widowControl/>
+        <w:suppressLineNumbers w:val="0"/>
+        <w:ind w:left="720"/>
+      </w:pPr>
+      <w:r>
+        <w:t>Model Assumptions Testing</w:t>
+      </w:r>
+    </w:p>
+    <w:p>
+      <w:pPr>
+        <w:keepNext w:val="0"/>
+        <w:keepLines w:val="0"/>
+        <w:widowControl/>
+        <w:suppressLineNumbers w:val="0"/>
+      </w:pPr>
+      <w:r>
+        <w:pict>
+          <v:rect id="_x0000_i1131" o:spt="1" style="height:1.5pt;width:432pt;" fillcolor="#A0A0A0" filled="t" stroked="f" coordsize="21600,21600" o:hr="t" o:hrstd="t" o:hralign="center">
+            <v:path/>
+            <v:fill on="t" focussize="0,0"/>
+            <v:stroke on="f"/>
+            <v:imagedata o:title=""/>
+            <o:lock v:ext="edit"/>
+            <w10:wrap type="none"/>
+            <w10:anchorlock/>
+          </v:rect>
+        </w:pict>
+      </w:r>
+    </w:p>
+    <w:p>
+      <w:pPr>
+        <w:pStyle w:val="4"/>
+        <w:keepNext w:val="0"/>
+        <w:keepLines w:val="0"/>
+        <w:widowControl/>
+        <w:suppressLineNumbers w:val="0"/>
+      </w:pPr>
+      <w:r>
+        <w:t>1️⃣3️⃣ Bayesian Inference (Advanced)</w:t>
+      </w:r>
+    </w:p>
+    <w:p>
+      <w:pPr>
+        <w:pStyle w:val="11"/>
+        <w:keepNext w:val="0"/>
+        <w:keepLines w:val="0"/>
+        <w:widowControl/>
+        <w:suppressLineNumbers w:val="0"/>
+        <w:ind w:left="720"/>
+      </w:pPr>
+      <w:r>
+        <w:t>Prior Probability</w:t>
+      </w:r>
+    </w:p>
+    <w:p>
+      <w:pPr>
+        <w:pStyle w:val="11"/>
+        <w:keepNext w:val="0"/>
+        <w:keepLines w:val="0"/>
+        <w:widowControl/>
+        <w:suppressLineNumbers w:val="0"/>
+        <w:ind w:left="720"/>
+      </w:pPr>
+      <w:r>
+        <w:t>Posterior Probability</w:t>
+      </w:r>
+    </w:p>
+    <w:p>
+      <w:pPr>
+        <w:pStyle w:val="11"/>
+        <w:keepNext w:val="0"/>
+        <w:keepLines w:val="0"/>
+        <w:widowControl/>
+        <w:suppressLineNumbers w:val="0"/>
+        <w:ind w:left="720"/>
+      </w:pPr>
+      <w:r>
+        <w:t>Likelihood</w:t>
+      </w:r>
+    </w:p>
+    <w:p>
+      <w:pPr>
+        <w:pStyle w:val="11"/>
+        <w:keepNext w:val="0"/>
+        <w:keepLines w:val="0"/>
+        <w:widowControl/>
+        <w:suppressLineNumbers w:val="0"/>
+        <w:ind w:left="720"/>
+      </w:pPr>
+      <w:r>
+        <w:t>Bayes’ Theorem</w:t>
+      </w:r>
+    </w:p>
+    <w:p>
+      <w:pPr>
+        <w:pStyle w:val="11"/>
+        <w:keepNext w:val="0"/>
+        <w:keepLines w:val="0"/>
+        <w:widowControl/>
+        <w:suppressLineNumbers w:val="0"/>
+        <w:ind w:left="720"/>
+      </w:pPr>
+      <w:r>
+        <w:t>Bayesian Estimation</w:t>
+      </w:r>
+    </w:p>
+    <w:p>
+      <w:pPr>
+        <w:keepNext w:val="0"/>
+        <w:keepLines w:val="0"/>
+        <w:widowControl/>
+        <w:suppressLineNumbers w:val="0"/>
+      </w:pPr>
+      <w:r>
+        <w:pict>
+          <v:rect id="_x0000_i1132" o:spt="1" style="height:1.5pt;width:432pt;" fillcolor="#A0A0A0" filled="t" stroked="f" coordsize="21600,21600" o:hr="t" o:hrstd="t" o:hralign="center">
+            <v:path/>
+            <v:fill on="t" focussize="0,0"/>
+            <v:stroke on="f"/>
+            <v:imagedata o:title=""/>
+            <o:lock v:ext="edit"/>
+            <w10:wrap type="none"/>
+            <w10:anchorlock/>
+          </v:rect>
+        </w:pict>
+      </w:r>
+    </w:p>
+    <w:p>
+      <w:pPr>
+        <w:pStyle w:val="4"/>
+        <w:keepNext w:val="0"/>
+        <w:keepLines w:val="0"/>
+        <w:widowControl/>
+        <w:suppressLineNumbers w:val="0"/>
+      </w:pPr>
+      <w:r>
+        <w:t>1️⃣4️⃣ Resampling Techniques</w:t>
+      </w:r>
+    </w:p>
+    <w:p>
+      <w:pPr>
+        <w:pStyle w:val="11"/>
+        <w:keepNext w:val="0"/>
+        <w:keepLines w:val="0"/>
+        <w:widowControl/>
+        <w:suppressLineNumbers w:val="0"/>
+        <w:ind w:left="720"/>
+      </w:pPr>
+      <w:r>
+        <w:t>Bootstrapping</w:t>
+      </w:r>
+    </w:p>
+    <w:p>
+      <w:pPr>
+        <w:pStyle w:val="11"/>
+        <w:keepNext w:val="0"/>
+        <w:keepLines w:val="0"/>
+        <w:widowControl/>
+        <w:suppressLineNumbers w:val="0"/>
+        <w:ind w:left="720"/>
+      </w:pPr>
+      <w:r>
+        <w:t>Permutation Tests</w:t>
+      </w:r>
+    </w:p>
+    <w:p>
+      <w:pPr>
+        <w:keepNext w:val="0"/>
+        <w:keepLines w:val="0"/>
+        <w:widowControl/>
+        <w:suppressLineNumbers w:val="0"/>
+      </w:pPr>
+      <w:r>
+        <w:pict>
+          <v:rect id="_x0000_i1133" o:spt="1" style="height:1.5pt;width:432pt;" fillcolor="#A0A0A0" filled="t" stroked="f" coordsize="21600,21600" o:hr="t" o:hrstd="t" o:hralign="center">
+            <v:path/>
+            <v:fill on="t" focussize="0,0"/>
+            <v:stroke on="f"/>
+            <v:imagedata o:title=""/>
+            <o:lock v:ext="edit"/>
+            <w10:wrap type="none"/>
+            <w10:anchorlock/>
+          </v:rect>
+        </w:pict>
+      </w:r>
+    </w:p>
+    <w:p>
+      <w:pPr>
+        <w:pStyle w:val="4"/>
+        <w:keepNext w:val="0"/>
+        <w:keepLines w:val="0"/>
+        <w:widowControl/>
+        <w:suppressLineNumbers w:val="0"/>
+      </w:pPr>
+      <w:r>
+        <w:t>1️⃣5️⃣ Decision Theory (Related Area)</w:t>
+      </w:r>
+    </w:p>
+    <w:p>
+      <w:pPr>
+        <w:pStyle w:val="11"/>
+        <w:keepNext w:val="0"/>
+        <w:keepLines w:val="0"/>
+        <w:widowControl/>
+        <w:suppressLineNumbers w:val="0"/>
+        <w:ind w:left="720"/>
+      </w:pPr>
+      <w:r>
+        <w:t>Statistical Decision Making</w:t>
+      </w:r>
+    </w:p>
+    <w:p>
+      <w:pPr>
+        <w:pStyle w:val="11"/>
+        <w:keepNext w:val="0"/>
+        <w:keepLines w:val="0"/>
+        <w:widowControl/>
+        <w:suppressLineNumbers w:val="0"/>
+        <w:ind w:left="720"/>
+      </w:pPr>
+      <w:r>
+        <w:t>Loss Function</w:t>
+      </w:r>
+    </w:p>
+    <w:p>
+      <w:pPr>
+        <w:pStyle w:val="11"/>
+        <w:keepNext w:val="0"/>
+        <w:keepLines w:val="0"/>
+        <w:widowControl/>
+        <w:suppressLineNumbers w:val="0"/>
+        <w:ind w:left="720"/>
         <w:rPr>
           <w:rFonts w:hint="default"/>
           <w:sz w:val="40"/>
@@ -2249,6 +4066,9 @@
           <w:lang w:val="en-IN"/>
         </w:rPr>
       </w:pPr>
+      <w:r>
+        <w:t>Risk Function</w:t>
+      </w:r>
     </w:p>
     <w:p>
       <w:pPr>
@@ -4112,7 +5932,7 @@
           <w:szCs w:val="28"/>
         </w:rPr>
         <w:pict>
-          <v:rect id="_x0000_i1078" o:spt="1" style="height:1.5pt;width:432pt;" fillcolor="#A0A0A0" filled="t" stroked="f" coordsize="21600,21600" o:hr="t" o:hrstd="t" o:hralign="center">
+          <v:rect id="_x0000_i1040" o:spt="1" style="height:1.5pt;width:432pt;" fillcolor="#A0A0A0" filled="t" stroked="f" coordsize="21600,21600" o:hr="t" o:hrstd="t" o:hralign="center">
             <v:path/>
             <v:fill on="t" focussize="0,0"/>
             <v:stroke on="f"/>
@@ -4372,7 +6192,7 @@
           <w:szCs w:val="28"/>
         </w:rPr>
         <w:pict>
-          <v:rect id="_x0000_i1079" o:spt="1" style="height:1.5pt;width:432pt;" fillcolor="#A0A0A0" filled="t" stroked="f" coordsize="21600,21600" o:hr="t" o:hrstd="t" o:hralign="center">
+          <v:rect id="_x0000_i1041" o:spt="1" style="height:1.5pt;width:432pt;" fillcolor="#A0A0A0" filled="t" stroked="f" coordsize="21600,21600" o:hr="t" o:hrstd="t" o:hralign="center">
             <v:path/>
             <v:fill on="t" focussize="0,0"/>
             <v:stroke on="f"/>
@@ -4623,7 +6443,7 @@
           <w:szCs w:val="28"/>
         </w:rPr>
         <w:pict>
-          <v:rect id="_x0000_i1080" o:spt="1" style="height:1.5pt;width:432pt;" fillcolor="#A0A0A0" filled="t" stroked="f" coordsize="21600,21600" o:hr="t" o:hrstd="t" o:hralign="center">
+          <v:rect id="_x0000_i1042" o:spt="1" style="height:1.5pt;width:432pt;" fillcolor="#A0A0A0" filled="t" stroked="f" coordsize="21600,21600" o:hr="t" o:hrstd="t" o:hralign="center">
             <v:path/>
             <v:fill on="t" focussize="0,0"/>
             <v:stroke on="f"/>
@@ -4960,7 +6780,7 @@
           <w:szCs w:val="28"/>
         </w:rPr>
         <w:pict>
-          <v:rect id="_x0000_i1086" o:spt="1" style="height:1.5pt;width:432pt;" fillcolor="#A0A0A0" filled="t" stroked="f" coordsize="21600,21600" o:hr="t" o:hrstd="t" o:hralign="center">
+          <v:rect id="_x0000_i1043" o:spt="1" style="height:1.5pt;width:432pt;" fillcolor="#A0A0A0" filled="t" stroked="f" coordsize="21600,21600" o:hr="t" o:hrstd="t" o:hralign="center">
             <v:path/>
             <v:fill on="t" focussize="0,0"/>
             <v:stroke on="f"/>
@@ -4991,7 +6811,7 @@
           <w:highlight w:val="magenta"/>
         </w:rPr>
         <w:pict>
-          <v:rect id="_x0000_i1090" o:spt="1" style="height:1.5pt;width:432pt;" fillcolor="#A0A0A0" filled="t" stroked="f" coordsize="21600,21600" o:hr="t" o:hrstd="t" o:hralign="center">
+          <v:rect id="_x0000_i1044" o:spt="1" style="height:1.5pt;width:432pt;" fillcolor="#A0A0A0" filled="t" stroked="f" coordsize="21600,21600" o:hr="t" o:hrstd="t" o:hralign="center">
             <v:path/>
             <v:fill on="t" focussize="0,0"/>
             <v:stroke on="f"/>
@@ -5232,7 +7052,7 @@
           <w:szCs w:val="28"/>
         </w:rPr>
         <w:pict>
-          <v:rect id="_x0000_i1087" o:spt="1" style="height:1.5pt;width:432pt;" fillcolor="#A0A0A0" filled="t" stroked="f" coordsize="21600,21600" o:hr="t" o:hrstd="t" o:hralign="center">
+          <v:rect id="_x0000_i1045" o:spt="1" style="height:1.5pt;width:432pt;" fillcolor="#A0A0A0" filled="t" stroked="f" coordsize="21600,21600" o:hr="t" o:hrstd="t" o:hralign="center">
             <v:path/>
             <v:fill on="t" focussize="0,0"/>
             <v:stroke on="f"/>
@@ -5469,7 +7289,7 @@
           <w:szCs w:val="28"/>
         </w:rPr>
         <w:pict>
-          <v:rect id="_x0000_i1088" o:spt="1" style="height:1.5pt;width:432pt;" fillcolor="#A0A0A0" filled="t" stroked="f" coordsize="21600,21600" o:hr="t" o:hrstd="t" o:hralign="center">
+          <v:rect id="_x0000_i1046" o:spt="1" style="height:1.5pt;width:432pt;" fillcolor="#A0A0A0" filled="t" stroked="f" coordsize="21600,21600" o:hr="t" o:hrstd="t" o:hralign="center">
             <v:path/>
             <v:fill on="t" focussize="0,0"/>
             <v:stroke on="f"/>
@@ -5500,7 +7320,7 @@
           <w:highlight w:val="magenta"/>
         </w:rPr>
         <w:pict>
-          <v:rect id="_x0000_i1091" o:spt="1" style="height:1.5pt;width:432pt;" fillcolor="#A0A0A0" filled="t" stroked="f" coordsize="21600,21600" o:hr="t" o:hrstd="t" o:hralign="center">
+          <v:rect id="_x0000_i1047" o:spt="1" style="height:1.5pt;width:432pt;" fillcolor="#A0A0A0" filled="t" stroked="f" coordsize="21600,21600" o:hr="t" o:hrstd="t" o:hralign="center">
             <v:path/>
             <v:fill on="t" focussize="0,0"/>
             <v:stroke on="f"/>
@@ -5744,7 +7564,7 @@
       </w:pPr>
       <w:r>
         <w:pict>
-          <v:rect id="_x0000_i1092" o:spt="1" style="height:1.5pt;width:432pt;" fillcolor="#A0A0A0" filled="t" stroked="f" coordsize="21600,21600" o:hr="t" o:hrstd="t" o:hralign="center">
+          <v:rect id="_x0000_i1048" o:spt="1" style="height:1.5pt;width:432pt;" fillcolor="#A0A0A0" filled="t" stroked="f" coordsize="21600,21600" o:hr="t" o:hrstd="t" o:hralign="center">
             <v:path/>
             <v:fill on="t" focussize="0,0"/>
             <v:stroke on="f"/>
@@ -5918,7 +7738,7 @@
       </w:pPr>
       <w:r>
         <w:pict>
-          <v:rect id="_x0000_i1093" o:spt="1" style="height:1.5pt;width:432pt;" fillcolor="#A0A0A0" filled="t" stroked="f" coordsize="21600,21600" o:hr="t" o:hrstd="t" o:hralign="center">
+          <v:rect id="_x0000_i1049" o:spt="1" style="height:1.5pt;width:432pt;" fillcolor="#A0A0A0" filled="t" stroked="f" coordsize="21600,21600" o:hr="t" o:hrstd="t" o:hralign="center">
             <v:path/>
             <v:fill on="t" focussize="0,0"/>
             <v:stroke on="f"/>
@@ -6092,7 +7912,7 @@
       </w:pPr>
       <w:r>
         <w:pict>
-          <v:rect id="_x0000_i1094" o:spt="1" style="height:1.5pt;width:432pt;" fillcolor="#A0A0A0" filled="t" stroked="f" coordsize="21600,21600" o:hr="t" o:hrstd="t" o:hralign="center">
+          <v:rect id="_x0000_i1050" o:spt="1" style="height:1.5pt;width:432pt;" fillcolor="#A0A0A0" filled="t" stroked="f" coordsize="21600,21600" o:hr="t" o:hrstd="t" o:hralign="center">
             <v:path/>
             <v:fill on="t" focussize="0,0"/>
             <v:stroke on="f"/>
@@ -6242,7 +8062,7 @@
       </w:pPr>
       <w:r>
         <w:pict>
-          <v:rect id="_x0000_i1095" o:spt="1" style="height:1.5pt;width:432pt;" fillcolor="#A0A0A0" filled="t" stroked="f" coordsize="21600,21600" o:hr="t" o:hrstd="t" o:hralign="center">
+          <v:rect id="_x0000_i1051" o:spt="1" style="height:1.5pt;width:432pt;" fillcolor="#A0A0A0" filled="t" stroked="f" coordsize="21600,21600" o:hr="t" o:hrstd="t" o:hralign="center">
             <v:path/>
             <v:fill on="t" focussize="0,0"/>
             <v:stroke on="f"/>
@@ -6568,6 +8388,7 @@
         <w:keepLines w:val="0"/>
         <w:widowControl/>
         <w:numPr>
+          <w:ilvl w:val="0"/>
           <w:numId w:val="0"/>
         </w:numPr>
         <w:suppressLineNumbers w:val="0"/>
@@ -6835,7 +8656,7 @@
       </w:pPr>
       <w:r>
         <w:pict>
-          <v:rect id="_x0000_i1040" o:spt="1" style="height:1.5pt;width:432pt;" fillcolor="#A0A0A0" filled="t" stroked="f" coordsize="21600,21600" o:hr="t" o:hrstd="t" o:hralign="center">
+          <v:rect id="_x0000_i1052" o:spt="1" style="height:1.5pt;width:432pt;" fillcolor="#A0A0A0" filled="t" stroked="f" coordsize="21600,21600" o:hr="t" o:hrstd="t" o:hralign="center">
             <v:path/>
             <v:fill on="t" focussize="0,0"/>
             <v:stroke on="f"/>
@@ -6856,7 +8677,7 @@
       </w:pPr>
       <w:r>
         <w:pict>
-          <v:rect id="_x0000_i1041" o:spt="1" style="height:1.5pt;width:432pt;" fillcolor="#A0A0A0" filled="t" stroked="f" coordsize="21600,21600" o:hr="t" o:hrstd="t" o:hralign="center">
+          <v:rect id="_x0000_i1053" o:spt="1" style="height:1.5pt;width:432pt;" fillcolor="#A0A0A0" filled="t" stroked="f" coordsize="21600,21600" o:hr="t" o:hrstd="t" o:hralign="center">
             <v:path/>
             <v:fill on="t" focussize="0,0"/>
             <v:stroke on="f"/>
@@ -7002,7 +8823,7 @@
       </w:pPr>
       <w:r>
         <w:pict>
-          <v:rect id="_x0000_i1042" o:spt="1" style="height:1.5pt;width:432pt;" fillcolor="#A0A0A0" filled="t" stroked="f" coordsize="21600,21600" o:hr="t" o:hrstd="t" o:hralign="center">
+          <v:rect id="_x0000_i1054" o:spt="1" style="height:1.5pt;width:432pt;" fillcolor="#A0A0A0" filled="t" stroked="f" coordsize="21600,21600" o:hr="t" o:hrstd="t" o:hralign="center">
             <v:path/>
             <v:fill on="t" focussize="0,0"/>
             <v:stroke on="f"/>
@@ -7122,7 +8943,7 @@
       </w:pPr>
       <w:r>
         <w:pict>
-          <v:rect id="_x0000_i1043" o:spt="1" style="height:1.5pt;width:432pt;" fillcolor="#A0A0A0" filled="t" stroked="f" coordsize="21600,21600" o:hr="t" o:hrstd="t" o:hralign="center">
+          <v:rect id="_x0000_i1055" o:spt="1" style="height:1.5pt;width:432pt;" fillcolor="#A0A0A0" filled="t" stroked="f" coordsize="21600,21600" o:hr="t" o:hrstd="t" o:hralign="center">
             <v:path/>
             <v:fill on="t" focussize="0,0"/>
             <v:stroke on="f"/>
@@ -7328,7 +9149,7 @@
       </w:pPr>
       <w:r>
         <w:pict>
-          <v:rect id="_x0000_i1044" o:spt="1" style="height:1.5pt;width:432pt;" fillcolor="#A0A0A0" filled="t" stroked="f" coordsize="21600,21600" o:hr="t" o:hrstd="t" o:hralign="center">
+          <v:rect id="_x0000_i1056" o:spt="1" style="height:1.5pt;width:432pt;" fillcolor="#A0A0A0" filled="t" stroked="f" coordsize="21600,21600" o:hr="t" o:hrstd="t" o:hralign="center">
             <v:path/>
             <v:fill on="t" focussize="0,0"/>
             <v:stroke on="f"/>
@@ -8120,7 +9941,7 @@
       </w:pPr>
       <w:r>
         <w:pict>
-          <v:rect id="_x0000_i1045" o:spt="1" style="height:1.5pt;width:432pt;" fillcolor="#A0A0A0" filled="t" stroked="f" coordsize="21600,21600" o:hr="t" o:hrstd="t" o:hralign="center">
+          <v:rect id="_x0000_i1057" o:spt="1" style="height:1.5pt;width:432pt;" fillcolor="#A0A0A0" filled="t" stroked="f" coordsize="21600,21600" o:hr="t" o:hrstd="t" o:hralign="center">
             <v:path/>
             <v:fill on="t" focussize="0,0"/>
             <v:stroke on="f"/>
@@ -8244,7 +10065,6 @@
             <w:insideH w:val="none" w:color="auto" w:sz="0" w:space="0"/>
             <w:insideV w:val="none" w:color="auto" w:sz="0" w:space="0"/>
           </w:tblBorders>
-          <w:shd w:val="clear" w:color="auto" w:fill="auto"/>
           <w:tblCellMar>
             <w:top w:w="15" w:type="dxa"/>
             <w:left w:w="15" w:type="dxa"/>
@@ -8515,7 +10335,7 @@
       </w:pPr>
       <w:r>
         <w:pict>
-          <v:rect id="_x0000_i1046" o:spt="1" style="height:1.5pt;width:432pt;" fillcolor="#A0A0A0" filled="t" stroked="f" coordsize="21600,21600" o:hr="t" o:hrstd="t" o:hralign="center">
+          <v:rect id="_x0000_i1058" o:spt="1" style="height:1.5pt;width:432pt;" fillcolor="#A0A0A0" filled="t" stroked="f" coordsize="21600,21600" o:hr="t" o:hrstd="t" o:hralign="center">
             <v:path/>
             <v:fill on="t" focussize="0,0"/>
             <v:stroke on="f"/>
@@ -8676,7 +10496,7 @@
       </w:pPr>
       <w:r>
         <w:pict>
-          <v:rect id="_x0000_i1047" o:spt="1" style="height:1.5pt;width:432pt;" fillcolor="#A0A0A0" filled="t" stroked="f" coordsize="21600,21600" o:hr="t" o:hrstd="t" o:hralign="center">
+          <v:rect id="_x0000_i1059" o:spt="1" style="height:1.5pt;width:432pt;" fillcolor="#A0A0A0" filled="t" stroked="f" coordsize="21600,21600" o:hr="t" o:hrstd="t" o:hralign="center">
             <v:path/>
             <v:fill on="t" focussize="0,0"/>
             <v:stroke on="f"/>
@@ -8985,6 +10805,7 @@
             <w:insideH w:val="none" w:color="auto" w:sz="0" w:space="0"/>
             <w:insideV w:val="none" w:color="auto" w:sz="0" w:space="0"/>
           </w:tblBorders>
+          <w:shd w:val="clear" w:color="auto" w:fill="auto"/>
           <w:tblCellMar>
             <w:top w:w="15" w:type="dxa"/>
             <w:left w:w="15" w:type="dxa"/>
@@ -9248,7 +11069,7 @@
           <w:highlight w:val="red"/>
         </w:rPr>
         <w:pict>
-          <v:rect id="_x0000_i1048" o:spt="1" style="height:1.5pt;width:432pt;" fillcolor="#A0A0A0" filled="t" stroked="f" coordsize="21600,21600" o:hr="t" o:hrstd="t" o:hralign="center">
+          <v:rect id="_x0000_i1060" o:spt="1" style="height:1.5pt;width:432pt;" fillcolor="#A0A0A0" filled="t" stroked="f" coordsize="21600,21600" o:hr="t" o:hrstd="t" o:hralign="center">
             <v:path/>
             <v:fill on="t" focussize="0,0"/>
             <v:stroke on="f"/>
@@ -9375,7 +11196,7 @@
       </w:pPr>
       <w:r>
         <w:pict>
-          <v:rect id="_x0000_i1049" o:spt="1" style="height:1.5pt;width:432pt;" fillcolor="#A0A0A0" filled="t" stroked="f" coordsize="21600,21600" o:hr="t" o:hrstd="t" o:hralign="center">
+          <v:rect id="_x0000_i1061" o:spt="1" style="height:1.5pt;width:432pt;" fillcolor="#A0A0A0" filled="t" stroked="f" coordsize="21600,21600" o:hr="t" o:hrstd="t" o:hralign="center">
             <v:path/>
             <v:fill on="t" focussize="0,0"/>
             <v:stroke on="f"/>
@@ -9465,7 +11286,7 @@
       </w:pPr>
       <w:r>
         <w:pict>
-          <v:rect id="_x0000_i1050" o:spt="1" style="height:1.5pt;width:432pt;" fillcolor="#A0A0A0" filled="t" stroked="f" coordsize="21600,21600" o:hr="t" o:hrstd="t" o:hralign="center">
+          <v:rect id="_x0000_i1062" o:spt="1" style="height:1.5pt;width:432pt;" fillcolor="#A0A0A0" filled="t" stroked="f" coordsize="21600,21600" o:hr="t" o:hrstd="t" o:hralign="center">
             <v:path/>
             <v:fill on="t" focussize="0,0"/>
             <v:stroke on="f"/>
@@ -9588,7 +11409,7 @@
       </w:pPr>
       <w:r>
         <w:pict>
-          <v:rect id="_x0000_i1051" o:spt="1" style="height:1.5pt;width:432pt;" fillcolor="#A0A0A0" filled="t" stroked="f" coordsize="21600,21600" o:hr="t" o:hrstd="t" o:hralign="center">
+          <v:rect id="_x0000_i1063" o:spt="1" style="height:1.5pt;width:432pt;" fillcolor="#A0A0A0" filled="t" stroked="f" coordsize="21600,21600" o:hr="t" o:hrstd="t" o:hralign="center">
             <v:path/>
             <v:fill on="t" focussize="0,0"/>
             <v:stroke on="f"/>
@@ -9702,7 +11523,7 @@
       </w:pPr>
       <w:r>
         <w:pict>
-          <v:rect id="_x0000_i1052" o:spt="1" style="height:1.5pt;width:432pt;" fillcolor="#A0A0A0" filled="t" stroked="f" coordsize="21600,21600" o:hr="t" o:hrstd="t" o:hralign="center">
+          <v:rect id="_x0000_i1064" o:spt="1" style="height:1.5pt;width:432pt;" fillcolor="#A0A0A0" filled="t" stroked="f" coordsize="21600,21600" o:hr="t" o:hrstd="t" o:hralign="center">
             <v:path/>
             <v:fill on="t" focussize="0,0"/>
             <v:stroke on="f"/>
@@ -9927,7 +11748,7 @@
       </w:pPr>
       <w:r>
         <w:pict>
-          <v:rect id="_x0000_i1053" o:spt="1" style="height:1.5pt;width:432pt;" fillcolor="#A0A0A0" filled="t" stroked="f" coordsize="21600,21600" o:hr="t" o:hrstd="t" o:hralign="center">
+          <v:rect id="_x0000_i1065" o:spt="1" style="height:1.5pt;width:432pt;" fillcolor="#A0A0A0" filled="t" stroked="f" coordsize="21600,21600" o:hr="t" o:hrstd="t" o:hralign="center">
             <v:path/>
             <v:fill on="t" focussize="0,0"/>
             <v:stroke on="f"/>
@@ -10027,7 +11848,7 @@
       </w:pPr>
       <w:r>
         <w:pict>
-          <v:rect id="_x0000_i1054" o:spt="1" style="height:1.5pt;width:432pt;" fillcolor="#A0A0A0" filled="t" stroked="f" coordsize="21600,21600" o:hr="t" o:hrstd="t" o:hralign="center">
+          <v:rect id="_x0000_i1066" o:spt="1" style="height:1.5pt;width:432pt;" fillcolor="#A0A0A0" filled="t" stroked="f" coordsize="21600,21600" o:hr="t" o:hrstd="t" o:hralign="center">
             <v:path/>
             <v:fill on="t" focussize="0,0"/>
             <v:stroke on="f"/>
@@ -10138,7 +11959,7 @@
           <w:highlight w:val="red"/>
         </w:rPr>
         <w:pict>
-          <v:rect id="_x0000_i1055" o:spt="1" style="height:1.5pt;width:432pt;" fillcolor="#A0A0A0" filled="t" stroked="f" coordsize="21600,21600" o:hr="t" o:hrstd="t" o:hralign="center">
+          <v:rect id="_x0000_i1067" o:spt="1" style="height:1.5pt;width:432pt;" fillcolor="#A0A0A0" filled="t" stroked="f" coordsize="21600,21600" o:hr="t" o:hrstd="t" o:hralign="center">
             <v:path/>
             <v:fill on="t" focussize="0,0"/>
             <v:stroke on="f"/>
@@ -10610,7 +12431,7 @@
       </w:pPr>
       <w:r>
         <w:pict>
-          <v:rect id="_x0000_i1056" o:spt="1" style="height:1.5pt;width:432pt;" fillcolor="#A0A0A0" filled="t" stroked="f" coordsize="21600,21600" o:hr="t" o:hrstd="t" o:hralign="center">
+          <v:rect id="_x0000_i1068" o:spt="1" style="height:1.5pt;width:432pt;" fillcolor="#A0A0A0" filled="t" stroked="f" coordsize="21600,21600" o:hr="t" o:hrstd="t" o:hralign="center">
             <v:path/>
             <v:fill on="t" focussize="0,0"/>
             <v:stroke on="f"/>
@@ -10772,6 +12593,7 @@
             <w:insideH w:val="none" w:color="auto" w:sz="0" w:space="0"/>
             <w:insideV w:val="none" w:color="auto" w:sz="0" w:space="0"/>
           </w:tblBorders>
+          <w:shd w:val="clear" w:color="auto" w:fill="auto"/>
           <w:tblCellMar>
             <w:top w:w="15" w:type="dxa"/>
             <w:left w:w="15" w:type="dxa"/>
@@ -11004,6 +12826,7 @@
             <w:insideH w:val="none" w:color="auto" w:sz="0" w:space="0"/>
             <w:insideV w:val="none" w:color="auto" w:sz="0" w:space="0"/>
           </w:tblBorders>
+          <w:shd w:val="clear" w:color="auto" w:fill="auto"/>
           <w:tblCellMar>
             <w:top w:w="15" w:type="dxa"/>
             <w:left w:w="15" w:type="dxa"/>
@@ -11094,7 +12917,7 @@
       </w:pPr>
       <w:r>
         <w:pict>
-          <v:rect id="_x0000_i1057" o:spt="1" style="height:1.5pt;width:432pt;" fillcolor="#A0A0A0" filled="t" stroked="f" coordsize="21600,21600" o:hr="t" o:hrstd="t" o:hralign="center">
+          <v:rect id="_x0000_i1069" o:spt="1" style="height:1.5pt;width:432pt;" fillcolor="#A0A0A0" filled="t" stroked="f" coordsize="21600,21600" o:hr="t" o:hrstd="t" o:hralign="center">
             <v:path/>
             <v:fill on="t" focussize="0,0"/>
             <v:stroke on="f"/>
@@ -11186,7 +13009,7 @@
       </w:pPr>
       <w:r>
         <w:pict>
-          <v:rect id="_x0000_i1058" o:spt="1" style="height:1.5pt;width:432pt;" fillcolor="#A0A0A0" filled="t" stroked="f" coordsize="21600,21600" o:hr="t" o:hrstd="t" o:hralign="center">
+          <v:rect id="_x0000_i1070" o:spt="1" style="height:1.5pt;width:432pt;" fillcolor="#A0A0A0" filled="t" stroked="f" coordsize="21600,21600" o:hr="t" o:hrstd="t" o:hralign="center">
             <v:path/>
             <v:fill on="t" focussize="0,0"/>
             <v:stroke on="f"/>
@@ -11321,7 +13144,7 @@
       </w:pPr>
       <w:r>
         <w:pict>
-          <v:rect id="_x0000_i1059" o:spt="1" style="height:1.5pt;width:432pt;" fillcolor="#A0A0A0" filled="t" stroked="f" coordsize="21600,21600" o:hr="t" o:hrstd="t" o:hralign="center">
+          <v:rect id="_x0000_i1071" o:spt="1" style="height:1.5pt;width:432pt;" fillcolor="#A0A0A0" filled="t" stroked="f" coordsize="21600,21600" o:hr="t" o:hrstd="t" o:hralign="center">
             <v:path/>
             <v:fill on="t" focussize="0,0"/>
             <v:stroke on="f"/>
@@ -11432,7 +13255,7 @@
       </w:pPr>
       <w:r>
         <w:pict>
-          <v:rect id="_x0000_i1060" o:spt="1" style="height:1.5pt;width:432pt;" fillcolor="#A0A0A0" filled="t" stroked="f" coordsize="21600,21600" o:hr="t" o:hrstd="t" o:hralign="center">
+          <v:rect id="_x0000_i1072" o:spt="1" style="height:1.5pt;width:432pt;" fillcolor="#A0A0A0" filled="t" stroked="f" coordsize="21600,21600" o:hr="t" o:hrstd="t" o:hralign="center">
             <v:path/>
             <v:fill on="t" focussize="0,0"/>
             <v:stroke on="f"/>
@@ -11573,7 +13396,7 @@
       </w:pPr>
       <w:r>
         <w:pict>
-          <v:rect id="_x0000_i1061" o:spt="1" style="height:1.5pt;width:432pt;" fillcolor="#A0A0A0" filled="t" stroked="f" coordsize="21600,21600" o:hr="t" o:hrstd="t" o:hralign="center">
+          <v:rect id="_x0000_i1073" o:spt="1" style="height:1.5pt;width:432pt;" fillcolor="#A0A0A0" filled="t" stroked="f" coordsize="21600,21600" o:hr="t" o:hrstd="t" o:hralign="center">
             <v:path/>
             <v:fill on="t" focussize="0,0"/>
             <v:stroke on="f"/>
@@ -11781,7 +13604,7 @@
       </w:pPr>
       <w:r>
         <w:pict>
-          <v:rect id="_x0000_i1062" o:spt="1" style="height:1.5pt;width:432pt;" fillcolor="#A0A0A0" filled="t" stroked="f" coordsize="21600,21600" o:hr="t" o:hrstd="t" o:hralign="center">
+          <v:rect id="_x0000_i1074" o:spt="1" style="height:1.5pt;width:432pt;" fillcolor="#A0A0A0" filled="t" stroked="f" coordsize="21600,21600" o:hr="t" o:hrstd="t" o:hralign="center">
             <v:path/>
             <v:fill on="t" focussize="0,0"/>
             <v:stroke on="f"/>
@@ -11929,7 +13752,7 @@
       </w:pPr>
       <w:r>
         <w:pict>
-          <v:rect id="_x0000_i1063" o:spt="1" style="height:1.5pt;width:432pt;" fillcolor="#A0A0A0" filled="t" stroked="f" coordsize="21600,21600" o:hr="t" o:hrstd="t" o:hralign="center">
+          <v:rect id="_x0000_i1075" o:spt="1" style="height:1.5pt;width:432pt;" fillcolor="#A0A0A0" filled="t" stroked="f" coordsize="21600,21600" o:hr="t" o:hrstd="t" o:hralign="center">
             <v:path/>
             <v:fill on="t" focussize="0,0"/>
             <v:stroke on="f"/>
@@ -12094,7 +13917,7 @@
       </w:pPr>
       <w:r>
         <w:pict>
-          <v:rect id="_x0000_i1064" o:spt="1" style="height:1.5pt;width:432pt;" fillcolor="#A0A0A0" filled="t" stroked="f" coordsize="21600,21600" o:hr="t" o:hrstd="t" o:hralign="center">
+          <v:rect id="_x0000_i1076" o:spt="1" style="height:1.5pt;width:432pt;" fillcolor="#A0A0A0" filled="t" stroked="f" coordsize="21600,21600" o:hr="t" o:hrstd="t" o:hralign="center">
             <v:path/>
             <v:fill on="t" focussize="0,0"/>
             <v:stroke on="f"/>
@@ -12119,7 +13942,7 @@
           <w:szCs w:val="24"/>
         </w:rPr>
         <w:pict>
-          <v:rect id="_x0000_i1065" o:spt="1" style="height:1.5pt;width:432pt;" fillcolor="#A0A0A0" filled="t" stroked="f" coordsize="21600,21600" o:hr="t" o:hrstd="t" o:hralign="center">
+          <v:rect id="_x0000_i1077" o:spt="1" style="height:1.5pt;width:432pt;" fillcolor="#A0A0A0" filled="t" stroked="f" coordsize="21600,21600" o:hr="t" o:hrstd="t" o:hralign="center">
             <v:path/>
             <v:fill on="t" focussize="0,0"/>
             <v:stroke on="f"/>
@@ -12235,7 +14058,7 @@
       </w:pPr>
       <w:r>
         <w:pict>
-          <v:rect id="_x0000_i1066" o:spt="1" style="height:1.5pt;width:432pt;" fillcolor="#A0A0A0" filled="t" stroked="f" coordsize="21600,21600" o:hr="t" o:hrstd="t" o:hralign="center">
+          <v:rect id="_x0000_i1078" o:spt="1" style="height:1.5pt;width:432pt;" fillcolor="#A0A0A0" filled="t" stroked="f" coordsize="21600,21600" o:hr="t" o:hrstd="t" o:hralign="center">
             <v:path/>
             <v:fill on="t" focussize="0,0"/>
             <v:stroke on="f"/>
@@ -12923,7 +14746,7 @@
           <w:highlight w:val="magenta"/>
         </w:rPr>
         <w:pict>
-          <v:rect id="_x0000_i1067" o:spt="1" style="height:1.5pt;width:432pt;" fillcolor="#A0A0A0" filled="t" stroked="f" coordsize="21600,21600" o:hr="t" o:hrstd="t" o:hralign="center">
+          <v:rect id="_x0000_i1079" o:spt="1" style="height:1.5pt;width:432pt;" fillcolor="#A0A0A0" filled="t" stroked="f" coordsize="21600,21600" o:hr="t" o:hrstd="t" o:hralign="center">
             <v:path/>
             <v:fill on="t" focussize="0,0"/>
             <v:stroke on="f"/>
@@ -12939,7 +14762,7 @@
           <w:highlight w:val="magenta"/>
         </w:rPr>
         <w:pict>
-          <v:rect id="_x0000_i1068" o:spt="1" style="height:1.5pt;width:432pt;" fillcolor="#A0A0A0" filled="t" stroked="f" coordsize="21600,21600" o:hr="t" o:hrstd="t" o:hralign="center">
+          <v:rect id="_x0000_i1080" o:spt="1" style="height:1.5pt;width:432pt;" fillcolor="#A0A0A0" filled="t" stroked="f" coordsize="21600,21600" o:hr="t" o:hrstd="t" o:hralign="center">
             <v:path/>
             <v:fill on="t" focussize="0,0"/>
             <v:stroke on="f"/>
@@ -13184,7 +15007,7 @@
       </w:pPr>
       <w:r>
         <w:pict>
-          <v:rect id="_x0000_i1069" o:spt="1" style="height:1.5pt;width:432pt;" fillcolor="#A0A0A0" filled="t" stroked="f" coordsize="21600,21600" o:hr="t" o:hrstd="t" o:hralign="center">
+          <v:rect id="_x0000_i1081" o:spt="1" style="height:1.5pt;width:432pt;" fillcolor="#A0A0A0" filled="t" stroked="f" coordsize="21600,21600" o:hr="t" o:hrstd="t" o:hralign="center">
             <v:path/>
             <v:fill on="t" focussize="0,0"/>
             <v:stroke on="f"/>
@@ -13319,7 +15142,7 @@
       </w:pPr>
       <w:r>
         <w:pict>
-          <v:rect id="_x0000_i1070" o:spt="1" style="height:1.5pt;width:432pt;" fillcolor="#A0A0A0" filled="t" stroked="f" coordsize="21600,21600" o:hr="t" o:hrstd="t" o:hralign="center">
+          <v:rect id="_x0000_i1082" o:spt="1" style="height:1.5pt;width:432pt;" fillcolor="#A0A0A0" filled="t" stroked="f" coordsize="21600,21600" o:hr="t" o:hrstd="t" o:hralign="center">
             <v:path/>
             <v:fill on="t" focussize="0,0"/>
             <v:stroke on="f"/>
@@ -13475,7 +15298,7 @@
       </w:pPr>
       <w:r>
         <w:pict>
-          <v:rect id="_x0000_i1071" o:spt="1" style="height:1.5pt;width:432pt;" fillcolor="#A0A0A0" filled="t" stroked="f" coordsize="21600,21600" o:hr="t" o:hrstd="t" o:hralign="center">
+          <v:rect id="_x0000_i1083" o:spt="1" style="height:1.5pt;width:432pt;" fillcolor="#A0A0A0" filled="t" stroked="f" coordsize="21600,21600" o:hr="t" o:hrstd="t" o:hralign="center">
             <v:path/>
             <v:fill on="t" focussize="0,0"/>
             <v:stroke on="f"/>
@@ -13623,7 +15446,7 @@
       </w:pPr>
       <w:r>
         <w:pict>
-          <v:rect id="_x0000_i1072" o:spt="1" style="height:1.5pt;width:432pt;" fillcolor="#A0A0A0" filled="t" stroked="f" coordsize="21600,21600" o:hr="t" o:hrstd="t" o:hralign="center">
+          <v:rect id="_x0000_i1084" o:spt="1" style="height:1.5pt;width:432pt;" fillcolor="#A0A0A0" filled="t" stroked="f" coordsize="21600,21600" o:hr="t" o:hrstd="t" o:hralign="center">
             <v:path/>
             <v:fill on="t" focussize="0,0"/>
             <v:stroke on="f"/>
@@ -13740,7 +15563,7 @@
       </w:pPr>
       <w:r>
         <w:pict>
-          <v:rect id="_x0000_i1073" o:spt="1" style="height:1.5pt;width:432pt;" fillcolor="#A0A0A0" filled="t" stroked="f" coordsize="21600,21600" o:hr="t" o:hrstd="t" o:hralign="center">
+          <v:rect id="_x0000_i1085" o:spt="1" style="height:1.5pt;width:432pt;" fillcolor="#A0A0A0" filled="t" stroked="f" coordsize="21600,21600" o:hr="t" o:hrstd="t" o:hralign="center">
             <v:path/>
             <v:fill on="t" focussize="0,0"/>
             <v:stroke on="f"/>
@@ -13884,7 +15707,7 @@
       </w:pPr>
       <w:r>
         <w:pict>
-          <v:rect id="_x0000_i1074" o:spt="1" style="height:1.5pt;width:432pt;" fillcolor="#A0A0A0" filled="t" stroked="f" coordsize="21600,21600" o:hr="t" o:hrstd="t" o:hralign="center">
+          <v:rect id="_x0000_i1086" o:spt="1" style="height:1.5pt;width:432pt;" fillcolor="#A0A0A0" filled="t" stroked="f" coordsize="21600,21600" o:hr="t" o:hrstd="t" o:hralign="center">
             <v:path/>
             <v:fill on="t" focussize="0,0"/>
             <v:stroke on="f"/>
@@ -14076,7 +15899,7 @@
       </w:pPr>
       <w:r>
         <w:pict>
-          <v:rect id="_x0000_i1075" o:spt="1" style="height:1.5pt;width:432pt;" fillcolor="#A0A0A0" filled="t" stroked="f" coordsize="21600,21600" o:hr="t" o:hrstd="t" o:hralign="center">
+          <v:rect id="_x0000_i1087" o:spt="1" style="height:1.5pt;width:432pt;" fillcolor="#A0A0A0" filled="t" stroked="f" coordsize="21600,21600" o:hr="t" o:hrstd="t" o:hralign="center">
             <v:path/>
             <v:fill on="t" focussize="0,0"/>
             <v:stroke on="f"/>
@@ -16528,6 +18351,7 @@
   </w:style>
   <w:style w:type="character" w:customStyle="1" w:styleId="13">
     <w:name w:val="10"/>
+    <w:qFormat/>
     <w:uiPriority w:val="0"/>
     <w:rPr>
       <w:rFonts w:hint="default" w:ascii="Times New Roman" w:hAnsi="Times New Roman" w:cs="Times New Roman"/>

</xml_diff>

<commit_message>
Implement estimation theory metrics (point estimate, CI, margin of error)
</commit_message>
<xml_diff>
--- a/notes.docx
+++ b/notes.docx
@@ -2176,8 +2176,6 @@
       <w:r>
         <w:t>Randomization</w:t>
       </w:r>
-      <w:bookmarkStart w:id="0" w:name="_GoBack"/>
-      <w:bookmarkEnd w:id="0"/>
     </w:p>
     <w:p>
       <w:pPr>
@@ -2241,7 +2239,7 @@
           <w:highlight w:val="yellow"/>
         </w:rPr>
         <w:pict>
-          <v:rect id="_x0000_i1119" o:spt="1" style="height:1.5pt;width:432pt;" fillcolor="#A0A0A0" filled="t" stroked="f" coordsize="21600,21600" o:hr="t" o:hrstd="t" o:hralign="center">
+          <v:rect id="_x0000_i1038" o:spt="1" style="height:1.5pt;width:432pt;" fillcolor="#A0A0A0" filled="t" stroked="f" coordsize="21600,21600" o:hr="t" o:hrstd="t" o:hralign="center">
             <v:path/>
             <v:fill on="t" focussize="0,0"/>
             <v:stroke on="f"/>
@@ -2278,8 +2276,14 @@
         <w:keepLines w:val="0"/>
         <w:widowControl/>
         <w:suppressLineNumbers w:val="0"/>
-      </w:pPr>
-      <w:r>
+        <w:rPr>
+          <w:highlight w:val="green"/>
+        </w:rPr>
+      </w:pPr>
+      <w:r>
+        <w:rPr>
+          <w:highlight w:val="green"/>
+        </w:rPr>
         <w:t>1️⃣ Population &amp; Sample</w:t>
       </w:r>
     </w:p>
@@ -2291,8 +2295,14 @@
         <w:widowControl/>
         <w:suppressLineNumbers w:val="0"/>
         <w:ind w:left="720"/>
-      </w:pPr>
-      <w:r>
+        <w:rPr>
+          <w:highlight w:val="green"/>
+        </w:rPr>
+      </w:pPr>
+      <w:r>
+        <w:rPr>
+          <w:highlight w:val="green"/>
+        </w:rPr>
         <w:t>Population</w:t>
       </w:r>
     </w:p>
@@ -2304,8 +2314,14 @@
         <w:widowControl/>
         <w:suppressLineNumbers w:val="0"/>
         <w:ind w:left="720"/>
-      </w:pPr>
-      <w:r>
+        <w:rPr>
+          <w:highlight w:val="green"/>
+        </w:rPr>
+      </w:pPr>
+      <w:r>
+        <w:rPr>
+          <w:highlight w:val="green"/>
+        </w:rPr>
         <w:t>Sample</w:t>
       </w:r>
     </w:p>
@@ -2317,8 +2333,14 @@
         <w:widowControl/>
         <w:suppressLineNumbers w:val="0"/>
         <w:ind w:left="720"/>
-      </w:pPr>
-      <w:r>
+        <w:rPr>
+          <w:highlight w:val="green"/>
+        </w:rPr>
+      </w:pPr>
+      <w:r>
+        <w:rPr>
+          <w:highlight w:val="green"/>
+        </w:rPr>
         <w:t>Census vs Sampling</w:t>
       </w:r>
     </w:p>
@@ -2330,8 +2352,14 @@
         <w:widowControl/>
         <w:suppressLineNumbers w:val="0"/>
         <w:ind w:left="720"/>
-      </w:pPr>
-      <w:r>
+        <w:rPr>
+          <w:highlight w:val="green"/>
+        </w:rPr>
+      </w:pPr>
+      <w:r>
+        <w:rPr>
+          <w:highlight w:val="green"/>
+        </w:rPr>
         <w:t>Sampling Error</w:t>
       </w:r>
     </w:p>
@@ -2343,8 +2371,14 @@
         <w:widowControl/>
         <w:suppressLineNumbers w:val="0"/>
         <w:ind w:left="720"/>
-      </w:pPr>
-      <w:r>
+        <w:rPr>
+          <w:highlight w:val="green"/>
+        </w:rPr>
+      </w:pPr>
+      <w:r>
+        <w:rPr>
+          <w:highlight w:val="green"/>
+        </w:rPr>
         <w:t>Parameter vs Statistic</w:t>
       </w:r>
     </w:p>
@@ -2357,7 +2391,7 @@
       </w:pPr>
       <w:r>
         <w:pict>
-          <v:rect id="_x0000_i1120" o:spt="1" style="height:1.5pt;width:432pt;" fillcolor="#A0A0A0" filled="t" stroked="f" coordsize="21600,21600" o:hr="t" o:hrstd="t" o:hralign="center">
+          <v:rect id="_x0000_i1039" o:spt="1" style="height:1.5pt;width:432pt;" fillcolor="#A0A0A0" filled="t" stroked="f" coordsize="21600,21600" o:hr="t" o:hrstd="t" o:hralign="center">
             <v:path/>
             <v:fill on="t" focussize="0,0"/>
             <v:stroke on="f"/>
@@ -2388,10 +2422,14 @@
         <w:keepLines w:val="0"/>
         <w:widowControl/>
         <w:suppressLineNumbers w:val="0"/>
-      </w:pPr>
-      <w:r>
-        <w:rPr>
-          <w:rStyle w:val="12"/>
+        <w:rPr>
+          <w:highlight w:val="green"/>
+        </w:rPr>
+      </w:pPr>
+      <w:r>
+        <w:rPr>
+          <w:rStyle w:val="12"/>
+          <w:highlight w:val="green"/>
         </w:rPr>
         <w:t>Probability Sampling</w:t>
       </w:r>
@@ -2404,8 +2442,14 @@
         <w:widowControl/>
         <w:suppressLineNumbers w:val="0"/>
         <w:ind w:left="720"/>
-      </w:pPr>
-      <w:r>
+        <w:rPr>
+          <w:highlight w:val="green"/>
+        </w:rPr>
+      </w:pPr>
+      <w:r>
+        <w:rPr>
+          <w:highlight w:val="green"/>
+        </w:rPr>
         <w:t>Simple Random Sampling</w:t>
       </w:r>
     </w:p>
@@ -2417,8 +2461,14 @@
         <w:widowControl/>
         <w:suppressLineNumbers w:val="0"/>
         <w:ind w:left="720"/>
-      </w:pPr>
-      <w:r>
+        <w:rPr>
+          <w:highlight w:val="green"/>
+        </w:rPr>
+      </w:pPr>
+      <w:r>
+        <w:rPr>
+          <w:highlight w:val="green"/>
+        </w:rPr>
         <w:t>Stratified Sampling</w:t>
       </w:r>
     </w:p>
@@ -2430,8 +2480,14 @@
         <w:widowControl/>
         <w:suppressLineNumbers w:val="0"/>
         <w:ind w:left="720"/>
-      </w:pPr>
-      <w:r>
+        <w:rPr>
+          <w:highlight w:val="green"/>
+        </w:rPr>
+      </w:pPr>
+      <w:r>
+        <w:rPr>
+          <w:highlight w:val="green"/>
+        </w:rPr>
         <w:t>Systematic Sampling</w:t>
       </w:r>
     </w:p>
@@ -2443,8 +2499,14 @@
         <w:widowControl/>
         <w:suppressLineNumbers w:val="0"/>
         <w:ind w:left="720"/>
-      </w:pPr>
-      <w:r>
+        <w:rPr>
+          <w:highlight w:val="green"/>
+        </w:rPr>
+      </w:pPr>
+      <w:r>
+        <w:rPr>
+          <w:highlight w:val="green"/>
+        </w:rPr>
         <w:t>Cluster Sampling</w:t>
       </w:r>
     </w:p>
@@ -2536,7 +2598,7 @@
       </w:pPr>
       <w:r>
         <w:pict>
-          <v:rect id="_x0000_i1121" o:spt="1" style="height:1.5pt;width:432pt;" fillcolor="#A0A0A0" filled="t" stroked="f" coordsize="21600,21600" o:hr="t" o:hrstd="t" o:hralign="center">
+          <v:rect id="_x0000_i1040" o:spt="1" style="height:1.5pt;width:432pt;" fillcolor="#A0A0A0" filled="t" stroked="f" coordsize="21600,21600" o:hr="t" o:hrstd="t" o:hralign="center">
             <v:path/>
             <v:fill on="t" focussize="0,0"/>
             <v:stroke on="f"/>
@@ -2620,8 +2682,14 @@
         <w:widowControl/>
         <w:suppressLineNumbers w:val="0"/>
         <w:ind w:left="720"/>
-      </w:pPr>
-      <w:r>
+        <w:rPr>
+          <w:highlight w:val="green"/>
+        </w:rPr>
+      </w:pPr>
+      <w:r>
+        <w:rPr>
+          <w:highlight w:val="green"/>
+        </w:rPr>
         <w:t>Probability Density Function (PDF)</w:t>
       </w:r>
     </w:p>
@@ -2633,8 +2701,14 @@
         <w:widowControl/>
         <w:suppressLineNumbers w:val="0"/>
         <w:ind w:left="720"/>
-      </w:pPr>
-      <w:r>
+        <w:rPr>
+          <w:highlight w:val="green"/>
+        </w:rPr>
+      </w:pPr>
+      <w:r>
+        <w:rPr>
+          <w:highlight w:val="green"/>
+        </w:rPr>
         <w:t>Cumulative Distribution Function (CDF)</w:t>
       </w:r>
     </w:p>
@@ -2647,7 +2721,7 @@
       </w:pPr>
       <w:r>
         <w:pict>
-          <v:rect id="_x0000_i1122" o:spt="1" style="height:1.5pt;width:432pt;" fillcolor="#A0A0A0" filled="t" stroked="f" coordsize="21600,21600" o:hr="t" o:hrstd="t" o:hralign="center">
+          <v:rect id="_x0000_i1041" o:spt="1" style="height:1.5pt;width:432pt;" fillcolor="#A0A0A0" filled="t" stroked="f" coordsize="21600,21600" o:hr="t" o:hrstd="t" o:hralign="center">
             <v:path/>
             <v:fill on="t" focussize="0,0"/>
             <v:stroke on="f"/>
@@ -2694,8 +2768,14 @@
         <w:widowControl/>
         <w:suppressLineNumbers w:val="0"/>
         <w:ind w:left="720"/>
-      </w:pPr>
-      <w:r>
+        <w:rPr>
+          <w:highlight w:val="green"/>
+        </w:rPr>
+      </w:pPr>
+      <w:r>
+        <w:rPr>
+          <w:highlight w:val="green"/>
+        </w:rPr>
         <w:t>Bernoulli Distribution</w:t>
       </w:r>
     </w:p>
@@ -2707,8 +2787,14 @@
         <w:widowControl/>
         <w:suppressLineNumbers w:val="0"/>
         <w:ind w:left="720"/>
-      </w:pPr>
-      <w:r>
+        <w:rPr>
+          <w:highlight w:val="green"/>
+        </w:rPr>
+      </w:pPr>
+      <w:r>
+        <w:rPr>
+          <w:highlight w:val="green"/>
+        </w:rPr>
         <w:t>Binomial Distribution</w:t>
       </w:r>
     </w:p>
@@ -2718,23 +2804,33 @@
         <w:keepLines w:val="0"/>
         <w:widowControl/>
         <w:numPr>
+          <w:ilvl w:val="0"/>
           <w:numId w:val="0"/>
         </w:numPr>
         <w:suppressLineNumbers w:val="0"/>
         <w:spacing w:before="0" w:beforeAutospacing="1" w:after="0" w:afterAutospacing="1"/>
         <w:ind w:left="1080" w:leftChars="0"/>
-      </w:pPr>
-    </w:p>
-    <w:p>
-      <w:pPr>
-        <w:pStyle w:val="11"/>
-        <w:keepNext w:val="0"/>
-        <w:keepLines w:val="0"/>
-        <w:widowControl/>
-        <w:suppressLineNumbers w:val="0"/>
-        <w:ind w:left="720"/>
-      </w:pPr>
-      <w:r>
+        <w:rPr>
+          <w:highlight w:val="green"/>
+        </w:rPr>
+      </w:pPr>
+    </w:p>
+    <w:p>
+      <w:pPr>
+        <w:pStyle w:val="11"/>
+        <w:keepNext w:val="0"/>
+        <w:keepLines w:val="0"/>
+        <w:widowControl/>
+        <w:suppressLineNumbers w:val="0"/>
+        <w:ind w:left="720"/>
+        <w:rPr>
+          <w:highlight w:val="green"/>
+        </w:rPr>
+      </w:pPr>
+      <w:r>
+        <w:rPr>
+          <w:highlight w:val="green"/>
+        </w:rPr>
         <w:t>Poisson Distribution</w:t>
       </w:r>
     </w:p>
@@ -2817,6 +2913,8 @@
       <w:r>
         <w:t>t-Distribution</w:t>
       </w:r>
+      <w:bookmarkStart w:id="0" w:name="_GoBack"/>
+      <w:bookmarkEnd w:id="0"/>
     </w:p>
     <w:p>
       <w:pPr>
@@ -2853,7 +2951,7 @@
       </w:pPr>
       <w:r>
         <w:pict>
-          <v:rect id="_x0000_i1123" o:spt="1" style="height:1.5pt;width:432pt;" fillcolor="#A0A0A0" filled="t" stroked="f" coordsize="21600,21600" o:hr="t" o:hrstd="t" o:hralign="center">
+          <v:rect id="_x0000_i1042" o:spt="1" style="height:1.5pt;width:432pt;" fillcolor="#A0A0A0" filled="t" stroked="f" coordsize="21600,21600" o:hr="t" o:hrstd="t" o:hralign="center">
             <v:path/>
             <v:fill on="t" focussize="0,0"/>
             <v:stroke on="f"/>
@@ -3018,7 +3116,7 @@
       </w:pPr>
       <w:r>
         <w:pict>
-          <v:rect id="_x0000_i1124" o:spt="1" style="height:1.5pt;width:432pt;" fillcolor="#A0A0A0" filled="t" stroked="f" coordsize="21600,21600" o:hr="t" o:hrstd="t" o:hralign="center">
+          <v:rect id="_x0000_i1043" o:spt="1" style="height:1.5pt;width:432pt;" fillcolor="#A0A0A0" filled="t" stroked="f" coordsize="21600,21600" o:hr="t" o:hrstd="t" o:hralign="center">
             <v:path/>
             <v:fill on="t" focussize="0,0"/>
             <v:stroke on="f"/>
@@ -3179,7 +3277,7 @@
       </w:pPr>
       <w:r>
         <w:pict>
-          <v:rect id="_x0000_i1125" o:spt="1" style="height:1.5pt;width:432pt;" fillcolor="#A0A0A0" filled="t" stroked="f" coordsize="21600,21600" o:hr="t" o:hrstd="t" o:hralign="center">
+          <v:rect id="_x0000_i1044" o:spt="1" style="height:1.5pt;width:432pt;" fillcolor="#A0A0A0" filled="t" stroked="f" coordsize="21600,21600" o:hr="t" o:hrstd="t" o:hralign="center">
             <v:path/>
             <v:fill on="t" focussize="0,0"/>
             <v:stroke on="f"/>
@@ -3251,7 +3349,7 @@
       </w:pPr>
       <w:r>
         <w:pict>
-          <v:rect id="_x0000_i1126" o:spt="1" style="height:1.5pt;width:432pt;" fillcolor="#A0A0A0" filled="t" stroked="f" coordsize="21600,21600" o:hr="t" o:hrstd="t" o:hralign="center">
+          <v:rect id="_x0000_i1045" o:spt="1" style="height:1.5pt;width:432pt;" fillcolor="#A0A0A0" filled="t" stroked="f" coordsize="21600,21600" o:hr="t" o:hrstd="t" o:hralign="center">
             <v:path/>
             <v:fill on="t" focussize="0,0"/>
             <v:stroke on="f"/>
@@ -3426,7 +3524,7 @@
       </w:pPr>
       <w:r>
         <w:pict>
-          <v:rect id="_x0000_i1127" o:spt="1" style="height:1.5pt;width:432pt;" fillcolor="#A0A0A0" filled="t" stroked="f" coordsize="21600,21600" o:hr="t" o:hrstd="t" o:hralign="center">
+          <v:rect id="_x0000_i1046" o:spt="1" style="height:1.5pt;width:432pt;" fillcolor="#A0A0A0" filled="t" stroked="f" coordsize="21600,21600" o:hr="t" o:hrstd="t" o:hralign="center">
             <v:path/>
             <v:fill on="t" focussize="0,0"/>
             <v:stroke on="f"/>
@@ -3562,7 +3660,7 @@
       </w:pPr>
       <w:r>
         <w:pict>
-          <v:rect id="_x0000_i1128" o:spt="1" style="height:1.5pt;width:432pt;" fillcolor="#A0A0A0" filled="t" stroked="f" coordsize="21600,21600" o:hr="t" o:hrstd="t" o:hralign="center">
+          <v:rect id="_x0000_i1047" o:spt="1" style="height:1.5pt;width:432pt;" fillcolor="#A0A0A0" filled="t" stroked="f" coordsize="21600,21600" o:hr="t" o:hrstd="t" o:hralign="center">
             <v:path/>
             <v:fill on="t" focussize="0,0"/>
             <v:stroke on="f"/>
@@ -3660,7 +3758,7 @@
       </w:pPr>
       <w:r>
         <w:pict>
-          <v:rect id="_x0000_i1129" o:spt="1" style="height:1.5pt;width:432pt;" fillcolor="#A0A0A0" filled="t" stroked="f" coordsize="21600,21600" o:hr="t" o:hrstd="t" o:hralign="center">
+          <v:rect id="_x0000_i1048" o:spt="1" style="height:1.5pt;width:432pt;" fillcolor="#A0A0A0" filled="t" stroked="f" coordsize="21600,21600" o:hr="t" o:hrstd="t" o:hralign="center">
             <v:path/>
             <v:fill on="t" focussize="0,0"/>
             <v:stroke on="f"/>
@@ -3771,7 +3869,7 @@
       </w:pPr>
       <w:r>
         <w:pict>
-          <v:rect id="_x0000_i1130" o:spt="1" style="height:1.5pt;width:432pt;" fillcolor="#A0A0A0" filled="t" stroked="f" coordsize="21600,21600" o:hr="t" o:hrstd="t" o:hralign="center">
+          <v:rect id="_x0000_i1049" o:spt="1" style="height:1.5pt;width:432pt;" fillcolor="#A0A0A0" filled="t" stroked="f" coordsize="21600,21600" o:hr="t" o:hrstd="t" o:hralign="center">
             <v:path/>
             <v:fill on="t" focussize="0,0"/>
             <v:stroke on="f"/>
@@ -3843,7 +3941,7 @@
       </w:pPr>
       <w:r>
         <w:pict>
-          <v:rect id="_x0000_i1131" o:spt="1" style="height:1.5pt;width:432pt;" fillcolor="#A0A0A0" filled="t" stroked="f" coordsize="21600,21600" o:hr="t" o:hrstd="t" o:hralign="center">
+          <v:rect id="_x0000_i1050" o:spt="1" style="height:1.5pt;width:432pt;" fillcolor="#A0A0A0" filled="t" stroked="f" coordsize="21600,21600" o:hr="t" o:hrstd="t" o:hralign="center">
             <v:path/>
             <v:fill on="t" focussize="0,0"/>
             <v:stroke on="f"/>
@@ -3941,7 +4039,7 @@
       </w:pPr>
       <w:r>
         <w:pict>
-          <v:rect id="_x0000_i1132" o:spt="1" style="height:1.5pt;width:432pt;" fillcolor="#A0A0A0" filled="t" stroked="f" coordsize="21600,21600" o:hr="t" o:hrstd="t" o:hralign="center">
+          <v:rect id="_x0000_i1051" o:spt="1" style="height:1.5pt;width:432pt;" fillcolor="#A0A0A0" filled="t" stroked="f" coordsize="21600,21600" o:hr="t" o:hrstd="t" o:hralign="center">
             <v:path/>
             <v:fill on="t" focussize="0,0"/>
             <v:stroke on="f"/>
@@ -4000,7 +4098,7 @@
       </w:pPr>
       <w:r>
         <w:pict>
-          <v:rect id="_x0000_i1133" o:spt="1" style="height:1.5pt;width:432pt;" fillcolor="#A0A0A0" filled="t" stroked="f" coordsize="21600,21600" o:hr="t" o:hrstd="t" o:hralign="center">
+          <v:rect id="_x0000_i1052" o:spt="1" style="height:1.5pt;width:432pt;" fillcolor="#A0A0A0" filled="t" stroked="f" coordsize="21600,21600" o:hr="t" o:hrstd="t" o:hralign="center">
             <v:path/>
             <v:fill on="t" focussize="0,0"/>
             <v:stroke on="f"/>
@@ -4939,7 +5037,7 @@
       </w:pPr>
       <w:r>
         <w:pict>
-          <v:rect id="_x0000_i1038" o:spt="1" style="flip:y;height:6pt;width:549.45pt;" fillcolor="#A0A0A0" filled="t" stroked="f" coordsize="21600,21600" o:hr="t" o:hrstd="t" o:hrpct="1217" o:hralign="center">
+          <v:rect id="_x0000_i1053" o:spt="1" style="flip:y;height:6pt;width:549.45pt;" fillcolor="#A0A0A0" filled="t" stroked="f" coordsize="21600,21600" o:hr="t" o:hrstd="t" o:hrpct="1217" o:hralign="center">
             <v:path/>
             <v:fill on="t" color2="#FFFFFF" focussize="0,0"/>
             <v:stroke on="f"/>
@@ -5676,7 +5774,7 @@
           <w:highlight w:val="magenta"/>
         </w:rPr>
         <w:pict>
-          <v:rect id="_x0000_i1039" o:spt="1" style="flip:y;height:15.5pt;width:563.35pt;" fillcolor="#A0A0A0" filled="t" stroked="f" coordsize="21600,21600" o:hr="t" o:hrstd="t" o:hrpct="1265" o:hralign="center">
+          <v:rect id="_x0000_i1054" o:spt="1" style="flip:y;height:15.5pt;width:563.35pt;" fillcolor="#A0A0A0" filled="t" stroked="f" coordsize="21600,21600" o:hr="t" o:hrstd="t" o:hrpct="1265" o:hralign="center">
             <v:path/>
             <v:fill on="t" color2="#FFFFFF" focussize="0,0"/>
             <v:stroke on="f"/>
@@ -5932,7 +6030,7 @@
           <w:szCs w:val="28"/>
         </w:rPr>
         <w:pict>
-          <v:rect id="_x0000_i1040" o:spt="1" style="height:1.5pt;width:432pt;" fillcolor="#A0A0A0" filled="t" stroked="f" coordsize="21600,21600" o:hr="t" o:hrstd="t" o:hralign="center">
+          <v:rect id="_x0000_i1055" o:spt="1" style="height:1.5pt;width:432pt;" fillcolor="#A0A0A0" filled="t" stroked="f" coordsize="21600,21600" o:hr="t" o:hrstd="t" o:hralign="center">
             <v:path/>
             <v:fill on="t" focussize="0,0"/>
             <v:stroke on="f"/>
@@ -6192,7 +6290,7 @@
           <w:szCs w:val="28"/>
         </w:rPr>
         <w:pict>
-          <v:rect id="_x0000_i1041" o:spt="1" style="height:1.5pt;width:432pt;" fillcolor="#A0A0A0" filled="t" stroked="f" coordsize="21600,21600" o:hr="t" o:hrstd="t" o:hralign="center">
+          <v:rect id="_x0000_i1056" o:spt="1" style="height:1.5pt;width:432pt;" fillcolor="#A0A0A0" filled="t" stroked="f" coordsize="21600,21600" o:hr="t" o:hrstd="t" o:hralign="center">
             <v:path/>
             <v:fill on="t" focussize="0,0"/>
             <v:stroke on="f"/>
@@ -6443,7 +6541,7 @@
           <w:szCs w:val="28"/>
         </w:rPr>
         <w:pict>
-          <v:rect id="_x0000_i1042" o:spt="1" style="height:1.5pt;width:432pt;" fillcolor="#A0A0A0" filled="t" stroked="f" coordsize="21600,21600" o:hr="t" o:hrstd="t" o:hralign="center">
+          <v:rect id="_x0000_i1057" o:spt="1" style="height:1.5pt;width:432pt;" fillcolor="#A0A0A0" filled="t" stroked="f" coordsize="21600,21600" o:hr="t" o:hrstd="t" o:hralign="center">
             <v:path/>
             <v:fill on="t" focussize="0,0"/>
             <v:stroke on="f"/>
@@ -6780,7 +6878,7 @@
           <w:szCs w:val="28"/>
         </w:rPr>
         <w:pict>
-          <v:rect id="_x0000_i1043" o:spt="1" style="height:1.5pt;width:432pt;" fillcolor="#A0A0A0" filled="t" stroked="f" coordsize="21600,21600" o:hr="t" o:hrstd="t" o:hralign="center">
+          <v:rect id="_x0000_i1058" o:spt="1" style="height:1.5pt;width:432pt;" fillcolor="#A0A0A0" filled="t" stroked="f" coordsize="21600,21600" o:hr="t" o:hrstd="t" o:hralign="center">
             <v:path/>
             <v:fill on="t" focussize="0,0"/>
             <v:stroke on="f"/>
@@ -6811,7 +6909,7 @@
           <w:highlight w:val="magenta"/>
         </w:rPr>
         <w:pict>
-          <v:rect id="_x0000_i1044" o:spt="1" style="height:1.5pt;width:432pt;" fillcolor="#A0A0A0" filled="t" stroked="f" coordsize="21600,21600" o:hr="t" o:hrstd="t" o:hralign="center">
+          <v:rect id="_x0000_i1059" o:spt="1" style="height:1.5pt;width:432pt;" fillcolor="#A0A0A0" filled="t" stroked="f" coordsize="21600,21600" o:hr="t" o:hrstd="t" o:hralign="center">
             <v:path/>
             <v:fill on="t" focussize="0,0"/>
             <v:stroke on="f"/>
@@ -7052,7 +7150,7 @@
           <w:szCs w:val="28"/>
         </w:rPr>
         <w:pict>
-          <v:rect id="_x0000_i1045" o:spt="1" style="height:1.5pt;width:432pt;" fillcolor="#A0A0A0" filled="t" stroked="f" coordsize="21600,21600" o:hr="t" o:hrstd="t" o:hralign="center">
+          <v:rect id="_x0000_i1060" o:spt="1" style="height:1.5pt;width:432pt;" fillcolor="#A0A0A0" filled="t" stroked="f" coordsize="21600,21600" o:hr="t" o:hrstd="t" o:hralign="center">
             <v:path/>
             <v:fill on="t" focussize="0,0"/>
             <v:stroke on="f"/>
@@ -7289,7 +7387,7 @@
           <w:szCs w:val="28"/>
         </w:rPr>
         <w:pict>
-          <v:rect id="_x0000_i1046" o:spt="1" style="height:1.5pt;width:432pt;" fillcolor="#A0A0A0" filled="t" stroked="f" coordsize="21600,21600" o:hr="t" o:hrstd="t" o:hralign="center">
+          <v:rect id="_x0000_i1061" o:spt="1" style="height:1.5pt;width:432pt;" fillcolor="#A0A0A0" filled="t" stroked="f" coordsize="21600,21600" o:hr="t" o:hrstd="t" o:hralign="center">
             <v:path/>
             <v:fill on="t" focussize="0,0"/>
             <v:stroke on="f"/>
@@ -7320,7 +7418,7 @@
           <w:highlight w:val="magenta"/>
         </w:rPr>
         <w:pict>
-          <v:rect id="_x0000_i1047" o:spt="1" style="height:1.5pt;width:432pt;" fillcolor="#A0A0A0" filled="t" stroked="f" coordsize="21600,21600" o:hr="t" o:hrstd="t" o:hralign="center">
+          <v:rect id="_x0000_i1062" o:spt="1" style="height:1.5pt;width:432pt;" fillcolor="#A0A0A0" filled="t" stroked="f" coordsize="21600,21600" o:hr="t" o:hrstd="t" o:hralign="center">
             <v:path/>
             <v:fill on="t" focussize="0,0"/>
             <v:stroke on="f"/>
@@ -7564,7 +7662,7 @@
       </w:pPr>
       <w:r>
         <w:pict>
-          <v:rect id="_x0000_i1048" o:spt="1" style="height:1.5pt;width:432pt;" fillcolor="#A0A0A0" filled="t" stroked="f" coordsize="21600,21600" o:hr="t" o:hrstd="t" o:hralign="center">
+          <v:rect id="_x0000_i1063" o:spt="1" style="height:1.5pt;width:432pt;" fillcolor="#A0A0A0" filled="t" stroked="f" coordsize="21600,21600" o:hr="t" o:hrstd="t" o:hralign="center">
             <v:path/>
             <v:fill on="t" focussize="0,0"/>
             <v:stroke on="f"/>
@@ -7738,7 +7836,7 @@
       </w:pPr>
       <w:r>
         <w:pict>
-          <v:rect id="_x0000_i1049" o:spt="1" style="height:1.5pt;width:432pt;" fillcolor="#A0A0A0" filled="t" stroked="f" coordsize="21600,21600" o:hr="t" o:hrstd="t" o:hralign="center">
+          <v:rect id="_x0000_i1064" o:spt="1" style="height:1.5pt;width:432pt;" fillcolor="#A0A0A0" filled="t" stroked="f" coordsize="21600,21600" o:hr="t" o:hrstd="t" o:hralign="center">
             <v:path/>
             <v:fill on="t" focussize="0,0"/>
             <v:stroke on="f"/>
@@ -7912,7 +8010,7 @@
       </w:pPr>
       <w:r>
         <w:pict>
-          <v:rect id="_x0000_i1050" o:spt="1" style="height:1.5pt;width:432pt;" fillcolor="#A0A0A0" filled="t" stroked="f" coordsize="21600,21600" o:hr="t" o:hrstd="t" o:hralign="center">
+          <v:rect id="_x0000_i1065" o:spt="1" style="height:1.5pt;width:432pt;" fillcolor="#A0A0A0" filled="t" stroked="f" coordsize="21600,21600" o:hr="t" o:hrstd="t" o:hralign="center">
             <v:path/>
             <v:fill on="t" focussize="0,0"/>
             <v:stroke on="f"/>
@@ -8062,7 +8160,7 @@
       </w:pPr>
       <w:r>
         <w:pict>
-          <v:rect id="_x0000_i1051" o:spt="1" style="height:1.5pt;width:432pt;" fillcolor="#A0A0A0" filled="t" stroked="f" coordsize="21600,21600" o:hr="t" o:hrstd="t" o:hralign="center">
+          <v:rect id="_x0000_i1066" o:spt="1" style="height:1.5pt;width:432pt;" fillcolor="#A0A0A0" filled="t" stroked="f" coordsize="21600,21600" o:hr="t" o:hrstd="t" o:hralign="center">
             <v:path/>
             <v:fill on="t" focussize="0,0"/>
             <v:stroke on="f"/>
@@ -8656,7 +8754,7 @@
       </w:pPr>
       <w:r>
         <w:pict>
-          <v:rect id="_x0000_i1052" o:spt="1" style="height:1.5pt;width:432pt;" fillcolor="#A0A0A0" filled="t" stroked="f" coordsize="21600,21600" o:hr="t" o:hrstd="t" o:hralign="center">
+          <v:rect id="_x0000_i1067" o:spt="1" style="height:1.5pt;width:432pt;" fillcolor="#A0A0A0" filled="t" stroked="f" coordsize="21600,21600" o:hr="t" o:hrstd="t" o:hralign="center">
             <v:path/>
             <v:fill on="t" focussize="0,0"/>
             <v:stroke on="f"/>
@@ -8677,7 +8775,7 @@
       </w:pPr>
       <w:r>
         <w:pict>
-          <v:rect id="_x0000_i1053" o:spt="1" style="height:1.5pt;width:432pt;" fillcolor="#A0A0A0" filled="t" stroked="f" coordsize="21600,21600" o:hr="t" o:hrstd="t" o:hralign="center">
+          <v:rect id="_x0000_i1068" o:spt="1" style="height:1.5pt;width:432pt;" fillcolor="#A0A0A0" filled="t" stroked="f" coordsize="21600,21600" o:hr="t" o:hrstd="t" o:hralign="center">
             <v:path/>
             <v:fill on="t" focussize="0,0"/>
             <v:stroke on="f"/>
@@ -8823,7 +8921,7 @@
       </w:pPr>
       <w:r>
         <w:pict>
-          <v:rect id="_x0000_i1054" o:spt="1" style="height:1.5pt;width:432pt;" fillcolor="#A0A0A0" filled="t" stroked="f" coordsize="21600,21600" o:hr="t" o:hrstd="t" o:hralign="center">
+          <v:rect id="_x0000_i1069" o:spt="1" style="height:1.5pt;width:432pt;" fillcolor="#A0A0A0" filled="t" stroked="f" coordsize="21600,21600" o:hr="t" o:hrstd="t" o:hralign="center">
             <v:path/>
             <v:fill on="t" focussize="0,0"/>
             <v:stroke on="f"/>
@@ -8943,7 +9041,7 @@
       </w:pPr>
       <w:r>
         <w:pict>
-          <v:rect id="_x0000_i1055" o:spt="1" style="height:1.5pt;width:432pt;" fillcolor="#A0A0A0" filled="t" stroked="f" coordsize="21600,21600" o:hr="t" o:hrstd="t" o:hralign="center">
+          <v:rect id="_x0000_i1070" o:spt="1" style="height:1.5pt;width:432pt;" fillcolor="#A0A0A0" filled="t" stroked="f" coordsize="21600,21600" o:hr="t" o:hrstd="t" o:hralign="center">
             <v:path/>
             <v:fill on="t" focussize="0,0"/>
             <v:stroke on="f"/>
@@ -9149,7 +9247,7 @@
       </w:pPr>
       <w:r>
         <w:pict>
-          <v:rect id="_x0000_i1056" o:spt="1" style="height:1.5pt;width:432pt;" fillcolor="#A0A0A0" filled="t" stroked="f" coordsize="21600,21600" o:hr="t" o:hrstd="t" o:hralign="center">
+          <v:rect id="_x0000_i1071" o:spt="1" style="height:1.5pt;width:432pt;" fillcolor="#A0A0A0" filled="t" stroked="f" coordsize="21600,21600" o:hr="t" o:hrstd="t" o:hralign="center">
             <v:path/>
             <v:fill on="t" focussize="0,0"/>
             <v:stroke on="f"/>
@@ -9941,7 +10039,7 @@
       </w:pPr>
       <w:r>
         <w:pict>
-          <v:rect id="_x0000_i1057" o:spt="1" style="height:1.5pt;width:432pt;" fillcolor="#A0A0A0" filled="t" stroked="f" coordsize="21600,21600" o:hr="t" o:hrstd="t" o:hralign="center">
+          <v:rect id="_x0000_i1072" o:spt="1" style="height:1.5pt;width:432pt;" fillcolor="#A0A0A0" filled="t" stroked="f" coordsize="21600,21600" o:hr="t" o:hrstd="t" o:hralign="center">
             <v:path/>
             <v:fill on="t" focussize="0,0"/>
             <v:stroke on="f"/>
@@ -10065,6 +10163,7 @@
             <w:insideH w:val="none" w:color="auto" w:sz="0" w:space="0"/>
             <w:insideV w:val="none" w:color="auto" w:sz="0" w:space="0"/>
           </w:tblBorders>
+          <w:shd w:val="clear" w:color="auto" w:fill="auto"/>
           <w:tblCellMar>
             <w:top w:w="15" w:type="dxa"/>
             <w:left w:w="15" w:type="dxa"/>
@@ -10151,6 +10250,7 @@
             <w:insideH w:val="none" w:color="auto" w:sz="0" w:space="0"/>
             <w:insideV w:val="none" w:color="auto" w:sz="0" w:space="0"/>
           </w:tblBorders>
+          <w:shd w:val="clear" w:color="auto" w:fill="auto"/>
           <w:tblCellMar>
             <w:top w:w="15" w:type="dxa"/>
             <w:left w:w="15" w:type="dxa"/>
@@ -10224,6 +10324,7 @@
             <w:insideH w:val="none" w:color="auto" w:sz="0" w:space="0"/>
             <w:insideV w:val="none" w:color="auto" w:sz="0" w:space="0"/>
           </w:tblBorders>
+          <w:shd w:val="clear" w:color="auto" w:fill="auto"/>
           <w:tblCellMar>
             <w:top w:w="15" w:type="dxa"/>
             <w:left w:w="15" w:type="dxa"/>
@@ -10335,7 +10436,7 @@
       </w:pPr>
       <w:r>
         <w:pict>
-          <v:rect id="_x0000_i1058" o:spt="1" style="height:1.5pt;width:432pt;" fillcolor="#A0A0A0" filled="t" stroked="f" coordsize="21600,21600" o:hr="t" o:hrstd="t" o:hralign="center">
+          <v:rect id="_x0000_i1073" o:spt="1" style="height:1.5pt;width:432pt;" fillcolor="#A0A0A0" filled="t" stroked="f" coordsize="21600,21600" o:hr="t" o:hrstd="t" o:hralign="center">
             <v:path/>
             <v:fill on="t" focussize="0,0"/>
             <v:stroke on="f"/>
@@ -10496,7 +10597,7 @@
       </w:pPr>
       <w:r>
         <w:pict>
-          <v:rect id="_x0000_i1059" o:spt="1" style="height:1.5pt;width:432pt;" fillcolor="#A0A0A0" filled="t" stroked="f" coordsize="21600,21600" o:hr="t" o:hrstd="t" o:hralign="center">
+          <v:rect id="_x0000_i1074" o:spt="1" style="height:1.5pt;width:432pt;" fillcolor="#A0A0A0" filled="t" stroked="f" coordsize="21600,21600" o:hr="t" o:hrstd="t" o:hralign="center">
             <v:path/>
             <v:fill on="t" focussize="0,0"/>
             <v:stroke on="f"/>
@@ -10706,6 +10807,7 @@
             <w:insideH w:val="none" w:color="auto" w:sz="0" w:space="0"/>
             <w:insideV w:val="none" w:color="auto" w:sz="0" w:space="0"/>
           </w:tblBorders>
+          <w:shd w:val="clear" w:color="auto" w:fill="auto"/>
           <w:tblCellMar>
             <w:top w:w="15" w:type="dxa"/>
             <w:left w:w="15" w:type="dxa"/>
@@ -10905,6 +11007,7 @@
             <w:insideH w:val="none" w:color="auto" w:sz="0" w:space="0"/>
             <w:insideV w:val="none" w:color="auto" w:sz="0" w:space="0"/>
           </w:tblBorders>
+          <w:shd w:val="clear" w:color="auto" w:fill="auto"/>
           <w:tblCellMar>
             <w:top w:w="15" w:type="dxa"/>
             <w:left w:w="15" w:type="dxa"/>
@@ -11069,7 +11172,7 @@
           <w:highlight w:val="red"/>
         </w:rPr>
         <w:pict>
-          <v:rect id="_x0000_i1060" o:spt="1" style="height:1.5pt;width:432pt;" fillcolor="#A0A0A0" filled="t" stroked="f" coordsize="21600,21600" o:hr="t" o:hrstd="t" o:hralign="center">
+          <v:rect id="_x0000_i1075" o:spt="1" style="height:1.5pt;width:432pt;" fillcolor="#A0A0A0" filled="t" stroked="f" coordsize="21600,21600" o:hr="t" o:hrstd="t" o:hralign="center">
             <v:path/>
             <v:fill on="t" focussize="0,0"/>
             <v:stroke on="f"/>
@@ -11196,7 +11299,7 @@
       </w:pPr>
       <w:r>
         <w:pict>
-          <v:rect id="_x0000_i1061" o:spt="1" style="height:1.5pt;width:432pt;" fillcolor="#A0A0A0" filled="t" stroked="f" coordsize="21600,21600" o:hr="t" o:hrstd="t" o:hralign="center">
+          <v:rect id="_x0000_i1076" o:spt="1" style="height:1.5pt;width:432pt;" fillcolor="#A0A0A0" filled="t" stroked="f" coordsize="21600,21600" o:hr="t" o:hrstd="t" o:hralign="center">
             <v:path/>
             <v:fill on="t" focussize="0,0"/>
             <v:stroke on="f"/>
@@ -11286,7 +11389,7 @@
       </w:pPr>
       <w:r>
         <w:pict>
-          <v:rect id="_x0000_i1062" o:spt="1" style="height:1.5pt;width:432pt;" fillcolor="#A0A0A0" filled="t" stroked="f" coordsize="21600,21600" o:hr="t" o:hrstd="t" o:hralign="center">
+          <v:rect id="_x0000_i1077" o:spt="1" style="height:1.5pt;width:432pt;" fillcolor="#A0A0A0" filled="t" stroked="f" coordsize="21600,21600" o:hr="t" o:hrstd="t" o:hralign="center">
             <v:path/>
             <v:fill on="t" focussize="0,0"/>
             <v:stroke on="f"/>
@@ -11409,7 +11512,7 @@
       </w:pPr>
       <w:r>
         <w:pict>
-          <v:rect id="_x0000_i1063" o:spt="1" style="height:1.5pt;width:432pt;" fillcolor="#A0A0A0" filled="t" stroked="f" coordsize="21600,21600" o:hr="t" o:hrstd="t" o:hralign="center">
+          <v:rect id="_x0000_i1078" o:spt="1" style="height:1.5pt;width:432pt;" fillcolor="#A0A0A0" filled="t" stroked="f" coordsize="21600,21600" o:hr="t" o:hrstd="t" o:hralign="center">
             <v:path/>
             <v:fill on="t" focussize="0,0"/>
             <v:stroke on="f"/>
@@ -11523,7 +11626,7 @@
       </w:pPr>
       <w:r>
         <w:pict>
-          <v:rect id="_x0000_i1064" o:spt="1" style="height:1.5pt;width:432pt;" fillcolor="#A0A0A0" filled="t" stroked="f" coordsize="21600,21600" o:hr="t" o:hrstd="t" o:hralign="center">
+          <v:rect id="_x0000_i1079" o:spt="1" style="height:1.5pt;width:432pt;" fillcolor="#A0A0A0" filled="t" stroked="f" coordsize="21600,21600" o:hr="t" o:hrstd="t" o:hralign="center">
             <v:path/>
             <v:fill on="t" focussize="0,0"/>
             <v:stroke on="f"/>
@@ -11748,7 +11851,7 @@
       </w:pPr>
       <w:r>
         <w:pict>
-          <v:rect id="_x0000_i1065" o:spt="1" style="height:1.5pt;width:432pt;" fillcolor="#A0A0A0" filled="t" stroked="f" coordsize="21600,21600" o:hr="t" o:hrstd="t" o:hralign="center">
+          <v:rect id="_x0000_i1080" o:spt="1" style="height:1.5pt;width:432pt;" fillcolor="#A0A0A0" filled="t" stroked="f" coordsize="21600,21600" o:hr="t" o:hrstd="t" o:hralign="center">
             <v:path/>
             <v:fill on="t" focussize="0,0"/>
             <v:stroke on="f"/>
@@ -11848,7 +11951,7 @@
       </w:pPr>
       <w:r>
         <w:pict>
-          <v:rect id="_x0000_i1066" o:spt="1" style="height:1.5pt;width:432pt;" fillcolor="#A0A0A0" filled="t" stroked="f" coordsize="21600,21600" o:hr="t" o:hrstd="t" o:hralign="center">
+          <v:rect id="_x0000_i1081" o:spt="1" style="height:1.5pt;width:432pt;" fillcolor="#A0A0A0" filled="t" stroked="f" coordsize="21600,21600" o:hr="t" o:hrstd="t" o:hralign="center">
             <v:path/>
             <v:fill on="t" focussize="0,0"/>
             <v:stroke on="f"/>
@@ -11959,7 +12062,7 @@
           <w:highlight w:val="red"/>
         </w:rPr>
         <w:pict>
-          <v:rect id="_x0000_i1067" o:spt="1" style="height:1.5pt;width:432pt;" fillcolor="#A0A0A0" filled="t" stroked="f" coordsize="21600,21600" o:hr="t" o:hrstd="t" o:hralign="center">
+          <v:rect id="_x0000_i1082" o:spt="1" style="height:1.5pt;width:432pt;" fillcolor="#A0A0A0" filled="t" stroked="f" coordsize="21600,21600" o:hr="t" o:hrstd="t" o:hralign="center">
             <v:path/>
             <v:fill on="t" focussize="0,0"/>
             <v:stroke on="f"/>
@@ -12431,7 +12534,7 @@
       </w:pPr>
       <w:r>
         <w:pict>
-          <v:rect id="_x0000_i1068" o:spt="1" style="height:1.5pt;width:432pt;" fillcolor="#A0A0A0" filled="t" stroked="f" coordsize="21600,21600" o:hr="t" o:hrstd="t" o:hralign="center">
+          <v:rect id="_x0000_i1083" o:spt="1" style="height:1.5pt;width:432pt;" fillcolor="#A0A0A0" filled="t" stroked="f" coordsize="21600,21600" o:hr="t" o:hrstd="t" o:hralign="center">
             <v:path/>
             <v:fill on="t" focussize="0,0"/>
             <v:stroke on="f"/>
@@ -12680,6 +12783,7 @@
             <w:insideH w:val="none" w:color="auto" w:sz="0" w:space="0"/>
             <w:insideV w:val="none" w:color="auto" w:sz="0" w:space="0"/>
           </w:tblBorders>
+          <w:shd w:val="clear" w:color="auto" w:fill="auto"/>
           <w:tblCellMar>
             <w:top w:w="15" w:type="dxa"/>
             <w:left w:w="15" w:type="dxa"/>
@@ -12917,7 +13021,7 @@
       </w:pPr>
       <w:r>
         <w:pict>
-          <v:rect id="_x0000_i1069" o:spt="1" style="height:1.5pt;width:432pt;" fillcolor="#A0A0A0" filled="t" stroked="f" coordsize="21600,21600" o:hr="t" o:hrstd="t" o:hralign="center">
+          <v:rect id="_x0000_i1084" o:spt="1" style="height:1.5pt;width:432pt;" fillcolor="#A0A0A0" filled="t" stroked="f" coordsize="21600,21600" o:hr="t" o:hrstd="t" o:hralign="center">
             <v:path/>
             <v:fill on="t" focussize="0,0"/>
             <v:stroke on="f"/>
@@ -13009,7 +13113,7 @@
       </w:pPr>
       <w:r>
         <w:pict>
-          <v:rect id="_x0000_i1070" o:spt="1" style="height:1.5pt;width:432pt;" fillcolor="#A0A0A0" filled="t" stroked="f" coordsize="21600,21600" o:hr="t" o:hrstd="t" o:hralign="center">
+          <v:rect id="_x0000_i1085" o:spt="1" style="height:1.5pt;width:432pt;" fillcolor="#A0A0A0" filled="t" stroked="f" coordsize="21600,21600" o:hr="t" o:hrstd="t" o:hralign="center">
             <v:path/>
             <v:fill on="t" focussize="0,0"/>
             <v:stroke on="f"/>
@@ -13144,7 +13248,7 @@
       </w:pPr>
       <w:r>
         <w:pict>
-          <v:rect id="_x0000_i1071" o:spt="1" style="height:1.5pt;width:432pt;" fillcolor="#A0A0A0" filled="t" stroked="f" coordsize="21600,21600" o:hr="t" o:hrstd="t" o:hralign="center">
+          <v:rect id="_x0000_i1086" o:spt="1" style="height:1.5pt;width:432pt;" fillcolor="#A0A0A0" filled="t" stroked="f" coordsize="21600,21600" o:hr="t" o:hrstd="t" o:hralign="center">
             <v:path/>
             <v:fill on="t" focussize="0,0"/>
             <v:stroke on="f"/>
@@ -13255,7 +13359,7 @@
       </w:pPr>
       <w:r>
         <w:pict>
-          <v:rect id="_x0000_i1072" o:spt="1" style="height:1.5pt;width:432pt;" fillcolor="#A0A0A0" filled="t" stroked="f" coordsize="21600,21600" o:hr="t" o:hrstd="t" o:hralign="center">
+          <v:rect id="_x0000_i1087" o:spt="1" style="height:1.5pt;width:432pt;" fillcolor="#A0A0A0" filled="t" stroked="f" coordsize="21600,21600" o:hr="t" o:hrstd="t" o:hralign="center">
             <v:path/>
             <v:fill on="t" focussize="0,0"/>
             <v:stroke on="f"/>
@@ -13396,7 +13500,7 @@
       </w:pPr>
       <w:r>
         <w:pict>
-          <v:rect id="_x0000_i1073" o:spt="1" style="height:1.5pt;width:432pt;" fillcolor="#A0A0A0" filled="t" stroked="f" coordsize="21600,21600" o:hr="t" o:hrstd="t" o:hralign="center">
+          <v:rect id="_x0000_i1088" o:spt="1" style="height:1.5pt;width:432pt;" fillcolor="#A0A0A0" filled="t" stroked="f" coordsize="21600,21600" o:hr="t" o:hrstd="t" o:hralign="center">
             <v:path/>
             <v:fill on="t" focussize="0,0"/>
             <v:stroke on="f"/>
@@ -13604,7 +13708,7 @@
       </w:pPr>
       <w:r>
         <w:pict>
-          <v:rect id="_x0000_i1074" o:spt="1" style="height:1.5pt;width:432pt;" fillcolor="#A0A0A0" filled="t" stroked="f" coordsize="21600,21600" o:hr="t" o:hrstd="t" o:hralign="center">
+          <v:rect id="_x0000_i1089" o:spt="1" style="height:1.5pt;width:432pt;" fillcolor="#A0A0A0" filled="t" stroked="f" coordsize="21600,21600" o:hr="t" o:hrstd="t" o:hralign="center">
             <v:path/>
             <v:fill on="t" focussize="0,0"/>
             <v:stroke on="f"/>
@@ -13752,7 +13856,7 @@
       </w:pPr>
       <w:r>
         <w:pict>
-          <v:rect id="_x0000_i1075" o:spt="1" style="height:1.5pt;width:432pt;" fillcolor="#A0A0A0" filled="t" stroked="f" coordsize="21600,21600" o:hr="t" o:hrstd="t" o:hralign="center">
+          <v:rect id="_x0000_i1090" o:spt="1" style="height:1.5pt;width:432pt;" fillcolor="#A0A0A0" filled="t" stroked="f" coordsize="21600,21600" o:hr="t" o:hrstd="t" o:hralign="center">
             <v:path/>
             <v:fill on="t" focussize="0,0"/>
             <v:stroke on="f"/>
@@ -13917,7 +14021,7 @@
       </w:pPr>
       <w:r>
         <w:pict>
-          <v:rect id="_x0000_i1076" o:spt="1" style="height:1.5pt;width:432pt;" fillcolor="#A0A0A0" filled="t" stroked="f" coordsize="21600,21600" o:hr="t" o:hrstd="t" o:hralign="center">
+          <v:rect id="_x0000_i1091" o:spt="1" style="height:1.5pt;width:432pt;" fillcolor="#A0A0A0" filled="t" stroked="f" coordsize="21600,21600" o:hr="t" o:hrstd="t" o:hralign="center">
             <v:path/>
             <v:fill on="t" focussize="0,0"/>
             <v:stroke on="f"/>
@@ -13942,7 +14046,7 @@
           <w:szCs w:val="24"/>
         </w:rPr>
         <w:pict>
-          <v:rect id="_x0000_i1077" o:spt="1" style="height:1.5pt;width:432pt;" fillcolor="#A0A0A0" filled="t" stroked="f" coordsize="21600,21600" o:hr="t" o:hrstd="t" o:hralign="center">
+          <v:rect id="_x0000_i1092" o:spt="1" style="height:1.5pt;width:432pt;" fillcolor="#A0A0A0" filled="t" stroked="f" coordsize="21600,21600" o:hr="t" o:hrstd="t" o:hralign="center">
             <v:path/>
             <v:fill on="t" focussize="0,0"/>
             <v:stroke on="f"/>
@@ -14058,7 +14162,7 @@
       </w:pPr>
       <w:r>
         <w:pict>
-          <v:rect id="_x0000_i1078" o:spt="1" style="height:1.5pt;width:432pt;" fillcolor="#A0A0A0" filled="t" stroked="f" coordsize="21600,21600" o:hr="t" o:hrstd="t" o:hralign="center">
+          <v:rect id="_x0000_i1093" o:spt="1" style="height:1.5pt;width:432pt;" fillcolor="#A0A0A0" filled="t" stroked="f" coordsize="21600,21600" o:hr="t" o:hrstd="t" o:hralign="center">
             <v:path/>
             <v:fill on="t" focussize="0,0"/>
             <v:stroke on="f"/>
@@ -14746,7 +14850,7 @@
           <w:highlight w:val="magenta"/>
         </w:rPr>
         <w:pict>
-          <v:rect id="_x0000_i1079" o:spt="1" style="height:1.5pt;width:432pt;" fillcolor="#A0A0A0" filled="t" stroked="f" coordsize="21600,21600" o:hr="t" o:hrstd="t" o:hralign="center">
+          <v:rect id="_x0000_i1094" o:spt="1" style="height:1.5pt;width:432pt;" fillcolor="#A0A0A0" filled="t" stroked="f" coordsize="21600,21600" o:hr="t" o:hrstd="t" o:hralign="center">
             <v:path/>
             <v:fill on="t" focussize="0,0"/>
             <v:stroke on="f"/>
@@ -14762,7 +14866,7 @@
           <w:highlight w:val="magenta"/>
         </w:rPr>
         <w:pict>
-          <v:rect id="_x0000_i1080" o:spt="1" style="height:1.5pt;width:432pt;" fillcolor="#A0A0A0" filled="t" stroked="f" coordsize="21600,21600" o:hr="t" o:hrstd="t" o:hralign="center">
+          <v:rect id="_x0000_i1095" o:spt="1" style="height:1.5pt;width:432pt;" fillcolor="#A0A0A0" filled="t" stroked="f" coordsize="21600,21600" o:hr="t" o:hrstd="t" o:hralign="center">
             <v:path/>
             <v:fill on="t" focussize="0,0"/>
             <v:stroke on="f"/>
@@ -15007,7 +15111,7 @@
       </w:pPr>
       <w:r>
         <w:pict>
-          <v:rect id="_x0000_i1081" o:spt="1" style="height:1.5pt;width:432pt;" fillcolor="#A0A0A0" filled="t" stroked="f" coordsize="21600,21600" o:hr="t" o:hrstd="t" o:hralign="center">
+          <v:rect id="_x0000_i1096" o:spt="1" style="height:1.5pt;width:432pt;" fillcolor="#A0A0A0" filled="t" stroked="f" coordsize="21600,21600" o:hr="t" o:hrstd="t" o:hralign="center">
             <v:path/>
             <v:fill on="t" focussize="0,0"/>
             <v:stroke on="f"/>
@@ -15142,7 +15246,7 @@
       </w:pPr>
       <w:r>
         <w:pict>
-          <v:rect id="_x0000_i1082" o:spt="1" style="height:1.5pt;width:432pt;" fillcolor="#A0A0A0" filled="t" stroked="f" coordsize="21600,21600" o:hr="t" o:hrstd="t" o:hralign="center">
+          <v:rect id="_x0000_i1097" o:spt="1" style="height:1.5pt;width:432pt;" fillcolor="#A0A0A0" filled="t" stroked="f" coordsize="21600,21600" o:hr="t" o:hrstd="t" o:hralign="center">
             <v:path/>
             <v:fill on="t" focussize="0,0"/>
             <v:stroke on="f"/>
@@ -15298,7 +15402,7 @@
       </w:pPr>
       <w:r>
         <w:pict>
-          <v:rect id="_x0000_i1083" o:spt="1" style="height:1.5pt;width:432pt;" fillcolor="#A0A0A0" filled="t" stroked="f" coordsize="21600,21600" o:hr="t" o:hrstd="t" o:hralign="center">
+          <v:rect id="_x0000_i1098" o:spt="1" style="height:1.5pt;width:432pt;" fillcolor="#A0A0A0" filled="t" stroked="f" coordsize="21600,21600" o:hr="t" o:hrstd="t" o:hralign="center">
             <v:path/>
             <v:fill on="t" focussize="0,0"/>
             <v:stroke on="f"/>
@@ -15446,7 +15550,7 @@
       </w:pPr>
       <w:r>
         <w:pict>
-          <v:rect id="_x0000_i1084" o:spt="1" style="height:1.5pt;width:432pt;" fillcolor="#A0A0A0" filled="t" stroked="f" coordsize="21600,21600" o:hr="t" o:hrstd="t" o:hralign="center">
+          <v:rect id="_x0000_i1099" o:spt="1" style="height:1.5pt;width:432pt;" fillcolor="#A0A0A0" filled="t" stroked="f" coordsize="21600,21600" o:hr="t" o:hrstd="t" o:hralign="center">
             <v:path/>
             <v:fill on="t" focussize="0,0"/>
             <v:stroke on="f"/>
@@ -15563,7 +15667,7 @@
       </w:pPr>
       <w:r>
         <w:pict>
-          <v:rect id="_x0000_i1085" o:spt="1" style="height:1.5pt;width:432pt;" fillcolor="#A0A0A0" filled="t" stroked="f" coordsize="21600,21600" o:hr="t" o:hrstd="t" o:hralign="center">
+          <v:rect id="_x0000_i1100" o:spt="1" style="height:1.5pt;width:432pt;" fillcolor="#A0A0A0" filled="t" stroked="f" coordsize="21600,21600" o:hr="t" o:hrstd="t" o:hralign="center">
             <v:path/>
             <v:fill on="t" focussize="0,0"/>
             <v:stroke on="f"/>
@@ -15707,7 +15811,7 @@
       </w:pPr>
       <w:r>
         <w:pict>
-          <v:rect id="_x0000_i1086" o:spt="1" style="height:1.5pt;width:432pt;" fillcolor="#A0A0A0" filled="t" stroked="f" coordsize="21600,21600" o:hr="t" o:hrstd="t" o:hralign="center">
+          <v:rect id="_x0000_i1101" o:spt="1" style="height:1.5pt;width:432pt;" fillcolor="#A0A0A0" filled="t" stroked="f" coordsize="21600,21600" o:hr="t" o:hrstd="t" o:hralign="center">
             <v:path/>
             <v:fill on="t" focussize="0,0"/>
             <v:stroke on="f"/>
@@ -15899,7 +16003,7 @@
       </w:pPr>
       <w:r>
         <w:pict>
-          <v:rect id="_x0000_i1087" o:spt="1" style="height:1.5pt;width:432pt;" fillcolor="#A0A0A0" filled="t" stroked="f" coordsize="21600,21600" o:hr="t" o:hrstd="t" o:hralign="center">
+          <v:rect id="_x0000_i1102" o:spt="1" style="height:1.5pt;width:432pt;" fillcolor="#A0A0A0" filled="t" stroked="f" coordsize="21600,21600" o:hr="t" o:hrstd="t" o:hralign="center">
             <v:path/>
             <v:fill on="t" focussize="0,0"/>
             <v:stroke on="f"/>
@@ -18008,7 +18112,7 @@
     <w:lsdException w:qFormat="1" w:unhideWhenUsed="0" w:uiPriority="0" w:semiHidden="0" w:name="HTML Code"/>
     <w:lsdException w:unhideWhenUsed="0" w:uiPriority="0" w:semiHidden="0" w:name="HTML Definition"/>
     <w:lsdException w:unhideWhenUsed="0" w:uiPriority="0" w:semiHidden="0" w:name="HTML Keyboard"/>
-    <w:lsdException w:unhideWhenUsed="0" w:uiPriority="0" w:semiHidden="0" w:name="HTML Preformatted"/>
+    <w:lsdException w:qFormat="1" w:unhideWhenUsed="0" w:uiPriority="0" w:semiHidden="0" w:name="HTML Preformatted"/>
     <w:lsdException w:unhideWhenUsed="0" w:uiPriority="0" w:semiHidden="0" w:name="HTML Sample"/>
     <w:lsdException w:unhideWhenUsed="0" w:uiPriority="0" w:semiHidden="0" w:name="HTML Typewriter"/>
     <w:lsdException w:unhideWhenUsed="0" w:uiPriority="0" w:semiHidden="0" w:name="HTML Variable"/>
@@ -18292,6 +18396,7 @@
   </w:style>
   <w:style w:type="paragraph" w:styleId="10">
     <w:name w:val="HTML Preformatted"/>
+    <w:qFormat/>
     <w:uiPriority w:val="0"/>
     <w:pPr>
       <w:tabs>
@@ -18359,6 +18464,7 @@
   </w:style>
   <w:style w:type="character" w:customStyle="1" w:styleId="14">
     <w:name w:val="15"/>
+    <w:qFormat/>
     <w:uiPriority w:val="0"/>
     <w:rPr>
       <w:rFonts w:hint="default" w:ascii="Times New Roman" w:hAnsi="Times New Roman" w:cs="Times New Roman"/>

</xml_diff>